<commit_message>
upload the picture of premilinary task & task1
</commit_message>
<xml_diff>
--- a/MATLAB Coursework 2  Word Template.docx
+++ b/MATLAB Coursework 2  Word Template.docx
@@ -2,10 +2,7 @@
 <file path=word/document.xml><?xml version="1.0" encoding="utf-8"?>
 <w:document xmlns:wpc="http://schemas.microsoft.com/office/word/2010/wordprocessingCanvas" xmlns:mc="http://schemas.openxmlformats.org/markup-compatibility/2006" xmlns:o="urn:schemas-microsoft-com:office:office" xmlns:r="http://schemas.openxmlformats.org/officeDocument/2006/relationships" xmlns:m="http://schemas.openxmlformats.org/officeDocument/2006/math" xmlns:v="urn:schemas-microsoft-com:vml" xmlns:wp14="http://schemas.microsoft.com/office/word/2010/wordprocessingDrawing" xmlns:wp="http://schemas.openxmlformats.org/drawingml/2006/wordprocessingDrawing" xmlns:w="http://schemas.openxmlformats.org/wordprocessingml/2006/main" xmlns:w14="http://schemas.microsoft.com/office/word/2010/wordml" xmlns:w10="urn:schemas-microsoft-com:office:word" xmlns:w15="http://schemas.microsoft.com/office/word/2012/wordml" xmlns:wpg="http://schemas.microsoft.com/office/word/2010/wordprocessingGroup" xmlns:wpi="http://schemas.microsoft.com/office/word/2010/wordprocessingInk" xmlns:wne="http://schemas.microsoft.com/office/word/2006/wordml" xmlns:wps="http://schemas.microsoft.com/office/word/2010/wordprocessingShape" xmlns:wpsCustomData="http://www.wps.cn/officeDocument/2013/wpsCustomData" mc:Ignorable="w14 w15 wp14">
   <w:body>
-    <w:p>
-      <w:bookmarkStart w:id="0" w:name="_GoBack"/>
-      <w:bookmarkEnd w:id="0"/>
-    </w:p>
+    <w:p/>
     <w:p/>
     <w:p/>
     <w:p/>
@@ -120,8 +117,10 @@
         <w:spacing w:line="259" w:lineRule="auto"/>
         <w:jc w:val="both"/>
         <w:rPr>
+          <w:rFonts w:hint="eastAsia" w:eastAsia="宋体"/>
           <w:color w:val="000000" w:themeColor="text1"/>
-          <w:highlight w:val="cyan"/>
+          <w:highlight w:val="none"/>
+          <w:lang w:val="en-US" w:eastAsia="zh-CN"/>
           <w14:textFill>
             <w14:solidFill>
               <w14:schemeClr w14:val="tx1"/>
@@ -129,6 +128,187 @@
           </w14:textFill>
         </w:rPr>
       </w:pPr>
+      <w:r>
+        <w:rPr>
+          <w:rFonts w:hint="eastAsia" w:eastAsia="宋体"/>
+          <w:color w:val="000000" w:themeColor="text1"/>
+          <w:highlight w:val="none"/>
+          <w:lang w:val="en-US" w:eastAsia="zh-CN"/>
+          <w14:textFill>
+            <w14:solidFill>
+              <w14:schemeClr w14:val="tx1"/>
+            </w14:solidFill>
+          </w14:textFill>
+        </w:rPr>
+        <w:t>Preliminary task</w:t>
+      </w:r>
+    </w:p>
+    <w:p>
+      <w:pPr>
+        <w:spacing w:line="259" w:lineRule="auto"/>
+        <w:jc w:val="both"/>
+        <w:rPr>
+          <w:rFonts w:hint="default" w:eastAsia="宋体"/>
+          <w:color w:val="000000" w:themeColor="text1"/>
+          <w:highlight w:val="none"/>
+          <w:lang w:val="en-US" w:eastAsia="zh-CN"/>
+          <w14:textFill>
+            <w14:solidFill>
+              <w14:schemeClr w14:val="tx1"/>
+            </w14:solidFill>
+          </w14:textFill>
+        </w:rPr>
+      </w:pPr>
+      <w:r>
+        <w:rPr>
+          <w:rFonts w:hint="default" w:eastAsia="宋体"/>
+          <w:color w:val="000000" w:themeColor="text1"/>
+          <w:highlight w:val="none"/>
+          <w:lang w:val="en-US" w:eastAsia="zh-CN"/>
+          <w14:textFill>
+            <w14:solidFill>
+              <w14:schemeClr w14:val="tx1"/>
+            </w14:solidFill>
+          </w14:textFill>
+        </w:rPr>
+        <w:drawing>
+          <wp:inline distT="0" distB="0" distL="114300" distR="114300">
+            <wp:extent cx="2400935" cy="1800225"/>
+            <wp:effectExtent l="0" t="0" r="18415" b="9525"/>
+            <wp:docPr id="3" name="图片 3" descr="2f41037f5444e26e0b90f8545fab6cf9"/>
+            <wp:cNvGraphicFramePr>
+              <a:graphicFrameLocks xmlns:a="http://schemas.openxmlformats.org/drawingml/2006/main" noChangeAspect="1"/>
+            </wp:cNvGraphicFramePr>
+            <a:graphic xmlns:a="http://schemas.openxmlformats.org/drawingml/2006/main">
+              <a:graphicData uri="http://schemas.openxmlformats.org/drawingml/2006/picture">
+                <pic:pic xmlns:pic="http://schemas.openxmlformats.org/drawingml/2006/picture">
+                  <pic:nvPicPr>
+                    <pic:cNvPr id="3" name="图片 3" descr="2f41037f5444e26e0b90f8545fab6cf9"/>
+                    <pic:cNvPicPr>
+                      <a:picLocks noChangeAspect="1"/>
+                    </pic:cNvPicPr>
+                  </pic:nvPicPr>
+                  <pic:blipFill>
+                    <a:blip r:embed="rId10"/>
+                    <a:stretch>
+                      <a:fillRect/>
+                    </a:stretch>
+                  </pic:blipFill>
+                  <pic:spPr>
+                    <a:xfrm>
+                      <a:off x="0" y="0"/>
+                      <a:ext cx="2400935" cy="1800225"/>
+                    </a:xfrm>
+                    <a:prstGeom prst="rect">
+                      <a:avLst/>
+                    </a:prstGeom>
+                  </pic:spPr>
+                </pic:pic>
+              </a:graphicData>
+            </a:graphic>
+          </wp:inline>
+        </w:drawing>
+      </w:r>
+    </w:p>
+    <w:p>
+      <w:pPr>
+        <w:spacing w:line="259" w:lineRule="auto"/>
+        <w:jc w:val="both"/>
+        <w:rPr>
+          <w:rFonts w:hint="eastAsia" w:eastAsia="宋体"/>
+          <w:color w:val="000000" w:themeColor="text1"/>
+          <w:highlight w:val="none"/>
+          <w:lang w:val="en-US" w:eastAsia="zh-CN"/>
+          <w14:textFill>
+            <w14:solidFill>
+              <w14:schemeClr w14:val="tx1"/>
+            </w14:solidFill>
+          </w14:textFill>
+        </w:rPr>
+      </w:pPr>
+      <w:r>
+        <w:rPr>
+          <w:rFonts w:hint="eastAsia" w:eastAsia="宋体"/>
+          <w:color w:val="000000" w:themeColor="text1"/>
+          <w:highlight w:val="none"/>
+          <w:lang w:val="en-US" w:eastAsia="zh-CN"/>
+          <w14:textFill>
+            <w14:solidFill>
+              <w14:schemeClr w14:val="tx1"/>
+            </w14:solidFill>
+          </w14:textFill>
+        </w:rPr>
+        <w:t>Task1</w:t>
+      </w:r>
+    </w:p>
+    <w:p>
+      <w:pPr>
+        <w:spacing w:line="259" w:lineRule="auto"/>
+        <w:jc w:val="both"/>
+        <w:rPr>
+          <w:rFonts w:hint="default" w:eastAsia="宋体"/>
+          <w:color w:val="000000" w:themeColor="text1"/>
+          <w:highlight w:val="none"/>
+          <w:lang w:val="en-US" w:eastAsia="zh-CN"/>
+          <w14:textFill>
+            <w14:solidFill>
+              <w14:schemeClr w14:val="tx1"/>
+            </w14:solidFill>
+          </w14:textFill>
+        </w:rPr>
+      </w:pPr>
+      <w:r>
+        <w:rPr>
+          <w:rFonts w:hint="default" w:eastAsia="宋体"/>
+          <w:color w:val="000000" w:themeColor="text1"/>
+          <w:highlight w:val="none"/>
+          <w:lang w:val="en-US" w:eastAsia="zh-CN"/>
+          <w14:textFill>
+            <w14:solidFill>
+              <w14:schemeClr w14:val="tx1"/>
+            </w14:solidFill>
+          </w14:textFill>
+        </w:rPr>
+        <w:drawing>
+          <wp:inline distT="0" distB="0" distL="114300" distR="114300">
+            <wp:extent cx="2401570" cy="1800225"/>
+            <wp:effectExtent l="0" t="0" r="17780" b="9525"/>
+            <wp:docPr id="5" name="图片 5" descr="25dc7e7f51e9df8ad1db3cbe18b9c994"/>
+            <wp:cNvGraphicFramePr>
+              <a:graphicFrameLocks xmlns:a="http://schemas.openxmlformats.org/drawingml/2006/main" noChangeAspect="1"/>
+            </wp:cNvGraphicFramePr>
+            <a:graphic xmlns:a="http://schemas.openxmlformats.org/drawingml/2006/main">
+              <a:graphicData uri="http://schemas.openxmlformats.org/drawingml/2006/picture">
+                <pic:pic xmlns:pic="http://schemas.openxmlformats.org/drawingml/2006/picture">
+                  <pic:nvPicPr>
+                    <pic:cNvPr id="5" name="图片 5" descr="25dc7e7f51e9df8ad1db3cbe18b9c994"/>
+                    <pic:cNvPicPr>
+                      <a:picLocks noChangeAspect="1"/>
+                    </pic:cNvPicPr>
+                  </pic:nvPicPr>
+                  <pic:blipFill>
+                    <a:blip r:embed="rId11"/>
+                    <a:stretch>
+                      <a:fillRect/>
+                    </a:stretch>
+                  </pic:blipFill>
+                  <pic:spPr>
+                    <a:xfrm>
+                      <a:off x="0" y="0"/>
+                      <a:ext cx="2401570" cy="1800225"/>
+                    </a:xfrm>
+                    <a:prstGeom prst="rect">
+                      <a:avLst/>
+                    </a:prstGeom>
+                  </pic:spPr>
+                </pic:pic>
+              </a:graphicData>
+            </a:graphic>
+          </wp:inline>
+        </w:drawing>
+      </w:r>
+      <w:bookmarkStart w:id="0" w:name="_GoBack"/>
+      <w:bookmarkEnd w:id="0"/>
     </w:p>
     <w:sectPr>
       <w:headerReference r:id="rId6" w:type="first"/>
@@ -176,7 +356,7 @@
     <w:sdtPr>
       <w:id w:val="1214853255"/>
       <w:docPartObj>
-        <w:docPartGallery w:val="AutoText"/>
+        <w:docPartGallery w:val="autotext"/>
       </w:docPartObj>
     </w:sdtPr>
     <w:sdtContent>

</xml_diff>

<commit_message>
update red light png
</commit_message>
<xml_diff>
--- a/MATLAB Coursework 2  Word Template.docx
+++ b/MATLAB Coursework 2  Word Template.docx
@@ -257,6 +257,7 @@
           </w14:textFill>
         </w:rPr>
       </w:pPr>
+      <w:bookmarkStart w:id="0" w:name="_GoBack"/>
       <w:r>
         <w:rPr>
           <w:rFonts w:hint="default" w:eastAsia="宋体"/>
@@ -307,8 +308,177 @@
           </wp:inline>
         </w:drawing>
       </w:r>
-      <w:bookmarkStart w:id="0" w:name="_GoBack"/>
       <w:bookmarkEnd w:id="0"/>
+    </w:p>
+    <w:p>
+      <w:pPr>
+        <w:spacing w:line="259" w:lineRule="auto"/>
+        <w:jc w:val="both"/>
+        <w:rPr>
+          <w:rFonts w:hint="eastAsia" w:eastAsia="宋体"/>
+          <w:color w:val="000000" w:themeColor="text1"/>
+          <w:highlight w:val="none"/>
+          <w:lang w:val="en-US" w:eastAsia="zh-CN"/>
+          <w14:textFill>
+            <w14:solidFill>
+              <w14:schemeClr w14:val="tx1"/>
+            </w14:solidFill>
+          </w14:textFill>
+        </w:rPr>
+      </w:pPr>
+      <w:r>
+        <w:rPr>
+          <w:rFonts w:hint="eastAsia" w:eastAsia="宋体"/>
+          <w:color w:val="000000" w:themeColor="text1"/>
+          <w:highlight w:val="none"/>
+          <w:lang w:val="en-US" w:eastAsia="zh-CN"/>
+          <w14:textFill>
+            <w14:solidFill>
+              <w14:schemeClr w14:val="tx1"/>
+            </w14:solidFill>
+          </w14:textFill>
+        </w:rPr>
+        <w:t>Task2</w:t>
+      </w:r>
+    </w:p>
+    <w:p>
+      <w:pPr>
+        <w:spacing w:line="259" w:lineRule="auto"/>
+        <w:jc w:val="both"/>
+        <w:rPr>
+          <w:rFonts w:hint="default"/>
+          <w:lang w:val="en-US" w:eastAsia="zh-CN"/>
+        </w:rPr>
+      </w:pPr>
+      <w:r>
+        <w:drawing>
+          <wp:inline distT="0" distB="0" distL="114300" distR="114300">
+            <wp:extent cx="2122170" cy="1800225"/>
+            <wp:effectExtent l="0" t="0" r="11430" b="9525"/>
+            <wp:docPr id="2" name="图片 1"/>
+            <wp:cNvGraphicFramePr>
+              <a:graphicFrameLocks xmlns:a="http://schemas.openxmlformats.org/drawingml/2006/main" noChangeAspect="1"/>
+            </wp:cNvGraphicFramePr>
+            <a:graphic xmlns:a="http://schemas.openxmlformats.org/drawingml/2006/main">
+              <a:graphicData uri="http://schemas.openxmlformats.org/drawingml/2006/picture">
+                <pic:pic xmlns:pic="http://schemas.openxmlformats.org/drawingml/2006/picture">
+                  <pic:nvPicPr>
+                    <pic:cNvPr id="2" name="图片 1"/>
+                    <pic:cNvPicPr>
+                      <a:picLocks noChangeAspect="1"/>
+                    </pic:cNvPicPr>
+                  </pic:nvPicPr>
+                  <pic:blipFill>
+                    <a:blip r:embed="rId12"/>
+                    <a:stretch>
+                      <a:fillRect/>
+                    </a:stretch>
+                  </pic:blipFill>
+                  <pic:spPr>
+                    <a:xfrm>
+                      <a:off x="0" y="0"/>
+                      <a:ext cx="2122170" cy="1800225"/>
+                    </a:xfrm>
+                    <a:prstGeom prst="rect">
+                      <a:avLst/>
+                    </a:prstGeom>
+                    <a:noFill/>
+                    <a:ln>
+                      <a:noFill/>
+                    </a:ln>
+                  </pic:spPr>
+                </pic:pic>
+              </a:graphicData>
+            </a:graphic>
+          </wp:inline>
+        </w:drawing>
+      </w:r>
+      <w:r>
+        <w:rPr>
+          <w:rFonts w:hint="default"/>
+          <w:lang w:val="en-US" w:eastAsia="zh-CN"/>
+        </w:rPr>
+        <w:drawing>
+          <wp:inline distT="0" distB="0" distL="114300" distR="114300">
+            <wp:extent cx="1350010" cy="1800225"/>
+            <wp:effectExtent l="0" t="0" r="2540" b="9525"/>
+            <wp:docPr id="7" name="图片 7" descr="6695ae43b64c8b628fc27a8a3995f7bb"/>
+            <wp:cNvGraphicFramePr>
+              <a:graphicFrameLocks xmlns:a="http://schemas.openxmlformats.org/drawingml/2006/main" noChangeAspect="1"/>
+            </wp:cNvGraphicFramePr>
+            <a:graphic xmlns:a="http://schemas.openxmlformats.org/drawingml/2006/main">
+              <a:graphicData uri="http://schemas.openxmlformats.org/drawingml/2006/picture">
+                <pic:pic xmlns:pic="http://schemas.openxmlformats.org/drawingml/2006/picture">
+                  <pic:nvPicPr>
+                    <pic:cNvPr id="7" name="图片 7" descr="6695ae43b64c8b628fc27a8a3995f7bb"/>
+                    <pic:cNvPicPr>
+                      <a:picLocks noChangeAspect="1"/>
+                    </pic:cNvPicPr>
+                  </pic:nvPicPr>
+                  <pic:blipFill>
+                    <a:blip r:embed="rId13"/>
+                    <a:stretch>
+                      <a:fillRect/>
+                    </a:stretch>
+                  </pic:blipFill>
+                  <pic:spPr>
+                    <a:xfrm>
+                      <a:off x="0" y="0"/>
+                      <a:ext cx="1350010" cy="1800225"/>
+                    </a:xfrm>
+                    <a:prstGeom prst="rect">
+                      <a:avLst/>
+                    </a:prstGeom>
+                  </pic:spPr>
+                </pic:pic>
+              </a:graphicData>
+            </a:graphic>
+          </wp:inline>
+        </w:drawing>
+      </w:r>
+      <w:r>
+        <w:rPr>
+          <w:rFonts w:hint="default"/>
+          <w:lang w:val="en-US" w:eastAsia="zh-CN"/>
+        </w:rPr>
+        <w:drawing>
+          <wp:inline distT="0" distB="0" distL="114300" distR="114300">
+            <wp:extent cx="1350010" cy="1800225"/>
+            <wp:effectExtent l="0" t="0" r="2540" b="9525"/>
+            <wp:docPr id="9" name="图片 9" descr="6fd501c70b1da64a518f5dcd68fbcb65"/>
+            <wp:cNvGraphicFramePr>
+              <a:graphicFrameLocks xmlns:a="http://schemas.openxmlformats.org/drawingml/2006/main" noChangeAspect="1"/>
+            </wp:cNvGraphicFramePr>
+            <a:graphic xmlns:a="http://schemas.openxmlformats.org/drawingml/2006/main">
+              <a:graphicData uri="http://schemas.openxmlformats.org/drawingml/2006/picture">
+                <pic:pic xmlns:pic="http://schemas.openxmlformats.org/drawingml/2006/picture">
+                  <pic:nvPicPr>
+                    <pic:cNvPr id="9" name="图片 9" descr="6fd501c70b1da64a518f5dcd68fbcb65"/>
+                    <pic:cNvPicPr>
+                      <a:picLocks noChangeAspect="1"/>
+                    </pic:cNvPicPr>
+                  </pic:nvPicPr>
+                  <pic:blipFill>
+                    <a:blip r:embed="rId14"/>
+                    <a:stretch>
+                      <a:fillRect/>
+                    </a:stretch>
+                  </pic:blipFill>
+                  <pic:spPr>
+                    <a:xfrm>
+                      <a:off x="0" y="0"/>
+                      <a:ext cx="1350010" cy="1800225"/>
+                    </a:xfrm>
+                    <a:prstGeom prst="rect">
+                      <a:avLst/>
+                    </a:prstGeom>
+                  </pic:spPr>
+                </pic:pic>
+              </a:graphicData>
+            </a:graphic>
+          </wp:inline>
+        </w:drawing>
+      </w:r>
     </w:p>
     <w:sectPr>
       <w:headerReference r:id="rId6" w:type="first"/>
@@ -883,7 +1053,7 @@
     <w:lsdException w:qFormat="1" w:unhideWhenUsed="0" w:uiPriority="10" w:semiHidden="0" w:name="Title"/>
     <w:lsdException w:uiPriority="99" w:name="Closing"/>
     <w:lsdException w:uiPriority="99" w:name="Signature"/>
-    <w:lsdException w:uiPriority="1" w:name="Default Paragraph Font"/>
+    <w:lsdException w:qFormat="1" w:uiPriority="1" w:name="Default Paragraph Font"/>
     <w:lsdException w:uiPriority="99" w:name="Body Text"/>
     <w:lsdException w:uiPriority="99" w:name="Body Text Indent"/>
     <w:lsdException w:uiPriority="99" w:name="List Continue"/>
@@ -921,7 +1091,7 @@
     <w:lsdException w:uiPriority="99" w:name="HTML Sample"/>
     <w:lsdException w:uiPriority="99" w:name="HTML Typewriter"/>
     <w:lsdException w:uiPriority="99" w:name="HTML Variable"/>
-    <w:lsdException w:uiPriority="99" w:name="Normal Table"/>
+    <w:lsdException w:qFormat="1" w:uiPriority="99" w:name="Normal Table"/>
     <w:lsdException w:uiPriority="99" w:name="annotation subject"/>
     <w:lsdException w:uiPriority="99" w:name="Table Simple 1"/>
     <w:lsdException w:uiPriority="99" w:name="Table Simple 2"/>
@@ -1131,12 +1301,14 @@
     <w:name w:val="Default Paragraph Font"/>
     <w:semiHidden/>
     <w:unhideWhenUsed/>
+    <w:qFormat/>
     <w:uiPriority w:val="1"/>
   </w:style>
   <w:style w:type="table" w:default="1" w:styleId="11">
     <w:name w:val="Normal Table"/>
     <w:semiHidden/>
     <w:unhideWhenUsed/>
+    <w:qFormat/>
     <w:uiPriority w:val="99"/>
     <w:tblPr>
       <w:tblCellMar>

</xml_diff>

<commit_message>
update yellow led with temp less then 18 degC with ice
</commit_message>
<xml_diff>
--- a/MATLAB Coursework 2  Word Template.docx
+++ b/MATLAB Coursework 2  Word Template.docx
@@ -257,7 +257,6 @@
           </w14:textFill>
         </w:rPr>
       </w:pPr>
-      <w:bookmarkStart w:id="0" w:name="_GoBack"/>
       <w:r>
         <w:rPr>
           <w:rFonts w:hint="default" w:eastAsia="宋体"/>
@@ -308,7 +307,6 @@
           </wp:inline>
         </w:drawing>
       </w:r>
-      <w:bookmarkEnd w:id="0"/>
     </w:p>
     <w:p>
       <w:pPr>
@@ -351,11 +349,15 @@
         </w:rPr>
       </w:pPr>
       <w:r>
+        <w:rPr>
+          <w:rFonts w:hint="default"/>
+          <w:lang w:val="en-US" w:eastAsia="zh-CN"/>
+        </w:rPr>
         <w:drawing>
           <wp:inline distT="0" distB="0" distL="114300" distR="114300">
-            <wp:extent cx="2122170" cy="1800225"/>
-            <wp:effectExtent l="0" t="0" r="11430" b="9525"/>
-            <wp:docPr id="2" name="图片 1"/>
+            <wp:extent cx="1350010" cy="1800225"/>
+            <wp:effectExtent l="0" t="0" r="2540" b="9525"/>
+            <wp:docPr id="7" name="图片 7" descr="6695ae43b64c8b628fc27a8a3995f7bb"/>
             <wp:cNvGraphicFramePr>
               <a:graphicFrameLocks xmlns:a="http://schemas.openxmlformats.org/drawingml/2006/main" noChangeAspect="1"/>
             </wp:cNvGraphicFramePr>
@@ -363,7 +365,7 @@
               <a:graphicData uri="http://schemas.openxmlformats.org/drawingml/2006/picture">
                 <pic:pic xmlns:pic="http://schemas.openxmlformats.org/drawingml/2006/picture">
                   <pic:nvPicPr>
-                    <pic:cNvPr id="2" name="图片 1"/>
+                    <pic:cNvPr id="7" name="图片 7" descr="6695ae43b64c8b628fc27a8a3995f7bb"/>
                     <pic:cNvPicPr>
                       <a:picLocks noChangeAspect="1"/>
                     </pic:cNvPicPr>
@@ -377,15 +379,11 @@
                   <pic:spPr>
                     <a:xfrm>
                       <a:off x="0" y="0"/>
-                      <a:ext cx="2122170" cy="1800225"/>
+                      <a:ext cx="1350010" cy="1800225"/>
                     </a:xfrm>
                     <a:prstGeom prst="rect">
                       <a:avLst/>
                     </a:prstGeom>
-                    <a:noFill/>
-                    <a:ln>
-                      <a:noFill/>
-                    </a:ln>
                   </pic:spPr>
                 </pic:pic>
               </a:graphicData>
@@ -393,6 +391,7 @@
           </wp:inline>
         </w:drawing>
       </w:r>
+      <w:bookmarkStart w:id="0" w:name="_GoBack"/>
       <w:r>
         <w:rPr>
           <w:rFonts w:hint="default"/>
@@ -402,7 +401,7 @@
           <wp:inline distT="0" distB="0" distL="114300" distR="114300">
             <wp:extent cx="1350010" cy="1800225"/>
             <wp:effectExtent l="0" t="0" r="2540" b="9525"/>
-            <wp:docPr id="7" name="图片 7" descr="6695ae43b64c8b628fc27a8a3995f7bb"/>
+            <wp:docPr id="9" name="图片 9" descr="6fd501c70b1da64a518f5dcd68fbcb65"/>
             <wp:cNvGraphicFramePr>
               <a:graphicFrameLocks xmlns:a="http://schemas.openxmlformats.org/drawingml/2006/main" noChangeAspect="1"/>
             </wp:cNvGraphicFramePr>
@@ -410,7 +409,7 @@
               <a:graphicData uri="http://schemas.openxmlformats.org/drawingml/2006/picture">
                 <pic:pic xmlns:pic="http://schemas.openxmlformats.org/drawingml/2006/picture">
                   <pic:nvPicPr>
-                    <pic:cNvPr id="7" name="图片 7" descr="6695ae43b64c8b628fc27a8a3995f7bb"/>
+                    <pic:cNvPr id="9" name="图片 9" descr="6fd501c70b1da64a518f5dcd68fbcb65"/>
                     <pic:cNvPicPr>
                       <a:picLocks noChangeAspect="1"/>
                     </pic:cNvPicPr>
@@ -436,16 +435,13 @@
           </wp:inline>
         </w:drawing>
       </w:r>
-      <w:r>
-        <w:rPr>
-          <w:rFonts w:hint="default"/>
-          <w:lang w:val="en-US" w:eastAsia="zh-CN"/>
-        </w:rPr>
+      <w:bookmarkEnd w:id="0"/>
+      <w:r>
         <w:drawing>
           <wp:inline distT="0" distB="0" distL="114300" distR="114300">
-            <wp:extent cx="1350010" cy="1800225"/>
-            <wp:effectExtent l="0" t="0" r="2540" b="9525"/>
-            <wp:docPr id="9" name="图片 9" descr="6fd501c70b1da64a518f5dcd68fbcb65"/>
+            <wp:extent cx="2122170" cy="1800225"/>
+            <wp:effectExtent l="0" t="0" r="11430" b="9525"/>
+            <wp:docPr id="10" name="图片 2"/>
             <wp:cNvGraphicFramePr>
               <a:graphicFrameLocks xmlns:a="http://schemas.openxmlformats.org/drawingml/2006/main" noChangeAspect="1"/>
             </wp:cNvGraphicFramePr>
@@ -453,13 +449,70 @@
               <a:graphicData uri="http://schemas.openxmlformats.org/drawingml/2006/picture">
                 <pic:pic xmlns:pic="http://schemas.openxmlformats.org/drawingml/2006/picture">
                   <pic:nvPicPr>
-                    <pic:cNvPr id="9" name="图片 9" descr="6fd501c70b1da64a518f5dcd68fbcb65"/>
+                    <pic:cNvPr id="10" name="图片 2"/>
                     <pic:cNvPicPr>
                       <a:picLocks noChangeAspect="1"/>
                     </pic:cNvPicPr>
                   </pic:nvPicPr>
                   <pic:blipFill>
                     <a:blip r:embed="rId14"/>
+                    <a:stretch>
+                      <a:fillRect/>
+                    </a:stretch>
+                  </pic:blipFill>
+                  <pic:spPr>
+                    <a:xfrm>
+                      <a:off x="0" y="0"/>
+                      <a:ext cx="2122170" cy="1800225"/>
+                    </a:xfrm>
+                    <a:prstGeom prst="rect">
+                      <a:avLst/>
+                    </a:prstGeom>
+                    <a:noFill/>
+                    <a:ln>
+                      <a:noFill/>
+                    </a:ln>
+                  </pic:spPr>
+                </pic:pic>
+              </a:graphicData>
+            </a:graphic>
+          </wp:inline>
+        </w:drawing>
+      </w:r>
+    </w:p>
+    <w:p>
+      <w:pPr>
+        <w:spacing w:line="259" w:lineRule="auto"/>
+        <w:jc w:val="both"/>
+        <w:rPr>
+          <w:rFonts w:hint="default"/>
+          <w:lang w:val="en-US" w:eastAsia="zh-CN"/>
+        </w:rPr>
+      </w:pPr>
+      <w:r>
+        <w:rPr>
+          <w:rFonts w:hint="default"/>
+          <w:lang w:val="en-US" w:eastAsia="zh-CN"/>
+        </w:rPr>
+        <w:drawing>
+          <wp:inline distT="0" distB="0" distL="114300" distR="114300">
+            <wp:extent cx="1350010" cy="1800225"/>
+            <wp:effectExtent l="0" t="0" r="2540" b="9525"/>
+            <wp:docPr id="11" name="图片 11" descr="547063cddbff98cd1ea68ea328c41ade"/>
+            <wp:cNvGraphicFramePr>
+              <a:graphicFrameLocks xmlns:a="http://schemas.openxmlformats.org/drawingml/2006/main" noChangeAspect="1"/>
+            </wp:cNvGraphicFramePr>
+            <a:graphic xmlns:a="http://schemas.openxmlformats.org/drawingml/2006/main">
+              <a:graphicData uri="http://schemas.openxmlformats.org/drawingml/2006/picture">
+                <pic:pic xmlns:pic="http://schemas.openxmlformats.org/drawingml/2006/picture">
+                  <pic:nvPicPr>
+                    <pic:cNvPr id="11" name="图片 11" descr="547063cddbff98cd1ea68ea328c41ade"/>
+                    <pic:cNvPicPr>
+                      <a:picLocks noChangeAspect="1"/>
+                    </pic:cNvPicPr>
+                  </pic:nvPicPr>
+                  <pic:blipFill>
+                    <a:blip r:embed="rId15"/>
                     <a:stretch>
                       <a:fillRect/>
                     </a:stretch>

</xml_diff>

<commit_message>
update all 3 situations of different LED on in different temps
</commit_message>
<xml_diff>
--- a/MATLAB Coursework 2  Word Template.docx
+++ b/MATLAB Coursework 2  Word Template.docx
@@ -343,10 +343,6 @@
       <w:pPr>
         <w:spacing w:line="259" w:lineRule="auto"/>
         <w:jc w:val="both"/>
-        <w:rPr>
-          <w:rFonts w:hint="default"/>
-          <w:lang w:val="en-US" w:eastAsia="zh-CN"/>
-        </w:rPr>
       </w:pPr>
       <w:r>
         <w:rPr>
@@ -357,7 +353,7 @@
           <wp:inline distT="0" distB="0" distL="114300" distR="114300">
             <wp:extent cx="1350010" cy="1800225"/>
             <wp:effectExtent l="0" t="0" r="2540" b="9525"/>
-            <wp:docPr id="7" name="图片 7" descr="6695ae43b64c8b628fc27a8a3995f7bb"/>
+            <wp:docPr id="9" name="图片 9" descr="6fd501c70b1da64a518f5dcd68fbcb65"/>
             <wp:cNvGraphicFramePr>
               <a:graphicFrameLocks xmlns:a="http://schemas.openxmlformats.org/drawingml/2006/main" noChangeAspect="1"/>
             </wp:cNvGraphicFramePr>
@@ -365,7 +361,7 @@
               <a:graphicData uri="http://schemas.openxmlformats.org/drawingml/2006/picture">
                 <pic:pic xmlns:pic="http://schemas.openxmlformats.org/drawingml/2006/picture">
                   <pic:nvPicPr>
-                    <pic:cNvPr id="7" name="图片 7" descr="6695ae43b64c8b628fc27a8a3995f7bb"/>
+                    <pic:cNvPr id="9" name="图片 9" descr="6fd501c70b1da64a518f5dcd68fbcb65"/>
                     <pic:cNvPicPr>
                       <a:picLocks noChangeAspect="1"/>
                     </pic:cNvPicPr>
@@ -392,15 +388,11 @@
         </w:drawing>
       </w:r>
       <w:r>
-        <w:rPr>
-          <w:rFonts w:hint="default"/>
-          <w:lang w:val="en-US" w:eastAsia="zh-CN"/>
-        </w:rPr>
         <w:drawing>
           <wp:inline distT="0" distB="0" distL="114300" distR="114300">
-            <wp:extent cx="1350010" cy="1800225"/>
-            <wp:effectExtent l="0" t="0" r="2540" b="9525"/>
-            <wp:docPr id="9" name="图片 9" descr="6fd501c70b1da64a518f5dcd68fbcb65"/>
+            <wp:extent cx="2736215" cy="1800225"/>
+            <wp:effectExtent l="0" t="0" r="6985" b="9525"/>
+            <wp:docPr id="2" name="图片 1"/>
             <wp:cNvGraphicFramePr>
               <a:graphicFrameLocks xmlns:a="http://schemas.openxmlformats.org/drawingml/2006/main" noChangeAspect="1"/>
             </wp:cNvGraphicFramePr>
@@ -408,7 +400,7 @@
               <a:graphicData uri="http://schemas.openxmlformats.org/drawingml/2006/picture">
                 <pic:pic xmlns:pic="http://schemas.openxmlformats.org/drawingml/2006/picture">
                   <pic:nvPicPr>
-                    <pic:cNvPr id="9" name="图片 9" descr="6fd501c70b1da64a518f5dcd68fbcb65"/>
+                    <pic:cNvPr id="2" name="图片 1"/>
                     <pic:cNvPicPr>
                       <a:picLocks noChangeAspect="1"/>
                     </pic:cNvPicPr>
@@ -422,46 +414,7 @@
                   <pic:spPr>
                     <a:xfrm>
                       <a:off x="0" y="0"/>
-                      <a:ext cx="1350010" cy="1800225"/>
-                    </a:xfrm>
-                    <a:prstGeom prst="rect">
-                      <a:avLst/>
-                    </a:prstGeom>
-                  </pic:spPr>
-                </pic:pic>
-              </a:graphicData>
-            </a:graphic>
-          </wp:inline>
-        </w:drawing>
-      </w:r>
-      <w:r>
-        <w:drawing>
-          <wp:inline distT="0" distB="0" distL="114300" distR="114300">
-            <wp:extent cx="2122170" cy="1800225"/>
-            <wp:effectExtent l="0" t="0" r="11430" b="9525"/>
-            <wp:docPr id="10" name="图片 2"/>
-            <wp:cNvGraphicFramePr>
-              <a:graphicFrameLocks xmlns:a="http://schemas.openxmlformats.org/drawingml/2006/main" noChangeAspect="1"/>
-            </wp:cNvGraphicFramePr>
-            <a:graphic xmlns:a="http://schemas.openxmlformats.org/drawingml/2006/main">
-              <a:graphicData uri="http://schemas.openxmlformats.org/drawingml/2006/picture">
-                <pic:pic xmlns:pic="http://schemas.openxmlformats.org/drawingml/2006/picture">
-                  <pic:nvPicPr>
-                    <pic:cNvPr id="10" name="图片 2"/>
-                    <pic:cNvPicPr>
-                      <a:picLocks noChangeAspect="1"/>
-                    </pic:cNvPicPr>
-                  </pic:nvPicPr>
-                  <pic:blipFill>
-                    <a:blip r:embed="rId14"/>
-                    <a:stretch>
-                      <a:fillRect/>
-                    </a:stretch>
-                  </pic:blipFill>
-                  <pic:spPr>
-                    <a:xfrm>
-                      <a:off x="0" y="0"/>
-                      <a:ext cx="2122170" cy="1800225"/>
+                      <a:ext cx="2736215" cy="1800225"/>
                     </a:xfrm>
                     <a:prstGeom prst="rect">
                       <a:avLst/>
@@ -487,16 +440,26 @@
           <w:lang w:val="en-US" w:eastAsia="zh-CN"/>
         </w:rPr>
       </w:pPr>
-      <w:r>
+    </w:p>
+    <w:p>
+      <w:pPr>
+        <w:spacing w:line="259" w:lineRule="auto"/>
+        <w:jc w:val="both"/>
         <w:rPr>
           <w:rFonts w:hint="default"/>
-          <w:lang w:val="en-US" w:eastAsia="zh-CN"/>
+          <w:lang w:val="en-GB" w:eastAsia="zh-CN"/>
+        </w:rPr>
+      </w:pPr>
+      <w:r>
+        <w:rPr>
+          <w:rFonts w:hint="default"/>
+          <w:lang w:val="en-GB" w:eastAsia="zh-CN"/>
         </w:rPr>
         <w:drawing>
           <wp:inline distT="0" distB="0" distL="114300" distR="114300">
-            <wp:extent cx="1350010" cy="1800225"/>
-            <wp:effectExtent l="0" t="0" r="2540" b="9525"/>
-            <wp:docPr id="6" name="图片 6" descr="12fd92a1bdf3c95b77859e31d5ca8e7e"/>
+            <wp:extent cx="1889760" cy="2520315"/>
+            <wp:effectExtent l="0" t="0" r="15240" b="13335"/>
+            <wp:docPr id="6" name="图片 6" descr="d01a0558637b086ee74de9d768b9d458"/>
             <wp:cNvGraphicFramePr>
               <a:graphicFrameLocks xmlns:a="http://schemas.openxmlformats.org/drawingml/2006/main" noChangeAspect="1"/>
             </wp:cNvGraphicFramePr>
@@ -504,7 +467,52 @@
               <a:graphicData uri="http://schemas.openxmlformats.org/drawingml/2006/picture">
                 <pic:pic xmlns:pic="http://schemas.openxmlformats.org/drawingml/2006/picture">
                   <pic:nvPicPr>
-                    <pic:cNvPr id="6" name="图片 6" descr="12fd92a1bdf3c95b77859e31d5ca8e7e"/>
+                    <pic:cNvPr id="6" name="图片 6" descr="d01a0558637b086ee74de9d768b9d458"/>
+                    <pic:cNvPicPr>
+                      <a:picLocks noChangeAspect="1"/>
+                    </pic:cNvPicPr>
+                  </pic:nvPicPr>
+                  <pic:blipFill>
+                    <a:blip r:embed="rId14"/>
+                    <a:stretch>
+                      <a:fillRect/>
+                    </a:stretch>
+                  </pic:blipFill>
+                  <pic:spPr>
+                    <a:xfrm>
+                      <a:off x="0" y="0"/>
+                      <a:ext cx="1889760" cy="2520315"/>
+                    </a:xfrm>
+                    <a:prstGeom prst="rect">
+                      <a:avLst/>
+                    </a:prstGeom>
+                  </pic:spPr>
+                </pic:pic>
+              </a:graphicData>
+            </a:graphic>
+          </wp:inline>
+        </w:drawing>
+      </w:r>
+      <w:bookmarkStart w:id="0" w:name="_GoBack"/>
+      <w:bookmarkEnd w:id="0"/>
+      <w:r>
+        <w:rPr>
+          <w:rFonts w:hint="default"/>
+          <w:lang w:val="en-GB" w:eastAsia="zh-CN"/>
+        </w:rPr>
+        <w:drawing>
+          <wp:inline distT="0" distB="0" distL="114300" distR="114300">
+            <wp:extent cx="1889760" cy="2520315"/>
+            <wp:effectExtent l="0" t="0" r="15240" b="13335"/>
+            <wp:docPr id="7" name="图片 7" descr="254925063deb87aa2246c9ef4434a9da"/>
+            <wp:cNvGraphicFramePr>
+              <a:graphicFrameLocks xmlns:a="http://schemas.openxmlformats.org/drawingml/2006/main" noChangeAspect="1"/>
+            </wp:cNvGraphicFramePr>
+            <a:graphic xmlns:a="http://schemas.openxmlformats.org/drawingml/2006/main">
+              <a:graphicData uri="http://schemas.openxmlformats.org/drawingml/2006/picture">
+                <pic:pic xmlns:pic="http://schemas.openxmlformats.org/drawingml/2006/picture">
+                  <pic:nvPicPr>
+                    <pic:cNvPr id="7" name="图片 7" descr="254925063deb87aa2246c9ef4434a9da"/>
                     <pic:cNvPicPr>
                       <a:picLocks noChangeAspect="1"/>
                     </pic:cNvPicPr>
@@ -518,7 +526,7 @@
                   <pic:spPr>
                     <a:xfrm>
                       <a:off x="0" y="0"/>
-                      <a:ext cx="1350010" cy="1800225"/>
+                      <a:ext cx="1889760" cy="2520315"/>
                     </a:xfrm>
                     <a:prstGeom prst="rect">
                       <a:avLst/>
@@ -530,8 +538,49 @@
           </wp:inline>
         </w:drawing>
       </w:r>
-      <w:bookmarkStart w:id="0" w:name="_GoBack"/>
-      <w:bookmarkEnd w:id="0"/>
+      <w:r>
+        <w:rPr>
+          <w:rFonts w:hint="default"/>
+          <w:lang w:val="en-GB" w:eastAsia="zh-CN"/>
+        </w:rPr>
+        <w:drawing>
+          <wp:inline distT="0" distB="0" distL="114300" distR="114300">
+            <wp:extent cx="1890395" cy="2520315"/>
+            <wp:effectExtent l="0" t="0" r="14605" b="13335"/>
+            <wp:docPr id="10" name="图片 10" descr="07e3a5fa5e241f137d81d9feecd354be"/>
+            <wp:cNvGraphicFramePr>
+              <a:graphicFrameLocks xmlns:a="http://schemas.openxmlformats.org/drawingml/2006/main" noChangeAspect="1"/>
+            </wp:cNvGraphicFramePr>
+            <a:graphic xmlns:a="http://schemas.openxmlformats.org/drawingml/2006/main">
+              <a:graphicData uri="http://schemas.openxmlformats.org/drawingml/2006/picture">
+                <pic:pic xmlns:pic="http://schemas.openxmlformats.org/drawingml/2006/picture">
+                  <pic:nvPicPr>
+                    <pic:cNvPr id="10" name="图片 10" descr="07e3a5fa5e241f137d81d9feecd354be"/>
+                    <pic:cNvPicPr>
+                      <a:picLocks noChangeAspect="1"/>
+                    </pic:cNvPicPr>
+                  </pic:nvPicPr>
+                  <pic:blipFill>
+                    <a:blip r:embed="rId16"/>
+                    <a:stretch>
+                      <a:fillRect/>
+                    </a:stretch>
+                  </pic:blipFill>
+                  <pic:spPr>
+                    <a:xfrm>
+                      <a:off x="0" y="0"/>
+                      <a:ext cx="1890395" cy="2520315"/>
+                    </a:xfrm>
+                    <a:prstGeom prst="rect">
+                      <a:avLst/>
+                    </a:prstGeom>
+                  </pic:spPr>
+                </pic:pic>
+              </a:graphicData>
+            </a:graphic>
+          </wp:inline>
+        </w:drawing>
+      </w:r>
     </w:p>
     <w:sectPr>
       <w:headerReference r:id="rId6" w:type="first"/>
@@ -583,6 +632,12 @@
       </w:docPartObj>
     </w:sdtPr>
     <w:sdtContent>
+      <w:p>
+        <w:pPr>
+          <w:pStyle w:val="6"/>
+          <w:jc w:val="right"/>
+        </w:pPr>
+      </w:p>
       <w:p>
         <w:pPr>
           <w:pStyle w:val="6"/>
@@ -681,13 +736,37 @@
     </w:pPr>
     <w:r>
       <w:rPr>
+        <w:rFonts w:hint="default"/>
+        <w:i/>
+        <w:iCs/>
+        <w:sz w:val="18"/>
+        <w:szCs w:val="18"/>
+        <w:highlight w:val="yellow"/>
+        <w:lang w:val="en-GB"/>
+      </w:rPr>
+      <w:t>Zeming_WU</w:t>
+    </w:r>
+    <w:r>
+      <w:rPr>
         <w:i/>
         <w:iCs/>
         <w:sz w:val="18"/>
         <w:szCs w:val="18"/>
         <w:highlight w:val="yellow"/>
       </w:rPr>
-      <w:t>Your name, student ID</w:t>
+      <w:t xml:space="preserve">, </w:t>
+    </w:r>
+    <w:r>
+      <w:rPr>
+        <w:rFonts w:hint="default"/>
+        <w:i/>
+        <w:iCs/>
+        <w:sz w:val="18"/>
+        <w:szCs w:val="18"/>
+        <w:highlight w:val="yellow"/>
+        <w:lang w:val="en-GB"/>
+      </w:rPr>
+      <w:t>20719336</w:t>
     </w:r>
     <w:r>
       <w:rPr>
@@ -1191,7 +1270,7 @@
     <w:lsdException w:uiPriority="99" w:name="Balloon Text"/>
     <w:lsdException w:qFormat="1" w:unhideWhenUsed="0" w:uiPriority="39" w:semiHidden="0" w:name="Table Grid"/>
     <w:lsdException w:uiPriority="99" w:name="Table Theme"/>
-    <w:lsdException w:unhideWhenUsed="0" w:uiPriority="99" w:name="Placeholder Text"/>
+    <w:lsdException w:qFormat="1" w:unhideWhenUsed="0" w:uiPriority="99" w:name="Placeholder Text"/>
     <w:lsdException w:unhideWhenUsed="0" w:uiPriority="60" w:semiHidden="0" w:name="Light Shading"/>
     <w:lsdException w:unhideWhenUsed="0" w:uiPriority="61" w:semiHidden="0" w:name="Light List"/>
     <w:lsdException w:unhideWhenUsed="0" w:uiPriority="62" w:semiHidden="0" w:name="Light Grid"/>
@@ -1553,6 +1632,7 @@
     <w:name w:val="Placeholder Text"/>
     <w:basedOn w:val="13"/>
     <w:semiHidden/>
+    <w:qFormat/>
     <w:uiPriority w:val="99"/>
     <w:rPr>
       <w:color w:val="808080"/>
@@ -1562,6 +1642,7 @@
     <w:name w:val="Heading 1 Char"/>
     <w:basedOn w:val="13"/>
     <w:link w:val="2"/>
+    <w:qFormat/>
     <w:uiPriority w:val="9"/>
     <w:rPr>
       <w:rFonts w:ascii="Arial" w:hAnsi="Arial" w:cs="Arial"/>
@@ -1615,6 +1696,7 @@
     <w:basedOn w:val="1"/>
     <w:next w:val="1"/>
     <w:unhideWhenUsed/>
+    <w:qFormat/>
     <w:uiPriority w:val="37"/>
   </w:style>
   <w:style w:type="character" w:customStyle="1" w:styleId="24">

</xml_diff>

<commit_message>
Add picture in task3
</commit_message>
<xml_diff>
--- a/MATLAB Coursework 2  Word Template.docx
+++ b/MATLAB Coursework 2  Word Template.docx
@@ -31,7 +31,6 @@
         </w:rPr>
         <w:t xml:space="preserve">Author: </w:t>
       </w:r>
-      <w:proofErr w:type="spellStart"/>
       <w:r>
         <w:rPr>
           <w:rFonts w:eastAsia="宋体" w:hint="eastAsia"/>
@@ -39,17 +38,7 @@
           <w:bCs/>
           <w:lang w:val="en-US" w:eastAsia="zh-CN"/>
         </w:rPr>
-        <w:t>Zeming</w:t>
-      </w:r>
-      <w:proofErr w:type="spellEnd"/>
-      <w:r>
-        <w:rPr>
-          <w:rFonts w:eastAsia="宋体" w:hint="eastAsia"/>
-          <w:b/>
-          <w:bCs/>
-          <w:lang w:val="en-US" w:eastAsia="zh-CN"/>
-        </w:rPr>
-        <w:t xml:space="preserve"> WU</w:t>
+        <w:t>Zeming WU</w:t>
       </w:r>
     </w:p>
     <w:p>
@@ -561,7 +550,7 @@
           </mc:Choice>
           <mc:Fallback>
             <w:pict>
-              <v:shapetype w14:anchorId="61069539" id="_x0000_t34" coordsize="21600,21600" o:spt="34" o:oned="t" adj="10800" path="m,l@0,0@0,21600,21600,21600e" filled="f">
+              <v:shapetype w14:anchorId="61C70C00" id="_x0000_t34" coordsize="21600,21600" o:spt="34" o:oned="t" adj="10800" path="m,l@0,0@0,21600,21600,21600e" filled="f">
                 <v:stroke joinstyle="miter"/>
                 <v:formulas>
                   <v:f eqn="val #0"/>
@@ -785,7 +774,7 @@
           </mc:Choice>
           <mc:Fallback>
             <w:pict>
-              <v:shapetype w14:anchorId="23DF04AB" id="_x0000_t32" coordsize="21600,21600" o:spt="32" o:oned="t" path="m,l21600,21600e" filled="f">
+              <v:shapetype w14:anchorId="1D56EF88" id="_x0000_t32" coordsize="21600,21600" o:spt="32" o:oned="t" path="m,l21600,21600e" filled="f">
                 <v:path arrowok="t" fillok="f" o:connecttype="none"/>
                 <o:lock v:ext="edit" shapetype="t"/>
               </v:shapetype>
@@ -998,7 +987,7 @@
           </mc:Choice>
           <mc:Fallback>
             <w:pict>
-              <v:shape w14:anchorId="34B09B3A" id="直接箭头连接符 8" o:spid="_x0000_s1026" type="#_x0000_t32" style="position:absolute;margin-left:67.2pt;margin-top:21.3pt;width:.45pt;height:14.05pt;z-index:251663360;visibility:visible;mso-wrap-style:square;mso-wrap-distance-left:9pt;mso-wrap-distance-top:0;mso-wrap-distance-right:9pt;mso-wrap-distance-bottom:0;mso-position-horizontal:absolute;mso-position-horizontal-relative:text;mso-position-vertical:absolute;mso-position-vertical-relative:text" o:gfxdata="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" strokecolor="#4472c4 [3204]" strokeweight=".5pt">
+              <v:shape w14:anchorId="1F10626A" id="直接箭头连接符 8" o:spid="_x0000_s1026" type="#_x0000_t32" style="position:absolute;margin-left:67.2pt;margin-top:21.3pt;width:.45pt;height:14.05pt;z-index:251663360;visibility:visible;mso-wrap-style:square;mso-wrap-distance-left:9pt;mso-wrap-distance-top:0;mso-wrap-distance-right:9pt;mso-wrap-distance-bottom:0;mso-position-horizontal:absolute;mso-position-horizontal-relative:text;mso-position-vertical:absolute;mso-position-vertical-relative:text" o:gfxdata="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" strokecolor="#4472c4 [3204]" strokeweight=".5pt">
                 <v:stroke endarrow="block" joinstyle="miter"/>
               </v:shape>
             </w:pict>
@@ -1083,17 +1072,8 @@
                                 <w:rFonts w:eastAsia="等线" w:hint="eastAsia"/>
                                 <w:lang w:eastAsia="zh-CN"/>
                               </w:rPr>
-                              <w:t xml:space="preserve">Convert voltage to </w:t>
+                              <w:t>Convert voltage to teamperature</w:t>
                             </w:r>
-                            <w:proofErr w:type="spellStart"/>
-                            <w:r>
-                              <w:rPr>
-                                <w:rFonts w:eastAsia="等线" w:hint="eastAsia"/>
-                                <w:lang w:eastAsia="zh-CN"/>
-                              </w:rPr>
-                              <w:t>teamperature</w:t>
-                            </w:r>
-                            <w:proofErr w:type="spellEnd"/>
                           </w:p>
                         </w:txbxContent>
                       </wps:txbx>
@@ -1130,17 +1110,8 @@
                           <w:rFonts w:eastAsia="等线" w:hint="eastAsia"/>
                           <w:lang w:eastAsia="zh-CN"/>
                         </w:rPr>
-                        <w:t xml:space="preserve">Convert voltage to </w:t>
+                        <w:t>Convert voltage to teamperature</w:t>
                       </w:r>
-                      <w:proofErr w:type="spellStart"/>
-                      <w:r>
-                        <w:rPr>
-                          <w:rFonts w:eastAsia="等线" w:hint="eastAsia"/>
-                          <w:lang w:eastAsia="zh-CN"/>
-                        </w:rPr>
-                        <w:t>teamperature</w:t>
-                      </w:r>
-                      <w:proofErr w:type="spellEnd"/>
                     </w:p>
                   </w:txbxContent>
                 </v:textbox>
@@ -1233,7 +1204,7 @@
           </mc:Choice>
           <mc:Fallback>
             <w:pict>
-              <v:shape w14:anchorId="23F63078" id="直接箭头连接符 8" o:spid="_x0000_s1026" type="#_x0000_t32" style="position:absolute;margin-left:67.2pt;margin-top:10.7pt;width:.45pt;height:14.05pt;z-index:251667456;visibility:visible;mso-wrap-style:square;mso-wrap-distance-left:9pt;mso-wrap-distance-top:0;mso-wrap-distance-right:9pt;mso-wrap-distance-bottom:0;mso-position-horizontal:absolute;mso-position-horizontal-relative:text;mso-position-vertical:absolute;mso-position-vertical-relative:text" o:gfxdata="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" strokecolor="#4472c4 [3204]" strokeweight=".5pt">
+              <v:shape w14:anchorId="4B15855F" id="直接箭头连接符 8" o:spid="_x0000_s1026" type="#_x0000_t32" style="position:absolute;margin-left:67.2pt;margin-top:10.7pt;width:.45pt;height:14.05pt;z-index:251667456;visibility:visible;mso-wrap-style:square;mso-wrap-distance-left:9pt;mso-wrap-distance-top:0;mso-wrap-distance-right:9pt;mso-wrap-distance-bottom:0;mso-position-horizontal:absolute;mso-position-horizontal-relative:text;mso-position-vertical:absolute;mso-position-vertical-relative:text" o:gfxdata="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" strokecolor="#4472c4 [3204]" strokeweight=".5pt">
                 <v:stroke endarrow="block" joinstyle="miter"/>
               </v:shape>
             </w:pict>
@@ -1442,7 +1413,7 @@
           </mc:Choice>
           <mc:Fallback>
             <w:pict>
-              <v:shape w14:anchorId="6AC762DA" id="直接箭头连接符 10" o:spid="_x0000_s1026" type="#_x0000_t32" style="position:absolute;margin-left:69.15pt;margin-top:6.2pt;width:.35pt;height:15.75pt;z-index:251669504;visibility:visible;mso-wrap-style:square;mso-wrap-distance-left:9pt;mso-wrap-distance-top:0;mso-wrap-distance-right:9pt;mso-wrap-distance-bottom:0;mso-position-horizontal:absolute;mso-position-horizontal-relative:text;mso-position-vertical:absolute;mso-position-vertical-relative:text" o:gfxdata="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" strokecolor="#4472c4 [3204]" strokeweight=".5pt">
+              <v:shape w14:anchorId="6DA2252F" id="直接箭头连接符 10" o:spid="_x0000_s1026" type="#_x0000_t32" style="position:absolute;margin-left:69.15pt;margin-top:6.2pt;width:.35pt;height:15.75pt;z-index:251669504;visibility:visible;mso-wrap-style:square;mso-wrap-distance-left:9pt;mso-wrap-distance-top:0;mso-wrap-distance-right:9pt;mso-wrap-distance-bottom:0;mso-position-horizontal:absolute;mso-position-horizontal-relative:text;mso-position-vertical:absolute;mso-position-vertical-relative:text" o:gfxdata="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" strokecolor="#4472c4 [3204]" strokeweight=".5pt">
                 <v:stroke endarrow="block" joinstyle="miter"/>
               </v:shape>
             </w:pict>
@@ -1897,7 +1868,7 @@
           </mc:Choice>
           <mc:Fallback>
             <w:pict>
-              <v:shape w14:anchorId="40E4270B" id="直接箭头连接符 15" o:spid="_x0000_s1026" type="#_x0000_t32" style="position:absolute;margin-left:151pt;margin-top:16.65pt;width:63.1pt;height:.45pt;flip:y;z-index:251672576;visibility:visible;mso-wrap-style:square;mso-wrap-distance-left:9pt;mso-wrap-distance-top:0;mso-wrap-distance-right:9pt;mso-wrap-distance-bottom:0;mso-position-horizontal:absolute;mso-position-horizontal-relative:text;mso-position-vertical:absolute;mso-position-vertical-relative:text" o:gfxdata="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" strokecolor="#4472c4 [3204]" strokeweight=".5pt">
+              <v:shape w14:anchorId="278E9D5F" id="直接箭头连接符 15" o:spid="_x0000_s1026" type="#_x0000_t32" style="position:absolute;margin-left:151pt;margin-top:16.65pt;width:63.1pt;height:.45pt;flip:y;z-index:251672576;visibility:visible;mso-wrap-style:square;mso-wrap-distance-left:9pt;mso-wrap-distance-top:0;mso-wrap-distance-right:9pt;mso-wrap-distance-bottom:0;mso-position-horizontal:absolute;mso-position-horizontal-relative:text;mso-position-vertical:absolute;mso-position-vertical-relative:text" o:gfxdata="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" strokecolor="#4472c4 [3204]" strokeweight=".5pt">
                 <v:stroke endarrow="block" joinstyle="miter"/>
               </v:shape>
             </w:pict>
@@ -1989,7 +1960,7 @@
           </mc:Choice>
           <mc:Fallback>
             <w:pict>
-              <v:shape w14:anchorId="7E2F70B5" id="直接箭头连接符 18" o:spid="_x0000_s1026" type="#_x0000_t32" style="position:absolute;margin-left:70.15pt;margin-top:15.45pt;width:.45pt;height:46.75pt;z-index:251676672;visibility:visible;mso-wrap-style:square;mso-wrap-distance-left:9pt;mso-wrap-distance-top:0;mso-wrap-distance-right:9pt;mso-wrap-distance-bottom:0;mso-position-horizontal:absolute;mso-position-horizontal-relative:text;mso-position-vertical:absolute;mso-position-vertical-relative:text" o:gfxdata="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" strokecolor="#4472c4 [3204]" strokeweight=".5pt">
+              <v:shape w14:anchorId="2CCACF32" id="直接箭头连接符 18" o:spid="_x0000_s1026" type="#_x0000_t32" style="position:absolute;margin-left:70.15pt;margin-top:15.45pt;width:.45pt;height:46.75pt;z-index:251676672;visibility:visible;mso-wrap-style:square;mso-wrap-distance-left:9pt;mso-wrap-distance-top:0;mso-wrap-distance-right:9pt;mso-wrap-distance-bottom:0;mso-position-horizontal:absolute;mso-position-horizontal-relative:text;mso-position-vertical:absolute;mso-position-vertical-relative:text" o:gfxdata="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" strokecolor="#4472c4 [3204]" strokeweight=".5pt">
                 <v:stroke endarrow="block" joinstyle="miter"/>
               </v:shape>
             </w:pict>
@@ -2665,7 +2636,7 @@
           </mc:Choice>
           <mc:Fallback>
             <w:pict>
-              <v:shape w14:anchorId="625ACEDD" id="直接箭头连接符 15" o:spid="_x0000_s1026" type="#_x0000_t32" style="position:absolute;margin-left:132.3pt;margin-top:6.05pt;width:63.1pt;height:.45pt;flip:y;z-index:251681792;visibility:visible;mso-wrap-style:square;mso-wrap-distance-left:9pt;mso-wrap-distance-top:0;mso-wrap-distance-right:9pt;mso-wrap-distance-bottom:0;mso-position-horizontal:absolute;mso-position-horizontal-relative:text;mso-position-vertical:absolute;mso-position-vertical-relative:text" o:gfxdata="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" strokecolor="#4472c4 [3204]" strokeweight=".5pt">
+              <v:shape w14:anchorId="53BC3952" id="直接箭头连接符 15" o:spid="_x0000_s1026" type="#_x0000_t32" style="position:absolute;margin-left:132.3pt;margin-top:6.05pt;width:63.1pt;height:.45pt;flip:y;z-index:251681792;visibility:visible;mso-wrap-style:square;mso-wrap-distance-left:9pt;mso-wrap-distance-top:0;mso-wrap-distance-right:9pt;mso-wrap-distance-bottom:0;mso-position-horizontal:absolute;mso-position-horizontal-relative:text;mso-position-vertical:absolute;mso-position-vertical-relative:text" o:gfxdata="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" strokecolor="#4472c4 [3204]" strokeweight=".5pt">
                 <v:stroke endarrow="block" joinstyle="miter"/>
               </v:shape>
             </w:pict>
@@ -2745,7 +2716,7 @@
           </mc:Choice>
           <mc:Fallback>
             <w:pict>
-              <v:shape w14:anchorId="48AB98C7" id="直接箭头连接符 18" o:spid="_x0000_s1026" type="#_x0000_t32" style="position:absolute;margin-left:70.35pt;margin-top:11.7pt;width:.45pt;height:46.75pt;z-index:251686912;visibility:visible;mso-wrap-style:square;mso-wrap-distance-left:9pt;mso-wrap-distance-top:0;mso-wrap-distance-right:9pt;mso-wrap-distance-bottom:0;mso-position-horizontal:absolute;mso-position-horizontal-relative:text;mso-position-vertical:absolute;mso-position-vertical-relative:text" o:gfxdata="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" strokecolor="#4472c4 [3204]" strokeweight=".5pt">
+              <v:shape w14:anchorId="4BC87F6D" id="直接箭头连接符 18" o:spid="_x0000_s1026" type="#_x0000_t32" style="position:absolute;margin-left:70.35pt;margin-top:11.7pt;width:.45pt;height:46.75pt;z-index:251686912;visibility:visible;mso-wrap-style:square;mso-wrap-distance-left:9pt;mso-wrap-distance-top:0;mso-wrap-distance-right:9pt;mso-wrap-distance-bottom:0;mso-position-horizontal:absolute;mso-position-horizontal-relative:text;mso-position-vertical:absolute;mso-position-vertical-relative:text" o:gfxdata="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" strokecolor="#4472c4 [3204]" strokeweight=".5pt">
                 <v:stroke endarrow="block" joinstyle="miter"/>
               </v:shape>
             </w:pict>
@@ -3429,7 +3400,7 @@
           </mc:Choice>
           <mc:Fallback>
             <w:pict>
-              <v:shape w14:anchorId="1CEBDD12" id="连接符: 肘形 19" o:spid="_x0000_s1026" type="#_x0000_t34" style="position:absolute;margin-left:105.65pt;margin-top:20.35pt;width:16.2pt;height:392.8pt;flip:y;z-index:251761664;visibility:visible;mso-wrap-style:square;mso-width-percent:0;mso-height-percent:0;mso-wrap-distance-left:9pt;mso-wrap-distance-top:0;mso-wrap-distance-right:9pt;mso-wrap-distance-bottom:0;mso-position-horizontal:absolute;mso-position-horizontal-relative:text;mso-position-vertical:absolute;mso-position-vertical-relative:text;mso-width-percent:0;mso-height-percent:0;mso-width-relative:margin;mso-height-relative:margin" o:gfxdata="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" adj="74570" strokecolor="#4472c4 [3204]" strokeweight=".5pt">
+              <v:shape w14:anchorId="13A9A2FA" id="连接符: 肘形 19" o:spid="_x0000_s1026" type="#_x0000_t34" style="position:absolute;margin-left:105.65pt;margin-top:20.35pt;width:16.2pt;height:392.8pt;flip:y;z-index:251761664;visibility:visible;mso-wrap-style:square;mso-width-percent:0;mso-height-percent:0;mso-wrap-distance-left:9pt;mso-wrap-distance-top:0;mso-wrap-distance-right:9pt;mso-wrap-distance-bottom:0;mso-position-horizontal:absolute;mso-position-horizontal-relative:text;mso-position-vertical:absolute;mso-position-vertical-relative:text;mso-width-percent:0;mso-height-percent:0;mso-width-relative:margin;mso-height-relative:margin" o:gfxdata="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" adj="74570" strokecolor="#4472c4 [3204]" strokeweight=".5pt">
                 <v:stroke endarrow="block"/>
               </v:shape>
             </w:pict>
@@ -3642,7 +3613,7 @@
           </mc:Choice>
           <mc:Fallback>
             <w:pict>
-              <v:shape w14:anchorId="5265DC6A" id="直接箭头连接符 6" o:spid="_x0000_s1026" type="#_x0000_t32" style="position:absolute;margin-left:67.3pt;margin-top:14.4pt;width:.45pt;height:23.9pt;z-index:251742208;visibility:visible;mso-wrap-style:square;mso-wrap-distance-left:9pt;mso-wrap-distance-top:0;mso-wrap-distance-right:9pt;mso-wrap-distance-bottom:0;mso-position-horizontal:absolute;mso-position-horizontal-relative:text;mso-position-vertical:absolute;mso-position-vertical-relative:text" o:gfxdata="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" strokecolor="#4472c4 [3204]" strokeweight=".5pt">
+              <v:shape w14:anchorId="78E8052D" id="直接箭头连接符 6" o:spid="_x0000_s1026" type="#_x0000_t32" style="position:absolute;margin-left:67.3pt;margin-top:14.4pt;width:.45pt;height:23.9pt;z-index:251742208;visibility:visible;mso-wrap-style:square;mso-wrap-distance-left:9pt;mso-wrap-distance-top:0;mso-wrap-distance-right:9pt;mso-wrap-distance-bottom:0;mso-position-horizontal:absolute;mso-position-horizontal-relative:text;mso-position-vertical:absolute;mso-position-vertical-relative:text" o:gfxdata="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" strokecolor="#4472c4 [3204]" strokeweight=".5pt">
                 <v:stroke endarrow="block" joinstyle="miter"/>
               </v:shape>
             </w:pict>
@@ -3862,7 +3833,7 @@
           </mc:Choice>
           <mc:Fallback>
             <w:pict>
-              <v:shape w14:anchorId="2C0C0AD1" id="直接箭头连接符 8" o:spid="_x0000_s1026" type="#_x0000_t32" style="position:absolute;margin-left:67.85pt;margin-top:15.05pt;width:.45pt;height:14.05pt;z-index:251763712;visibility:visible;mso-wrap-style:square;mso-wrap-distance-left:9pt;mso-wrap-distance-top:0;mso-wrap-distance-right:9pt;mso-wrap-distance-bottom:0;mso-position-horizontal:absolute;mso-position-horizontal-relative:text;mso-position-vertical:absolute;mso-position-vertical-relative:text" o:gfxdata="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" strokecolor="#4472c4 [3204]" strokeweight=".5pt">
+              <v:shape w14:anchorId="668F7857" id="直接箭头连接符 8" o:spid="_x0000_s1026" type="#_x0000_t32" style="position:absolute;margin-left:67.85pt;margin-top:15.05pt;width:.45pt;height:14.05pt;z-index:251763712;visibility:visible;mso-wrap-style:square;mso-wrap-distance-left:9pt;mso-wrap-distance-top:0;mso-wrap-distance-right:9pt;mso-wrap-distance-bottom:0;mso-position-horizontal:absolute;mso-position-horizontal-relative:text;mso-position-vertical:absolute;mso-position-vertical-relative:text" o:gfxdata="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" strokecolor="#4472c4 [3204]" strokeweight=".5pt">
                 <v:stroke endarrow="block" joinstyle="miter"/>
               </v:shape>
             </w:pict>
@@ -4071,7 +4042,7 @@
           </mc:Choice>
           <mc:Fallback>
             <w:pict>
-              <v:shape w14:anchorId="75F97E29" id="直接箭头连接符 8" o:spid="_x0000_s1026" type="#_x0000_t32" style="position:absolute;margin-left:67.2pt;margin-top:10.7pt;width:.45pt;height:14.05pt;z-index:251746304;visibility:visible;mso-wrap-style:square;mso-wrap-distance-left:9pt;mso-wrap-distance-top:0;mso-wrap-distance-right:9pt;mso-wrap-distance-bottom:0;mso-position-horizontal:absolute;mso-position-horizontal-relative:text;mso-position-vertical:absolute;mso-position-vertical-relative:text" o:gfxdata="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" strokecolor="#4472c4 [3204]" strokeweight=".5pt">
+              <v:shape w14:anchorId="080F2743" id="直接箭头连接符 8" o:spid="_x0000_s1026" type="#_x0000_t32" style="position:absolute;margin-left:67.2pt;margin-top:10.7pt;width:.45pt;height:14.05pt;z-index:251746304;visibility:visible;mso-wrap-style:square;mso-wrap-distance-left:9pt;mso-wrap-distance-top:0;mso-wrap-distance-right:9pt;mso-wrap-distance-bottom:0;mso-position-horizontal:absolute;mso-position-horizontal-relative:text;mso-position-vertical:absolute;mso-position-vertical-relative:text" o:gfxdata="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" strokecolor="#4472c4 [3204]" strokeweight=".5pt">
                 <v:stroke endarrow="block" joinstyle="miter"/>
               </v:shape>
             </w:pict>
@@ -4308,7 +4279,7 @@
           </mc:Choice>
           <mc:Fallback>
             <w:pict>
-              <v:shape w14:anchorId="1282F325" id="直接箭头连接符 10" o:spid="_x0000_s1026" type="#_x0000_t32" style="position:absolute;margin-left:69.15pt;margin-top:6.2pt;width:.35pt;height:15.75pt;z-index:251748352;visibility:visible;mso-wrap-style:square;mso-wrap-distance-left:9pt;mso-wrap-distance-top:0;mso-wrap-distance-right:9pt;mso-wrap-distance-bottom:0;mso-position-horizontal:absolute;mso-position-horizontal-relative:text;mso-position-vertical:absolute;mso-position-vertical-relative:text" o:gfxdata="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" strokecolor="#4472c4 [3204]" strokeweight=".5pt">
+              <v:shape w14:anchorId="21021460" id="直接箭头连接符 10" o:spid="_x0000_s1026" type="#_x0000_t32" style="position:absolute;margin-left:69.15pt;margin-top:6.2pt;width:.35pt;height:15.75pt;z-index:251748352;visibility:visible;mso-wrap-style:square;mso-wrap-distance-left:9pt;mso-wrap-distance-top:0;mso-wrap-distance-right:9pt;mso-wrap-distance-bottom:0;mso-position-horizontal:absolute;mso-position-horizontal-relative:text;mso-position-vertical:absolute;mso-position-vertical-relative:text" o:gfxdata="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" strokecolor="#4472c4 [3204]" strokeweight=".5pt">
                 <v:stroke endarrow="block" joinstyle="miter"/>
               </v:shape>
             </w:pict>
@@ -4518,7 +4489,7 @@
           </mc:Choice>
           <mc:Fallback>
             <w:pict>
-              <v:shape w14:anchorId="530DC19B" id="直接箭头连接符 10" o:spid="_x0000_s1026" type="#_x0000_t32" style="position:absolute;margin-left:70.05pt;margin-top:2.65pt;width:.35pt;height:15.75pt;z-index:251767808;visibility:visible;mso-wrap-style:square;mso-wrap-distance-left:9pt;mso-wrap-distance-top:0;mso-wrap-distance-right:9pt;mso-wrap-distance-bottom:0;mso-position-horizontal:absolute;mso-position-horizontal-relative:text;mso-position-vertical:absolute;mso-position-vertical-relative:text" o:gfxdata="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" strokecolor="#4472c4 [3204]" strokeweight=".5pt">
+              <v:shape w14:anchorId="57576F7D" id="直接箭头连接符 10" o:spid="_x0000_s1026" type="#_x0000_t32" style="position:absolute;margin-left:70.05pt;margin-top:2.65pt;width:.35pt;height:15.75pt;z-index:251767808;visibility:visible;mso-wrap-style:square;mso-wrap-distance-left:9pt;mso-wrap-distance-top:0;mso-wrap-distance-right:9pt;mso-wrap-distance-bottom:0;mso-position-horizontal:absolute;mso-position-horizontal-relative:text;mso-position-vertical:absolute;mso-position-vertical-relative:text" o:gfxdata="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" strokecolor="#4472c4 [3204]" strokeweight=".5pt">
                 <v:stroke endarrow="block" joinstyle="miter"/>
               </v:shape>
             </w:pict>
@@ -4717,7 +4688,7 @@
           </mc:Choice>
           <mc:Fallback>
             <w:pict>
-              <v:shape w14:anchorId="22AA203C" id="直接箭头连接符 10" o:spid="_x0000_s1026" type="#_x0000_t32" style="position:absolute;margin-left:69.8pt;margin-top:18.35pt;width:.35pt;height:15.75pt;z-index:251771904;visibility:visible;mso-wrap-style:square;mso-wrap-distance-left:9pt;mso-wrap-distance-top:0;mso-wrap-distance-right:9pt;mso-wrap-distance-bottom:0;mso-position-horizontal:absolute;mso-position-horizontal-relative:text;mso-position-vertical:absolute;mso-position-vertical-relative:text" o:gfxdata="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" strokecolor="#4472c4 [3204]" strokeweight=".5pt">
+              <v:shape w14:anchorId="2EF7C31F" id="直接箭头连接符 10" o:spid="_x0000_s1026" type="#_x0000_t32" style="position:absolute;margin-left:69.8pt;margin-top:18.35pt;width:.35pt;height:15.75pt;z-index:251771904;visibility:visible;mso-wrap-style:square;mso-wrap-distance-left:9pt;mso-wrap-distance-top:0;mso-wrap-distance-right:9pt;mso-wrap-distance-bottom:0;mso-position-horizontal:absolute;mso-position-horizontal-relative:text;mso-position-vertical:absolute;mso-position-vertical-relative:text" o:gfxdata="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" strokecolor="#4472c4 [3204]" strokeweight=".5pt">
                 <v:stroke endarrow="block" joinstyle="miter"/>
               </v:shape>
             </w:pict>
@@ -4966,7 +4937,7 @@
           </mc:Choice>
           <mc:Fallback>
             <w:pict>
-              <v:shape w14:anchorId="7B2F1380" id="直接箭头连接符 10" o:spid="_x0000_s1026" type="#_x0000_t32" style="position:absolute;margin-left:69.4pt;margin-top:8.45pt;width:.35pt;height:15.75pt;z-index:251776000;visibility:visible;mso-wrap-style:square;mso-wrap-distance-left:9pt;mso-wrap-distance-top:0;mso-wrap-distance-right:9pt;mso-wrap-distance-bottom:0;mso-position-horizontal:absolute;mso-position-horizontal-relative:text;mso-position-vertical:absolute;mso-position-vertical-relative:text" o:gfxdata="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" strokecolor="#4472c4 [3204]" strokeweight=".5pt">
+              <v:shape w14:anchorId="614FF5E3" id="直接箭头连接符 10" o:spid="_x0000_s1026" type="#_x0000_t32" style="position:absolute;margin-left:69.4pt;margin-top:8.45pt;width:.35pt;height:15.75pt;z-index:251776000;visibility:visible;mso-wrap-style:square;mso-wrap-distance-left:9pt;mso-wrap-distance-top:0;mso-wrap-distance-right:9pt;mso-wrap-distance-bottom:0;mso-position-horizontal:absolute;mso-position-horizontal-relative:text;mso-position-vertical:absolute;mso-position-vertical-relative:text" o:gfxdata="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" strokecolor="#4472c4 [3204]" strokeweight=".5pt">
                 <v:stroke endarrow="block" joinstyle="miter"/>
               </v:shape>
             </w:pict>
@@ -5295,7 +5266,7 @@
           </mc:Choice>
           <mc:Fallback>
             <w:pict>
-              <v:shape w14:anchorId="123EC3E2" id="直接箭头连接符 10" o:spid="_x0000_s1026" type="#_x0000_t32" style="position:absolute;margin-left:69.9pt;margin-top:.2pt;width:.35pt;height:15.75pt;z-index:251780096;visibility:visible;mso-wrap-style:square;mso-wrap-distance-left:9pt;mso-wrap-distance-top:0;mso-wrap-distance-right:9pt;mso-wrap-distance-bottom:0;mso-position-horizontal:absolute;mso-position-horizontal-relative:text;mso-position-vertical:absolute;mso-position-vertical-relative:text" o:gfxdata="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" strokecolor="#4472c4 [3204]" strokeweight=".5pt">
+              <v:shape w14:anchorId="52A43C25" id="直接箭头连接符 10" o:spid="_x0000_s1026" type="#_x0000_t32" style="position:absolute;margin-left:69.9pt;margin-top:.2pt;width:.35pt;height:15.75pt;z-index:251780096;visibility:visible;mso-wrap-style:square;mso-wrap-distance-left:9pt;mso-wrap-distance-top:0;mso-wrap-distance-right:9pt;mso-wrap-distance-bottom:0;mso-position-horizontal:absolute;mso-position-horizontal-relative:text;mso-position-vertical:absolute;mso-position-vertical-relative:text" o:gfxdata="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" strokecolor="#4472c4 [3204]" strokeweight=".5pt">
                 <v:stroke endarrow="block" joinstyle="miter"/>
               </v:shape>
             </w:pict>
@@ -5375,7 +5346,7 @@
           </mc:Choice>
           <mc:Fallback>
             <w:pict>
-              <v:shape w14:anchorId="57120A08" id="直接箭头连接符 10" o:spid="_x0000_s1026" type="#_x0000_t32" style="position:absolute;margin-left:68.85pt;margin-top:17.6pt;width:.35pt;height:15.75pt;z-index:251784192;visibility:visible;mso-wrap-style:square;mso-wrap-distance-left:9pt;mso-wrap-distance-top:0;mso-wrap-distance-right:9pt;mso-wrap-distance-bottom:0;mso-position-horizontal:absolute;mso-position-horizontal-relative:text;mso-position-vertical:absolute;mso-position-vertical-relative:text" o:gfxdata="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" strokecolor="#4472c4 [3204]" strokeweight=".5pt">
+              <v:shape w14:anchorId="6A894633" id="直接箭头连接符 10" o:spid="_x0000_s1026" type="#_x0000_t32" style="position:absolute;margin-left:68.85pt;margin-top:17.6pt;width:.35pt;height:15.75pt;z-index:251784192;visibility:visible;mso-wrap-style:square;mso-wrap-distance-left:9pt;mso-wrap-distance-top:0;mso-wrap-distance-right:9pt;mso-wrap-distance-bottom:0;mso-position-horizontal:absolute;mso-position-horizontal-relative:text;mso-position-vertical:absolute;mso-position-vertical-relative:text" o:gfxdata="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" strokecolor="#4472c4 [3204]" strokeweight=".5pt">
                 <v:stroke endarrow="block" joinstyle="miter"/>
               </v:shape>
             </w:pict>
@@ -5642,7 +5613,7 @@
           </mc:Choice>
           <mc:Fallback>
             <w:pict>
-              <v:shape w14:anchorId="4B9A1E65" id="连接符: 肘形 19" o:spid="_x0000_s1026" type="#_x0000_t34" style="position:absolute;margin-left:110.5pt;margin-top:17.7pt;width:12.7pt;height:616.2pt;flip:y;z-index:251807744;visibility:visible;mso-wrap-style:square;mso-width-percent:0;mso-height-percent:0;mso-wrap-distance-left:9pt;mso-wrap-distance-top:0;mso-wrap-distance-right:9pt;mso-wrap-distance-bottom:0;mso-position-horizontal:absolute;mso-position-horizontal-relative:text;mso-position-vertical:absolute;mso-position-vertical-relative:text;mso-width-percent:0;mso-height-percent:0;mso-width-relative:margin;mso-height-relative:margin" o:gfxdata="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" adj="384566" strokecolor="#4472c4 [3204]" strokeweight=".5pt">
+              <v:shape w14:anchorId="72C6DF10" id="连接符: 肘形 19" o:spid="_x0000_s1026" type="#_x0000_t34" style="position:absolute;margin-left:110.5pt;margin-top:17.7pt;width:12.7pt;height:616.2pt;flip:y;z-index:251807744;visibility:visible;mso-wrap-style:square;mso-width-percent:0;mso-height-percent:0;mso-wrap-distance-left:9pt;mso-wrap-distance-top:0;mso-wrap-distance-right:9pt;mso-wrap-distance-bottom:0;mso-position-horizontal:absolute;mso-position-horizontal-relative:text;mso-position-vertical:absolute;mso-position-vertical-relative:text;mso-width-percent:0;mso-height-percent:0;mso-width-relative:margin;mso-height-relative:margin" o:gfxdata="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" adj="384566" strokecolor="#4472c4 [3204]" strokeweight=".5pt">
                 <v:stroke endarrow="block"/>
               </v:shape>
             </w:pict>
@@ -5855,7 +5826,7 @@
           </mc:Choice>
           <mc:Fallback>
             <w:pict>
-              <v:shape w14:anchorId="54CD04D1" id="直接箭头连接符 6" o:spid="_x0000_s1026" type="#_x0000_t32" style="position:absolute;margin-left:67.3pt;margin-top:14.4pt;width:.45pt;height:23.9pt;z-index:251790336;visibility:visible;mso-wrap-style:square;mso-wrap-distance-left:9pt;mso-wrap-distance-top:0;mso-wrap-distance-right:9pt;mso-wrap-distance-bottom:0;mso-position-horizontal:absolute;mso-position-horizontal-relative:text;mso-position-vertical:absolute;mso-position-vertical-relative:text" o:gfxdata="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" strokecolor="#4472c4 [3204]" strokeweight=".5pt">
+              <v:shape w14:anchorId="58502F25" id="直接箭头连接符 6" o:spid="_x0000_s1026" type="#_x0000_t32" style="position:absolute;margin-left:67.3pt;margin-top:14.4pt;width:.45pt;height:23.9pt;z-index:251790336;visibility:visible;mso-wrap-style:square;mso-wrap-distance-left:9pt;mso-wrap-distance-top:0;mso-wrap-distance-right:9pt;mso-wrap-distance-bottom:0;mso-position-horizontal:absolute;mso-position-horizontal-relative:text;mso-position-vertical:absolute;mso-position-vertical-relative:text" o:gfxdata="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" strokecolor="#4472c4 [3204]" strokeweight=".5pt">
                 <v:stroke endarrow="block" joinstyle="miter"/>
               </v:shape>
             </w:pict>
@@ -6064,7 +6035,7 @@
           </mc:Choice>
           <mc:Fallback>
             <w:pict>
-              <v:shape w14:anchorId="2F352854" id="直接箭头连接符 8" o:spid="_x0000_s1026" type="#_x0000_t32" style="position:absolute;margin-left:67.2pt;margin-top:21.3pt;width:.45pt;height:14.05pt;z-index:251792384;visibility:visible;mso-wrap-style:square;mso-wrap-distance-left:9pt;mso-wrap-distance-top:0;mso-wrap-distance-right:9pt;mso-wrap-distance-bottom:0;mso-position-horizontal:absolute;mso-position-horizontal-relative:text;mso-position-vertical:absolute;mso-position-vertical-relative:text" o:gfxdata="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" strokecolor="#4472c4 [3204]" strokeweight=".5pt">
+              <v:shape w14:anchorId="568CF37A" id="直接箭头连接符 8" o:spid="_x0000_s1026" type="#_x0000_t32" style="position:absolute;margin-left:67.2pt;margin-top:21.3pt;width:.45pt;height:14.05pt;z-index:251792384;visibility:visible;mso-wrap-style:square;mso-wrap-distance-left:9pt;mso-wrap-distance-top:0;mso-wrap-distance-right:9pt;mso-wrap-distance-bottom:0;mso-position-horizontal:absolute;mso-position-horizontal-relative:text;mso-position-vertical:absolute;mso-position-vertical-relative:text" o:gfxdata="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" strokecolor="#4472c4 [3204]" strokeweight=".5pt">
                 <v:stroke endarrow="block" joinstyle="miter"/>
               </v:shape>
             </w:pict>
@@ -6270,7 +6241,7 @@
           </mc:Choice>
           <mc:Fallback>
             <w:pict>
-              <v:shape w14:anchorId="68EABF77" id="直接箭头连接符 8" o:spid="_x0000_s1026" type="#_x0000_t32" style="position:absolute;margin-left:66.7pt;margin-top:17.35pt;width:.45pt;height:14.05pt;z-index:251794432;visibility:visible;mso-wrap-style:square;mso-wrap-distance-left:9pt;mso-wrap-distance-top:0;mso-wrap-distance-right:9pt;mso-wrap-distance-bottom:0;mso-position-horizontal:absolute;mso-position-horizontal-relative:text;mso-position-vertical:absolute;mso-position-vertical-relative:text" o:gfxdata="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" strokecolor="#4472c4 [3204]" strokeweight=".5pt">
+              <v:shape w14:anchorId="4AF74A24" id="直接箭头连接符 8" o:spid="_x0000_s1026" type="#_x0000_t32" style="position:absolute;margin-left:66.7pt;margin-top:17.35pt;width:.45pt;height:14.05pt;z-index:251794432;visibility:visible;mso-wrap-style:square;mso-wrap-distance-left:9pt;mso-wrap-distance-top:0;mso-wrap-distance-right:9pt;mso-wrap-distance-bottom:0;mso-position-horizontal:absolute;mso-position-horizontal-relative:text;mso-position-vertical:absolute;mso-position-vertical-relative:text" o:gfxdata="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" strokecolor="#4472c4 [3204]" strokeweight=".5pt">
                 <v:stroke endarrow="block" joinstyle="miter"/>
               </v:shape>
             </w:pict>
@@ -6490,7 +6461,7 @@
           </mc:Choice>
           <mc:Fallback>
             <w:pict>
-              <v:shape w14:anchorId="29684DF1" id="直接箭头连接符 10" o:spid="_x0000_s1026" type="#_x0000_t32" style="position:absolute;margin-left:69.15pt;margin-top:6.2pt;width:.35pt;height:15.75pt;z-index:251796480;visibility:visible;mso-wrap-style:square;mso-wrap-distance-left:9pt;mso-wrap-distance-top:0;mso-wrap-distance-right:9pt;mso-wrap-distance-bottom:0;mso-position-horizontal:absolute;mso-position-horizontal-relative:text;mso-position-vertical:absolute;mso-position-vertical-relative:text" o:gfxdata="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" strokecolor="#4472c4 [3204]" strokeweight=".5pt">
+              <v:shape w14:anchorId="467B6BBE" id="直接箭头连接符 10" o:spid="_x0000_s1026" type="#_x0000_t32" style="position:absolute;margin-left:69.15pt;margin-top:6.2pt;width:.35pt;height:15.75pt;z-index:251796480;visibility:visible;mso-wrap-style:square;mso-wrap-distance-left:9pt;mso-wrap-distance-top:0;mso-wrap-distance-right:9pt;mso-wrap-distance-bottom:0;mso-position-horizontal:absolute;mso-position-horizontal-relative:text;mso-position-vertical:absolute;mso-position-vertical-relative:text" o:gfxdata="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" strokecolor="#4472c4 [3204]" strokeweight=".5pt">
                 <v:stroke endarrow="block" joinstyle="miter"/>
               </v:shape>
             </w:pict>
@@ -6825,7 +6796,7 @@
           </mc:Choice>
           <mc:Fallback>
             <w:pict>
-              <v:shape w14:anchorId="7CE4BB78" id="直接箭头连接符 10" o:spid="_x0000_s1026" type="#_x0000_t32" style="position:absolute;margin-left:69pt;margin-top:.65pt;width:.35pt;height:15.75pt;z-index:251809792;visibility:visible;mso-wrap-style:square;mso-wrap-distance-left:9pt;mso-wrap-distance-top:0;mso-wrap-distance-right:9pt;mso-wrap-distance-bottom:0;mso-position-horizontal:absolute;mso-position-horizontal-relative:text;mso-position-vertical:absolute;mso-position-vertical-relative:text" o:gfxdata="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" strokecolor="#4472c4 [3204]" strokeweight=".5pt">
+              <v:shape w14:anchorId="53B621CE" id="直接箭头连接符 10" o:spid="_x0000_s1026" type="#_x0000_t32" style="position:absolute;margin-left:69pt;margin-top:.65pt;width:.35pt;height:15.75pt;z-index:251809792;visibility:visible;mso-wrap-style:square;mso-wrap-distance-left:9pt;mso-wrap-distance-top:0;mso-wrap-distance-right:9pt;mso-wrap-distance-bottom:0;mso-position-horizontal:absolute;mso-position-horizontal-relative:text;mso-position-vertical:absolute;mso-position-vertical-relative:text" o:gfxdata="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" strokecolor="#4472c4 [3204]" strokeweight=".5pt">
                 <v:stroke endarrow="block" joinstyle="miter"/>
               </v:shape>
             </w:pict>
@@ -7032,7 +7003,7 @@
           </mc:Choice>
           <mc:Fallback>
             <w:pict>
-              <v:shape w14:anchorId="42ADBAA8" id="直接箭头连接符 10" o:spid="_x0000_s1026" type="#_x0000_t32" style="position:absolute;margin-left:68.9pt;margin-top:.3pt;width:.35pt;height:15.75pt;z-index:251811840;visibility:visible;mso-wrap-style:square;mso-wrap-distance-left:9pt;mso-wrap-distance-top:0;mso-wrap-distance-right:9pt;mso-wrap-distance-bottom:0;mso-position-horizontal:absolute;mso-position-horizontal-relative:text;mso-position-vertical:absolute;mso-position-vertical-relative:text" o:gfxdata="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" strokecolor="#4472c4 [3204]" strokeweight=".5pt">
+              <v:shape w14:anchorId="4BE95515" id="直接箭头连接符 10" o:spid="_x0000_s1026" type="#_x0000_t32" style="position:absolute;margin-left:68.9pt;margin-top:.3pt;width:.35pt;height:15.75pt;z-index:251811840;visibility:visible;mso-wrap-style:square;mso-wrap-distance-left:9pt;mso-wrap-distance-top:0;mso-wrap-distance-right:9pt;mso-wrap-distance-bottom:0;mso-position-horizontal:absolute;mso-position-horizontal-relative:text;mso-position-vertical:absolute;mso-position-vertical-relative:text" o:gfxdata="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" strokecolor="#4472c4 [3204]" strokeweight=".5pt">
                 <v:stroke endarrow="block" joinstyle="miter"/>
               </v:shape>
             </w:pict>
@@ -7227,7 +7198,7 @@
           </mc:Choice>
           <mc:Fallback>
             <w:pict>
-              <v:shape w14:anchorId="1972F0E9" id="直接箭头连接符 15" o:spid="_x0000_s1026" type="#_x0000_t32" style="position:absolute;margin-left:139.8pt;margin-top:19.4pt;width:63.1pt;height:.45pt;flip:y;z-index:251803648;visibility:visible;mso-wrap-style:square;mso-wrap-distance-left:9pt;mso-wrap-distance-top:0;mso-wrap-distance-right:9pt;mso-wrap-distance-bottom:0;mso-position-horizontal:absolute;mso-position-horizontal-relative:text;mso-position-vertical:absolute;mso-position-vertical-relative:text" o:gfxdata="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" strokecolor="#4472c4 [3204]" strokeweight=".5pt">
+              <v:shape w14:anchorId="3BB2B472" id="直接箭头连接符 15" o:spid="_x0000_s1026" type="#_x0000_t32" style="position:absolute;margin-left:139.8pt;margin-top:19.4pt;width:63.1pt;height:.45pt;flip:y;z-index:251803648;visibility:visible;mso-wrap-style:square;mso-wrap-distance-left:9pt;mso-wrap-distance-top:0;mso-wrap-distance-right:9pt;mso-wrap-distance-bottom:0;mso-position-horizontal:absolute;mso-position-horizontal-relative:text;mso-position-vertical:absolute;mso-position-vertical-relative:text" o:gfxdata="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" strokecolor="#4472c4 [3204]" strokeweight=".5pt">
                 <v:stroke endarrow="block" joinstyle="miter"/>
               </v:shape>
             </w:pict>
@@ -7444,7 +7415,7 @@
           </mc:Choice>
           <mc:Fallback>
             <w:pict>
-              <v:shape w14:anchorId="4B50019A" id="直接箭头连接符 18" o:spid="_x0000_s1026" type="#_x0000_t32" style="position:absolute;margin-left:69.8pt;margin-top:4.8pt;width:.45pt;height:46.75pt;z-index:251812864;visibility:visible;mso-wrap-style:square;mso-wrap-distance-left:9pt;mso-wrap-distance-top:0;mso-wrap-distance-right:9pt;mso-wrap-distance-bottom:0;mso-position-horizontal:absolute;mso-position-horizontal-relative:text;mso-position-vertical:absolute;mso-position-vertical-relative:text" o:gfxdata="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" strokecolor="#4472c4 [3204]" strokeweight=".5pt">
+              <v:shape w14:anchorId="6DA04562" id="直接箭头连接符 18" o:spid="_x0000_s1026" type="#_x0000_t32" style="position:absolute;margin-left:69.8pt;margin-top:4.8pt;width:.45pt;height:46.75pt;z-index:251812864;visibility:visible;mso-wrap-style:square;mso-wrap-distance-left:9pt;mso-wrap-distance-top:0;mso-wrap-distance-right:9pt;mso-wrap-distance-bottom:0;mso-position-horizontal:absolute;mso-position-horizontal-relative:text;mso-position-vertical:absolute;mso-position-vertical-relative:text" o:gfxdata="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" strokecolor="#4472c4 [3204]" strokeweight=".5pt">
                 <v:stroke endarrow="block" joinstyle="miter"/>
               </v:shape>
             </w:pict>
@@ -8163,7 +8134,7 @@
           </mc:Choice>
           <mc:Fallback>
             <w:pict>
-              <v:shape w14:anchorId="2384BF4E" id="直接箭头连接符 15" o:spid="_x0000_s1026" type="#_x0000_t32" style="position:absolute;margin-left:140.15pt;margin-top:14.7pt;width:63.1pt;height:.45pt;flip:y;z-index:251798528;visibility:visible;mso-wrap-style:square;mso-wrap-distance-left:9pt;mso-wrap-distance-top:0;mso-wrap-distance-right:9pt;mso-wrap-distance-bottom:0;mso-position-horizontal:absolute;mso-position-horizontal-relative:text;mso-position-vertical:absolute;mso-position-vertical-relative:text" o:gfxdata="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" strokecolor="#4472c4 [3204]" strokeweight=".5pt">
+              <v:shape w14:anchorId="05E5750A" id="直接箭头连接符 15" o:spid="_x0000_s1026" type="#_x0000_t32" style="position:absolute;margin-left:140.15pt;margin-top:14.7pt;width:63.1pt;height:.45pt;flip:y;z-index:251798528;visibility:visible;mso-wrap-style:square;mso-wrap-distance-left:9pt;mso-wrap-distance-top:0;mso-wrap-distance-right:9pt;mso-wrap-distance-bottom:0;mso-position-horizontal:absolute;mso-position-horizontal-relative:text;mso-position-vertical:absolute;mso-position-vertical-relative:text" o:gfxdata="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" strokecolor="#4472c4 [3204]" strokeweight=".5pt">
                 <v:stroke endarrow="block" joinstyle="miter"/>
               </v:shape>
             </w:pict>
@@ -8402,7 +8373,7 @@
           </mc:Choice>
           <mc:Fallback>
             <w:pict>
-              <v:shape w14:anchorId="3A24E324" id="直接箭头连接符 18" o:spid="_x0000_s1026" type="#_x0000_t32" style="position:absolute;margin-left:70.05pt;margin-top:.5pt;width:.45pt;height:46.75pt;z-index:251806720;visibility:visible;mso-wrap-style:square;mso-wrap-distance-left:9pt;mso-wrap-distance-top:0;mso-wrap-distance-right:9pt;mso-wrap-distance-bottom:0;mso-position-horizontal:absolute;mso-position-horizontal-relative:text;mso-position-vertical:absolute;mso-position-vertical-relative:text" o:gfxdata="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" strokecolor="#4472c4 [3204]" strokeweight=".5pt">
+              <v:shape w14:anchorId="7A115F4F" id="直接箭头连接符 18" o:spid="_x0000_s1026" type="#_x0000_t32" style="position:absolute;margin-left:70.05pt;margin-top:.5pt;width:.45pt;height:46.75pt;z-index:251806720;visibility:visible;mso-wrap-style:square;mso-wrap-distance-left:9pt;mso-wrap-distance-top:0;mso-wrap-distance-right:9pt;mso-wrap-distance-bottom:0;mso-position-horizontal:absolute;mso-position-horizontal-relative:text;mso-position-vertical:absolute;mso-position-vertical-relative:text" o:gfxdata="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" strokecolor="#4472c4 [3204]" strokeweight=".5pt">
                 <v:stroke endarrow="block" joinstyle="miter"/>
               </v:shape>
             </w:pict>
@@ -8978,7 +8949,7 @@
           </mc:Choice>
           <mc:Fallback>
             <w:pict>
-              <v:shape w14:anchorId="4342CF61" id="直接箭头连接符 15" o:spid="_x0000_s1026" type="#_x0000_t32" style="position:absolute;margin-left:156.65pt;margin-top:19.45pt;width:63.1pt;height:.45pt;flip:y;z-index:251815936;visibility:visible;mso-wrap-style:square;mso-wrap-distance-left:9pt;mso-wrap-distance-top:0;mso-wrap-distance-right:9pt;mso-wrap-distance-bottom:0;mso-position-horizontal:absolute;mso-position-horizontal-relative:text;mso-position-vertical:absolute;mso-position-vertical-relative:text" o:gfxdata="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" strokecolor="#4472c4 [3204]" strokeweight=".5pt">
+              <v:shape w14:anchorId="797B2956" id="直接箭头连接符 15" o:spid="_x0000_s1026" type="#_x0000_t32" style="position:absolute;margin-left:156.65pt;margin-top:19.45pt;width:63.1pt;height:.45pt;flip:y;z-index:251815936;visibility:visible;mso-wrap-style:square;mso-wrap-distance-left:9pt;mso-wrap-distance-top:0;mso-wrap-distance-right:9pt;mso-wrap-distance-bottom:0;mso-position-horizontal:absolute;mso-position-horizontal-relative:text;mso-position-vertical:absolute;mso-position-vertical-relative:text" o:gfxdata="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" strokecolor="#4472c4 [3204]" strokeweight=".5pt">
                 <v:stroke endarrow="block" joinstyle="miter"/>
               </v:shape>
             </w:pict>
@@ -9067,7 +9038,7 @@
           </mc:Choice>
           <mc:Fallback>
             <w:pict>
-              <v:shape w14:anchorId="4578AD42" id="直接箭头连接符 18" o:spid="_x0000_s1026" type="#_x0000_t32" style="position:absolute;margin-left:72.5pt;margin-top:13.45pt;width:.45pt;height:46.75pt;z-index:251817984;visibility:visible;mso-wrap-style:square;mso-wrap-distance-left:9pt;mso-wrap-distance-top:0;mso-wrap-distance-right:9pt;mso-wrap-distance-bottom:0;mso-position-horizontal:absolute;mso-position-horizontal-relative:text;mso-position-vertical:absolute;mso-position-vertical-relative:text" o:gfxdata="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" strokecolor="#4472c4 [3204]" strokeweight=".5pt">
+              <v:shape w14:anchorId="3638A0B2" id="直接箭头连接符 18" o:spid="_x0000_s1026" type="#_x0000_t32" style="position:absolute;margin-left:72.5pt;margin-top:13.45pt;width:.45pt;height:46.75pt;z-index:251817984;visibility:visible;mso-wrap-style:square;mso-wrap-distance-left:9pt;mso-wrap-distance-top:0;mso-wrap-distance-right:9pt;mso-wrap-distance-bottom:0;mso-position-horizontal:absolute;mso-position-horizontal-relative:text;mso-position-vertical:absolute;mso-position-vertical-relative:text" o:gfxdata="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" strokecolor="#4472c4 [3204]" strokeweight=".5pt">
                 <v:stroke endarrow="block" joinstyle="miter"/>
               </v:shape>
             </w:pict>
@@ -9489,16 +9460,357 @@
         <w:spacing w:line="259" w:lineRule="auto"/>
         <w:jc w:val="both"/>
         <w:rPr>
+          <w:rFonts w:eastAsia="等线"/>
+          <w:lang w:eastAsia="zh-CN"/>
+        </w:rPr>
+      </w:pPr>
+      <w:r>
+        <w:rPr>
+          <w:rFonts w:eastAsia="等线" w:hint="eastAsia"/>
+          <w:noProof/>
+          <w:lang w:eastAsia="zh-CN"/>
+        </w:rPr>
+        <w:lastRenderedPageBreak/>
+        <w:drawing>
+          <wp:inline distT="0" distB="0" distL="0" distR="0" wp14:anchorId="4D39C4AE" wp14:editId="4CEE90E7">
+            <wp:extent cx="1888534" cy="2520000"/>
+            <wp:effectExtent l="0" t="0" r="0" b="0"/>
+            <wp:docPr id="903207765" name="图片 26"/>
+            <wp:cNvGraphicFramePr>
+              <a:graphicFrameLocks xmlns:a="http://schemas.openxmlformats.org/drawingml/2006/main" noChangeAspect="1"/>
+            </wp:cNvGraphicFramePr>
+            <a:graphic xmlns:a="http://schemas.openxmlformats.org/drawingml/2006/main">
+              <a:graphicData uri="http://schemas.openxmlformats.org/drawingml/2006/picture">
+                <pic:pic xmlns:pic="http://schemas.openxmlformats.org/drawingml/2006/picture">
+                  <pic:nvPicPr>
+                    <pic:cNvPr id="0" name="Picture 8"/>
+                    <pic:cNvPicPr>
+                      <a:picLocks noChangeAspect="1" noChangeArrowheads="1"/>
+                    </pic:cNvPicPr>
+                  </pic:nvPicPr>
+                  <pic:blipFill>
+                    <a:blip r:embed="rId17" cstate="print">
+                      <a:extLst>
+                        <a:ext uri="{28A0092B-C50C-407E-A947-70E740481C1C}">
+                          <a14:useLocalDpi xmlns:a14="http://schemas.microsoft.com/office/drawing/2010/main" val="0"/>
+                        </a:ext>
+                      </a:extLst>
+                    </a:blip>
+                    <a:srcRect/>
+                    <a:stretch>
+                      <a:fillRect/>
+                    </a:stretch>
+                  </pic:blipFill>
+                  <pic:spPr bwMode="auto">
+                    <a:xfrm>
+                      <a:off x="0" y="0"/>
+                      <a:ext cx="1888534" cy="2520000"/>
+                    </a:xfrm>
+                    <a:prstGeom prst="rect">
+                      <a:avLst/>
+                    </a:prstGeom>
+                    <a:noFill/>
+                    <a:ln>
+                      <a:noFill/>
+                    </a:ln>
+                  </pic:spPr>
+                </pic:pic>
+              </a:graphicData>
+            </a:graphic>
+          </wp:inline>
+        </w:drawing>
+      </w:r>
+      <w:r>
+        <w:rPr>
+          <w:rFonts w:eastAsia="等线" w:hint="eastAsia"/>
+          <w:noProof/>
+          <w:lang w:eastAsia="zh-CN"/>
+        </w:rPr>
+        <w:drawing>
+          <wp:inline distT="0" distB="0" distL="0" distR="0" wp14:anchorId="49DE83F1" wp14:editId="69967AB6">
+            <wp:extent cx="1888534" cy="2520000"/>
+            <wp:effectExtent l="0" t="0" r="0" b="0"/>
+            <wp:docPr id="270841651" name="图片 24"/>
+            <wp:cNvGraphicFramePr>
+              <a:graphicFrameLocks xmlns:a="http://schemas.openxmlformats.org/drawingml/2006/main" noChangeAspect="1"/>
+            </wp:cNvGraphicFramePr>
+            <a:graphic xmlns:a="http://schemas.openxmlformats.org/drawingml/2006/main">
+              <a:graphicData uri="http://schemas.openxmlformats.org/drawingml/2006/picture">
+                <pic:pic xmlns:pic="http://schemas.openxmlformats.org/drawingml/2006/picture">
+                  <pic:nvPicPr>
+                    <pic:cNvPr id="0" name="Picture 6"/>
+                    <pic:cNvPicPr>
+                      <a:picLocks noChangeAspect="1" noChangeArrowheads="1"/>
+                    </pic:cNvPicPr>
+                  </pic:nvPicPr>
+                  <pic:blipFill>
+                    <a:blip r:embed="rId18" cstate="print">
+                      <a:extLst>
+                        <a:ext uri="{28A0092B-C50C-407E-A947-70E740481C1C}">
+                          <a14:useLocalDpi xmlns:a14="http://schemas.microsoft.com/office/drawing/2010/main" val="0"/>
+                        </a:ext>
+                      </a:extLst>
+                    </a:blip>
+                    <a:srcRect/>
+                    <a:stretch>
+                      <a:fillRect/>
+                    </a:stretch>
+                  </pic:blipFill>
+                  <pic:spPr bwMode="auto">
+                    <a:xfrm>
+                      <a:off x="0" y="0"/>
+                      <a:ext cx="1888534" cy="2520000"/>
+                    </a:xfrm>
+                    <a:prstGeom prst="rect">
+                      <a:avLst/>
+                    </a:prstGeom>
+                    <a:noFill/>
+                    <a:ln>
+                      <a:noFill/>
+                    </a:ln>
+                  </pic:spPr>
+                </pic:pic>
+              </a:graphicData>
+            </a:graphic>
+          </wp:inline>
+        </w:drawing>
+      </w:r>
+      <w:r>
+        <w:rPr>
+          <w:rFonts w:eastAsia="等线" w:hint="eastAsia"/>
+          <w:noProof/>
+          <w:lang w:eastAsia="zh-CN"/>
+        </w:rPr>
+        <w:drawing>
+          <wp:inline distT="0" distB="0" distL="0" distR="0" wp14:anchorId="3971E16E" wp14:editId="5E1BBFB5">
+            <wp:extent cx="1888534" cy="2520000"/>
+            <wp:effectExtent l="0" t="0" r="0" b="0"/>
+            <wp:docPr id="2081756834" name="图片 25"/>
+            <wp:cNvGraphicFramePr>
+              <a:graphicFrameLocks xmlns:a="http://schemas.openxmlformats.org/drawingml/2006/main" noChangeAspect="1"/>
+            </wp:cNvGraphicFramePr>
+            <a:graphic xmlns:a="http://schemas.openxmlformats.org/drawingml/2006/main">
+              <a:graphicData uri="http://schemas.openxmlformats.org/drawingml/2006/picture">
+                <pic:pic xmlns:pic="http://schemas.openxmlformats.org/drawingml/2006/picture">
+                  <pic:nvPicPr>
+                    <pic:cNvPr id="0" name="Picture 7"/>
+                    <pic:cNvPicPr>
+                      <a:picLocks noChangeAspect="1" noChangeArrowheads="1"/>
+                    </pic:cNvPicPr>
+                  </pic:nvPicPr>
+                  <pic:blipFill>
+                    <a:blip r:embed="rId19" cstate="print">
+                      <a:extLst>
+                        <a:ext uri="{28A0092B-C50C-407E-A947-70E740481C1C}">
+                          <a14:useLocalDpi xmlns:a14="http://schemas.microsoft.com/office/drawing/2010/main" val="0"/>
+                        </a:ext>
+                      </a:extLst>
+                    </a:blip>
+                    <a:srcRect/>
+                    <a:stretch>
+                      <a:fillRect/>
+                    </a:stretch>
+                  </pic:blipFill>
+                  <pic:spPr bwMode="auto">
+                    <a:xfrm>
+                      <a:off x="0" y="0"/>
+                      <a:ext cx="1888534" cy="2520000"/>
+                    </a:xfrm>
+                    <a:prstGeom prst="rect">
+                      <a:avLst/>
+                    </a:prstGeom>
+                    <a:noFill/>
+                    <a:ln>
+                      <a:noFill/>
+                    </a:ln>
+                  </pic:spPr>
+                </pic:pic>
+              </a:graphicData>
+            </a:graphic>
+          </wp:inline>
+        </w:drawing>
+      </w:r>
+    </w:p>
+    <w:p>
+      <w:pPr>
+        <w:spacing w:line="259" w:lineRule="auto"/>
+        <w:jc w:val="both"/>
+        <w:rPr>
           <w:rFonts w:eastAsia="等线" w:hint="eastAsia"/>
           <w:lang w:eastAsia="zh-CN"/>
         </w:rPr>
       </w:pPr>
+      <w:r>
+        <w:rPr>
+          <w:rFonts w:eastAsia="等线" w:hint="eastAsia"/>
+          <w:noProof/>
+          <w:lang w:eastAsia="zh-CN"/>
+        </w:rPr>
+        <w:drawing>
+          <wp:inline distT="0" distB="0" distL="0" distR="0" wp14:anchorId="5F0BA3B6" wp14:editId="3C88907C">
+            <wp:extent cx="3781970" cy="1800000"/>
+            <wp:effectExtent l="0" t="0" r="0" b="0"/>
+            <wp:docPr id="405878106" name="图片 27"/>
+            <wp:cNvGraphicFramePr>
+              <a:graphicFrameLocks xmlns:a="http://schemas.openxmlformats.org/drawingml/2006/main" noChangeAspect="1"/>
+            </wp:cNvGraphicFramePr>
+            <a:graphic xmlns:a="http://schemas.openxmlformats.org/drawingml/2006/main">
+              <a:graphicData uri="http://schemas.openxmlformats.org/drawingml/2006/picture">
+                <pic:pic xmlns:pic="http://schemas.openxmlformats.org/drawingml/2006/picture">
+                  <pic:nvPicPr>
+                    <pic:cNvPr id="0" name="Picture 9"/>
+                    <pic:cNvPicPr>
+                      <a:picLocks noChangeAspect="1" noChangeArrowheads="1"/>
+                    </pic:cNvPicPr>
+                  </pic:nvPicPr>
+                  <pic:blipFill>
+                    <a:blip r:embed="rId20">
+                      <a:extLst>
+                        <a:ext uri="{28A0092B-C50C-407E-A947-70E740481C1C}">
+                          <a14:useLocalDpi xmlns:a14="http://schemas.microsoft.com/office/drawing/2010/main" val="0"/>
+                        </a:ext>
+                      </a:extLst>
+                    </a:blip>
+                    <a:srcRect/>
+                    <a:stretch>
+                      <a:fillRect/>
+                    </a:stretch>
+                  </pic:blipFill>
+                  <pic:spPr bwMode="auto">
+                    <a:xfrm>
+                      <a:off x="0" y="0"/>
+                      <a:ext cx="3781970" cy="1800000"/>
+                    </a:xfrm>
+                    <a:prstGeom prst="rect">
+                      <a:avLst/>
+                    </a:prstGeom>
+                    <a:noFill/>
+                    <a:ln>
+                      <a:noFill/>
+                    </a:ln>
+                  </pic:spPr>
+                </pic:pic>
+              </a:graphicData>
+            </a:graphic>
+          </wp:inline>
+        </w:drawing>
+      </w:r>
+      <w:r>
+        <w:rPr>
+          <w:rFonts w:eastAsia="等线" w:hint="eastAsia"/>
+          <w:noProof/>
+          <w:lang w:eastAsia="zh-CN"/>
+        </w:rPr>
+        <w:drawing>
+          <wp:inline distT="0" distB="0" distL="0" distR="0" wp14:anchorId="6BCAACA4" wp14:editId="0D9D90F8">
+            <wp:extent cx="3746193" cy="1800000"/>
+            <wp:effectExtent l="0" t="0" r="6985" b="0"/>
+            <wp:docPr id="171242201" name="图片 28"/>
+            <wp:cNvGraphicFramePr>
+              <a:graphicFrameLocks xmlns:a="http://schemas.openxmlformats.org/drawingml/2006/main" noChangeAspect="1"/>
+            </wp:cNvGraphicFramePr>
+            <a:graphic xmlns:a="http://schemas.openxmlformats.org/drawingml/2006/main">
+              <a:graphicData uri="http://schemas.openxmlformats.org/drawingml/2006/picture">
+                <pic:pic xmlns:pic="http://schemas.openxmlformats.org/drawingml/2006/picture">
+                  <pic:nvPicPr>
+                    <pic:cNvPr id="0" name="Picture 10"/>
+                    <pic:cNvPicPr>
+                      <a:picLocks noChangeAspect="1" noChangeArrowheads="1"/>
+                    </pic:cNvPicPr>
+                  </pic:nvPicPr>
+                  <pic:blipFill>
+                    <a:blip r:embed="rId21">
+                      <a:extLst>
+                        <a:ext uri="{28A0092B-C50C-407E-A947-70E740481C1C}">
+                          <a14:useLocalDpi xmlns:a14="http://schemas.microsoft.com/office/drawing/2010/main" val="0"/>
+                        </a:ext>
+                      </a:extLst>
+                    </a:blip>
+                    <a:srcRect/>
+                    <a:stretch>
+                      <a:fillRect/>
+                    </a:stretch>
+                  </pic:blipFill>
+                  <pic:spPr bwMode="auto">
+                    <a:xfrm>
+                      <a:off x="0" y="0"/>
+                      <a:ext cx="3746193" cy="1800000"/>
+                    </a:xfrm>
+                    <a:prstGeom prst="rect">
+                      <a:avLst/>
+                    </a:prstGeom>
+                    <a:noFill/>
+                    <a:ln>
+                      <a:noFill/>
+                    </a:ln>
+                  </pic:spPr>
+                </pic:pic>
+              </a:graphicData>
+            </a:graphic>
+          </wp:inline>
+        </w:drawing>
+      </w:r>
+      <w:r>
+        <w:rPr>
+          <w:rFonts w:eastAsia="等线" w:hint="eastAsia"/>
+          <w:noProof/>
+          <w:lang w:eastAsia="zh-CN"/>
+        </w:rPr>
+        <w:drawing>
+          <wp:inline distT="0" distB="0" distL="0" distR="0" wp14:anchorId="5FFF663E" wp14:editId="0F412756">
+            <wp:extent cx="3892592" cy="1800000"/>
+            <wp:effectExtent l="0" t="0" r="0" b="0"/>
+            <wp:docPr id="664252482" name="图片 29"/>
+            <wp:cNvGraphicFramePr>
+              <a:graphicFrameLocks xmlns:a="http://schemas.openxmlformats.org/drawingml/2006/main" noChangeAspect="1"/>
+            </wp:cNvGraphicFramePr>
+            <a:graphic xmlns:a="http://schemas.openxmlformats.org/drawingml/2006/main">
+              <a:graphicData uri="http://schemas.openxmlformats.org/drawingml/2006/picture">
+                <pic:pic xmlns:pic="http://schemas.openxmlformats.org/drawingml/2006/picture">
+                  <pic:nvPicPr>
+                    <pic:cNvPr id="0" name="Picture 11"/>
+                    <pic:cNvPicPr>
+                      <a:picLocks noChangeAspect="1" noChangeArrowheads="1"/>
+                    </pic:cNvPicPr>
+                  </pic:nvPicPr>
+                  <pic:blipFill>
+                    <a:blip r:embed="rId22">
+                      <a:extLst>
+                        <a:ext uri="{28A0092B-C50C-407E-A947-70E740481C1C}">
+                          <a14:useLocalDpi xmlns:a14="http://schemas.microsoft.com/office/drawing/2010/main" val="0"/>
+                        </a:ext>
+                      </a:extLst>
+                    </a:blip>
+                    <a:srcRect/>
+                    <a:stretch>
+                      <a:fillRect/>
+                    </a:stretch>
+                  </pic:blipFill>
+                  <pic:spPr bwMode="auto">
+                    <a:xfrm>
+                      <a:off x="0" y="0"/>
+                      <a:ext cx="3892592" cy="1800000"/>
+                    </a:xfrm>
+                    <a:prstGeom prst="rect">
+                      <a:avLst/>
+                    </a:prstGeom>
+                    <a:noFill/>
+                    <a:ln>
+                      <a:noFill/>
+                    </a:ln>
+                  </pic:spPr>
+                </pic:pic>
+              </a:graphicData>
+            </a:graphic>
+          </wp:inline>
+        </w:drawing>
+      </w:r>
     </w:p>
     <w:sectPr>
-      <w:headerReference w:type="default" r:id="rId17"/>
-      <w:footerReference w:type="default" r:id="rId18"/>
-      <w:headerReference w:type="first" r:id="rId19"/>
-      <w:footerReference w:type="first" r:id="rId20"/>
+      <w:headerReference w:type="default" r:id="rId23"/>
+      <w:footerReference w:type="default" r:id="rId24"/>
+      <w:headerReference w:type="first" r:id="rId25"/>
+      <w:footerReference w:type="first" r:id="rId26"/>
       <w:pgSz w:w="11906" w:h="16838"/>
       <w:pgMar w:top="1440" w:right="1440" w:bottom="1440" w:left="1440" w:header="850" w:footer="708" w:gutter="0"/>
       <w:cols w:space="708"/>
@@ -9608,7 +9920,7 @@
             </mc:Choice>
             <mc:Fallback>
               <w:pict>
-                <v:line w14:anchorId="6A578D0C" id="Straight Connector 4" o:spid="_x0000_s1026" style="position:absolute;z-index:251657728;visibility:visible;mso-wrap-style:square;mso-wrap-distance-left:9pt;mso-wrap-distance-top:0;mso-wrap-distance-right:9pt;mso-wrap-distance-bottom:0;mso-position-horizontal:absolute;mso-position-horizontal-relative:text;mso-position-vertical:absolute;mso-position-vertical-relative:text" from="-.75pt,-10.2pt" to="454.5pt,-10.2pt" o:gfxdata="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" strokecolor="#4472c4 [3204]" strokeweight=".5pt">
+                <v:line w14:anchorId="227D656F" id="Straight Connector 4" o:spid="_x0000_s1026" style="position:absolute;z-index:251657728;visibility:visible;mso-wrap-style:square;mso-wrap-distance-left:9pt;mso-wrap-distance-top:0;mso-wrap-distance-right:9pt;mso-wrap-distance-bottom:0;mso-position-horizontal:absolute;mso-position-horizontal-relative:text;mso-position-vertical:absolute;mso-position-vertical-relative:text" from="-.75pt,-10.2pt" to="454.5pt,-10.2pt" o:gfxdata="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" strokecolor="#4472c4 [3204]" strokeweight=".5pt">
                   <v:stroke joinstyle="miter"/>
                 </v:line>
               </w:pict>
@@ -9643,7 +9955,6 @@
         <w:szCs w:val="18"/>
       </w:rPr>
     </w:pPr>
-    <w:proofErr w:type="spellStart"/>
     <w:r>
       <w:rPr>
         <w:i/>
@@ -9652,18 +9963,7 @@
         <w:szCs w:val="18"/>
         <w:highlight w:val="yellow"/>
       </w:rPr>
-      <w:t>Zeming_WU</w:t>
-    </w:r>
-    <w:proofErr w:type="spellEnd"/>
-    <w:r>
-      <w:rPr>
-        <w:i/>
-        <w:iCs/>
-        <w:sz w:val="18"/>
-        <w:szCs w:val="18"/>
-        <w:highlight w:val="yellow"/>
-      </w:rPr>
-      <w:t>, 20719336</w:t>
+      <w:t>Zeming_WU, 20719336</w:t>
     </w:r>
     <w:r>
       <w:rPr>

</xml_diff>

<commit_message>
Update comment and structure
</commit_message>
<xml_diff>
--- a/MATLAB Coursework 2  Word Template.docx
+++ b/MATLAB Coursework 2  Word Template.docx
@@ -31,6 +31,7 @@
         </w:rPr>
         <w:t xml:space="preserve">Author: </w:t>
       </w:r>
+      <w:proofErr w:type="spellStart"/>
       <w:r>
         <w:rPr>
           <w:rFonts w:eastAsia="宋体" w:hint="eastAsia"/>
@@ -38,7 +39,17 @@
           <w:bCs/>
           <w:lang w:val="en-US" w:eastAsia="zh-CN"/>
         </w:rPr>
-        <w:t>Zeming WU</w:t>
+        <w:t>Zeming</w:t>
+      </w:r>
+      <w:proofErr w:type="spellEnd"/>
+      <w:r>
+        <w:rPr>
+          <w:rFonts w:eastAsia="宋体" w:hint="eastAsia"/>
+          <w:b/>
+          <w:bCs/>
+          <w:lang w:val="en-US" w:eastAsia="zh-CN"/>
+        </w:rPr>
+        <w:t xml:space="preserve"> WU</w:t>
       </w:r>
     </w:p>
     <w:p>
@@ -135,7 +146,7 @@
     <w:p>
       <w:pPr>
         <w:spacing w:line="259" w:lineRule="auto"/>
-        <w:jc w:val="both"/>
+        <w:jc w:val="center"/>
         <w:rPr>
           <w:rFonts w:eastAsia="宋体"/>
           <w:color w:val="000000" w:themeColor="text1"/>
@@ -191,19 +202,49 @@
     <w:p>
       <w:pPr>
         <w:spacing w:line="259" w:lineRule="auto"/>
+        <w:jc w:val="center"/>
+        <w:rPr>
+          <w:rFonts w:eastAsia="宋体"/>
+          <w:color w:val="000000" w:themeColor="text1"/>
+          <w:lang w:val="en-US" w:eastAsia="zh-CN"/>
+        </w:rPr>
+      </w:pPr>
+      <w:r>
+        <w:rPr>
+          <w:rFonts w:eastAsia="宋体"/>
+          <w:color w:val="000000" w:themeColor="text1"/>
+          <w:lang w:val="en-US" w:eastAsia="zh-CN"/>
+        </w:rPr>
+        <w:t>Figure 1. Temperature of the capsule recorded over 600 seconds.</w:t>
+      </w:r>
+    </w:p>
+    <w:p>
+      <w:pPr>
+        <w:spacing w:line="259" w:lineRule="auto"/>
         <w:jc w:val="both"/>
         <w:rPr>
-          <w:rFonts w:eastAsia="宋体"/>
-          <w:color w:val="000000" w:themeColor="text1"/>
-          <w:lang w:val="en-US" w:eastAsia="zh-CN"/>
-        </w:rPr>
-      </w:pPr>
-      <w:r>
-        <w:rPr>
           <w:rFonts w:eastAsia="宋体" w:hint="eastAsia"/>
           <w:color w:val="000000" w:themeColor="text1"/>
           <w:lang w:val="en-US" w:eastAsia="zh-CN"/>
         </w:rPr>
+      </w:pPr>
+    </w:p>
+    <w:p>
+      <w:pPr>
+        <w:spacing w:line="259" w:lineRule="auto"/>
+        <w:jc w:val="both"/>
+        <w:rPr>
+          <w:rFonts w:eastAsia="宋体"/>
+          <w:color w:val="000000" w:themeColor="text1"/>
+          <w:lang w:val="en-US" w:eastAsia="zh-CN"/>
+        </w:rPr>
+      </w:pPr>
+      <w:r>
+        <w:rPr>
+          <w:rFonts w:eastAsia="宋体" w:hint="eastAsia"/>
+          <w:color w:val="000000" w:themeColor="text1"/>
+          <w:lang w:val="en-US" w:eastAsia="zh-CN"/>
+        </w:rPr>
         <w:t>Task</w:t>
       </w:r>
       <w:r>
@@ -227,6 +268,25 @@
       <w:pPr>
         <w:spacing w:line="259" w:lineRule="auto"/>
         <w:jc w:val="both"/>
+        <w:rPr>
+          <w:rFonts w:eastAsia="宋体"/>
+          <w:color w:val="000000" w:themeColor="text1"/>
+          <w:lang w:val="en-US" w:eastAsia="zh-CN"/>
+        </w:rPr>
+      </w:pPr>
+      <w:r>
+        <w:rPr>
+          <w:rFonts w:eastAsia="宋体"/>
+          <w:color w:val="000000" w:themeColor="text1"/>
+          <w:lang w:val="en-US" w:eastAsia="zh-CN"/>
+        </w:rPr>
+        <w:t>The temperature data was recorded over a duration of 600 seconds using the MCP9700A sensor. The voltage readings were converted into temperature and plotted against time.</w:t>
+      </w:r>
+    </w:p>
+    <w:p>
+      <w:pPr>
+        <w:spacing w:line="259" w:lineRule="auto"/>
+        <w:jc w:val="center"/>
         <w:rPr>
           <w:rFonts w:eastAsia="宋体" w:hint="eastAsia"/>
           <w:color w:val="000000" w:themeColor="text1"/>
@@ -282,51 +342,26 @@
     <w:p>
       <w:pPr>
         <w:spacing w:line="259" w:lineRule="auto"/>
-        <w:jc w:val="both"/>
-        <w:rPr>
-          <w:rFonts w:eastAsia="宋体"/>
-          <w:color w:val="000000" w:themeColor="text1"/>
-          <w:lang w:val="en-US" w:eastAsia="zh-CN"/>
-        </w:rPr>
-      </w:pPr>
-    </w:p>
-    <w:p>
-      <w:pPr>
-        <w:spacing w:line="259" w:lineRule="auto"/>
-        <w:jc w:val="both"/>
-        <w:rPr>
-          <w:rFonts w:eastAsia="宋体"/>
-          <w:color w:val="000000" w:themeColor="text1"/>
-          <w:lang w:val="en-US" w:eastAsia="zh-CN"/>
-        </w:rPr>
-      </w:pPr>
-    </w:p>
-    <w:p>
-      <w:pPr>
-        <w:spacing w:line="259" w:lineRule="auto"/>
-        <w:jc w:val="both"/>
-        <w:rPr>
-          <w:rFonts w:eastAsia="宋体"/>
-          <w:color w:val="000000" w:themeColor="text1"/>
-          <w:lang w:val="en-US" w:eastAsia="zh-CN"/>
-        </w:rPr>
-      </w:pPr>
-    </w:p>
-    <w:p>
-      <w:pPr>
-        <w:spacing w:line="259" w:lineRule="auto"/>
-        <w:jc w:val="both"/>
-        <w:rPr>
-          <w:rFonts w:eastAsia="宋体"/>
-          <w:color w:val="000000" w:themeColor="text1"/>
-          <w:lang w:val="en-US" w:eastAsia="zh-CN"/>
-        </w:rPr>
-      </w:pPr>
-    </w:p>
-    <w:p>
-      <w:pPr>
-        <w:spacing w:line="259" w:lineRule="auto"/>
-        <w:jc w:val="both"/>
+        <w:jc w:val="center"/>
+        <w:rPr>
+          <w:rFonts w:eastAsia="宋体"/>
+          <w:color w:val="000000" w:themeColor="text1"/>
+          <w:lang w:val="en-US" w:eastAsia="zh-CN"/>
+        </w:rPr>
+      </w:pPr>
+      <w:r>
+        <w:rPr>
+          <w:rFonts w:eastAsia="宋体"/>
+          <w:color w:val="000000" w:themeColor="text1"/>
+          <w:lang w:val="en-US" w:eastAsia="zh-CN"/>
+        </w:rPr>
+        <w:t>Figure 2. Connection of the MCP9700A temperature sensor on the breadboard.</w:t>
+      </w:r>
+    </w:p>
+    <w:p>
+      <w:pPr>
+        <w:spacing w:line="259" w:lineRule="auto"/>
+        <w:jc w:val="center"/>
         <w:rPr>
           <w:rFonts w:eastAsia="宋体"/>
           <w:color w:val="000000" w:themeColor="text1"/>
@@ -474,6 +509,43 @@
       <w:pPr>
         <w:spacing w:line="259" w:lineRule="auto"/>
         <w:jc w:val="both"/>
+        <w:rPr>
+          <w:rFonts w:eastAsia="宋体"/>
+          <w:color w:val="000000" w:themeColor="text1"/>
+          <w:lang w:val="en-US" w:eastAsia="zh-CN"/>
+        </w:rPr>
+      </w:pPr>
+      <w:r>
+        <w:rPr>
+          <w:rFonts w:eastAsia="宋体"/>
+          <w:color w:val="000000" w:themeColor="text1"/>
+          <w:lang w:val="en-US" w:eastAsia="zh-CN"/>
+        </w:rPr>
+        <w:t xml:space="preserve">A function was developed to continuously monitor temperature and update a live plot. The LEDs were controlled based on the temperature range, with different </w:t>
+      </w:r>
+      <w:proofErr w:type="spellStart"/>
+      <w:r>
+        <w:rPr>
+          <w:rFonts w:eastAsia="宋体"/>
+          <w:color w:val="000000" w:themeColor="text1"/>
+          <w:lang w:val="en-US" w:eastAsia="zh-CN"/>
+        </w:rPr>
+        <w:t>behaviours</w:t>
+      </w:r>
+      <w:proofErr w:type="spellEnd"/>
+      <w:r>
+        <w:rPr>
+          <w:rFonts w:eastAsia="宋体"/>
+          <w:color w:val="000000" w:themeColor="text1"/>
+          <w:lang w:val="en-US" w:eastAsia="zh-CN"/>
+        </w:rPr>
+        <w:t xml:space="preserve"> indicating normal, low, and high temperatures.</w:t>
+      </w:r>
+    </w:p>
+    <w:p>
+      <w:pPr>
+        <w:spacing w:line="259" w:lineRule="auto"/>
+        <w:jc w:val="center"/>
         <w:rPr>
           <w:rFonts w:eastAsia="宋体" w:hint="eastAsia"/>
           <w:color w:val="000000" w:themeColor="text1"/>
@@ -550,7 +622,7 @@
           </mc:Choice>
           <mc:Fallback>
             <w:pict>
-              <v:shapetype w14:anchorId="61C70C00" id="_x0000_t34" coordsize="21600,21600" o:spt="34" o:oned="t" adj="10800" path="m,l@0,0@0,21600,21600,21600e" filled="f">
+              <v:shapetype w14:anchorId="081B24D8" id="_x0000_t34" coordsize="21600,21600" o:spt="34" o:oned="t" adj="10800" path="m,l@0,0@0,21600,21600,21600e" filled="f">
                 <v:stroke joinstyle="miter"/>
                 <v:formulas>
                   <v:f eqn="val #0"/>
@@ -705,7 +777,7 @@
     <w:p>
       <w:pPr>
         <w:spacing w:line="259" w:lineRule="auto"/>
-        <w:jc w:val="both"/>
+        <w:jc w:val="center"/>
         <w:rPr>
           <w:rFonts w:eastAsia="宋体"/>
           <w:color w:val="000000" w:themeColor="text1"/>
@@ -774,7 +846,7 @@
           </mc:Choice>
           <mc:Fallback>
             <w:pict>
-              <v:shapetype w14:anchorId="1D56EF88" id="_x0000_t32" coordsize="21600,21600" o:spt="32" o:oned="t" path="m,l21600,21600e" filled="f">
+              <v:shapetype w14:anchorId="38140A74" id="_x0000_t32" coordsize="21600,21600" o:spt="32" o:oned="t" path="m,l21600,21600e" filled="f">
                 <v:path arrowok="t" fillok="f" o:connecttype="none"/>
                 <o:lock v:ext="edit" shapetype="t"/>
               </v:shapetype>
@@ -789,7 +861,7 @@
     <w:p>
       <w:pPr>
         <w:spacing w:line="259" w:lineRule="auto"/>
-        <w:jc w:val="both"/>
+        <w:jc w:val="center"/>
         <w:rPr>
           <w:rFonts w:eastAsia="宋体"/>
           <w:color w:val="000000" w:themeColor="text1"/>
@@ -918,7 +990,7 @@
     <w:p>
       <w:pPr>
         <w:spacing w:line="259" w:lineRule="auto"/>
-        <w:jc w:val="both"/>
+        <w:jc w:val="center"/>
         <w:rPr>
           <w:rFonts w:eastAsia="宋体"/>
           <w:color w:val="000000" w:themeColor="text1"/>
@@ -987,7 +1059,7 @@
           </mc:Choice>
           <mc:Fallback>
             <w:pict>
-              <v:shape w14:anchorId="1F10626A" id="直接箭头连接符 8" o:spid="_x0000_s1026" type="#_x0000_t32" style="position:absolute;margin-left:67.2pt;margin-top:21.3pt;width:.45pt;height:14.05pt;z-index:251663360;visibility:visible;mso-wrap-style:square;mso-wrap-distance-left:9pt;mso-wrap-distance-top:0;mso-wrap-distance-right:9pt;mso-wrap-distance-bottom:0;mso-position-horizontal:absolute;mso-position-horizontal-relative:text;mso-position-vertical:absolute;mso-position-vertical-relative:text" o:gfxdata="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" strokecolor="#4472c4 [3204]" strokeweight=".5pt">
+              <v:shape w14:anchorId="3AC1EF23" id="直接箭头连接符 8" o:spid="_x0000_s1026" type="#_x0000_t32" style="position:absolute;margin-left:67.2pt;margin-top:21.3pt;width:.45pt;height:14.05pt;z-index:251663360;visibility:visible;mso-wrap-style:square;mso-wrap-distance-left:9pt;mso-wrap-distance-top:0;mso-wrap-distance-right:9pt;mso-wrap-distance-bottom:0;mso-position-horizontal:absolute;mso-position-horizontal-relative:text;mso-position-vertical:absolute;mso-position-vertical-relative:text" o:gfxdata="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" strokecolor="#4472c4 [3204]" strokeweight=".5pt">
                 <v:stroke endarrow="block" joinstyle="miter"/>
               </v:shape>
             </w:pict>
@@ -998,7 +1070,7 @@
     <w:p>
       <w:pPr>
         <w:spacing w:line="259" w:lineRule="auto"/>
-        <w:jc w:val="both"/>
+        <w:jc w:val="center"/>
         <w:rPr>
           <w:rFonts w:eastAsia="宋体"/>
           <w:color w:val="000000" w:themeColor="text1"/>
@@ -1072,7 +1144,14 @@
                                 <w:rFonts w:eastAsia="等线" w:hint="eastAsia"/>
                                 <w:lang w:eastAsia="zh-CN"/>
                               </w:rPr>
-                              <w:t>Convert voltage to teamperature</w:t>
+                              <w:t xml:space="preserve">Convert voltage to </w:t>
+                            </w:r>
+                            <w:r>
+                              <w:rPr>
+                                <w:rFonts w:eastAsia="等线"/>
+                                <w:lang w:eastAsia="zh-CN"/>
+                              </w:rPr>
+                              <w:t>temperature</w:t>
                             </w:r>
                           </w:p>
                         </w:txbxContent>
@@ -1110,7 +1189,14 @@
                           <w:rFonts w:eastAsia="等线" w:hint="eastAsia"/>
                           <w:lang w:eastAsia="zh-CN"/>
                         </w:rPr>
-                        <w:t>Convert voltage to teamperature</w:t>
+                        <w:t xml:space="preserve">Convert voltage to </w:t>
+                      </w:r>
+                      <w:r>
+                        <w:rPr>
+                          <w:rFonts w:eastAsia="等线"/>
+                          <w:lang w:eastAsia="zh-CN"/>
+                        </w:rPr>
+                        <w:t>temperature</w:t>
                       </w:r>
                     </w:p>
                   </w:txbxContent>
@@ -1124,18 +1210,18 @@
     <w:p>
       <w:pPr>
         <w:spacing w:line="259" w:lineRule="auto"/>
-        <w:jc w:val="both"/>
-        <w:rPr>
-          <w:rFonts w:eastAsia="宋体"/>
-          <w:color w:val="000000" w:themeColor="text1"/>
-          <w:lang w:val="en-US" w:eastAsia="zh-CN"/>
-        </w:rPr>
-      </w:pPr>
-    </w:p>
-    <w:p>
-      <w:pPr>
-        <w:spacing w:line="259" w:lineRule="auto"/>
-        <w:jc w:val="both"/>
+        <w:jc w:val="center"/>
+        <w:rPr>
+          <w:rFonts w:eastAsia="宋体"/>
+          <w:color w:val="000000" w:themeColor="text1"/>
+          <w:lang w:val="en-US" w:eastAsia="zh-CN"/>
+        </w:rPr>
+      </w:pPr>
+    </w:p>
+    <w:p>
+      <w:pPr>
+        <w:spacing w:line="259" w:lineRule="auto"/>
+        <w:jc w:val="center"/>
         <w:rPr>
           <w:rFonts w:eastAsia="宋体"/>
           <w:color w:val="000000" w:themeColor="text1"/>
@@ -1204,7 +1290,7 @@
           </mc:Choice>
           <mc:Fallback>
             <w:pict>
-              <v:shape w14:anchorId="4B15855F" id="直接箭头连接符 8" o:spid="_x0000_s1026" type="#_x0000_t32" style="position:absolute;margin-left:67.2pt;margin-top:10.7pt;width:.45pt;height:14.05pt;z-index:251667456;visibility:visible;mso-wrap-style:square;mso-wrap-distance-left:9pt;mso-wrap-distance-top:0;mso-wrap-distance-right:9pt;mso-wrap-distance-bottom:0;mso-position-horizontal:absolute;mso-position-horizontal-relative:text;mso-position-vertical:absolute;mso-position-vertical-relative:text" o:gfxdata="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" strokecolor="#4472c4 [3204]" strokeweight=".5pt">
+              <v:shape w14:anchorId="2E2BB328" id="直接箭头连接符 8" o:spid="_x0000_s1026" type="#_x0000_t32" style="position:absolute;margin-left:67.2pt;margin-top:10.7pt;width:.45pt;height:14.05pt;z-index:251667456;visibility:visible;mso-wrap-style:square;mso-wrap-distance-left:9pt;mso-wrap-distance-top:0;mso-wrap-distance-right:9pt;mso-wrap-distance-bottom:0;mso-position-horizontal:absolute;mso-position-horizontal-relative:text;mso-position-vertical:absolute;mso-position-vertical-relative:text" o:gfxdata="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" strokecolor="#4472c4 [3204]" strokeweight=".5pt">
                 <v:stroke endarrow="block" joinstyle="miter"/>
               </v:shape>
             </w:pict>
@@ -1215,7 +1301,7 @@
     <w:p>
       <w:pPr>
         <w:spacing w:line="259" w:lineRule="auto"/>
-        <w:jc w:val="both"/>
+        <w:jc w:val="center"/>
         <w:rPr>
           <w:rFonts w:eastAsia="宋体"/>
           <w:color w:val="000000" w:themeColor="text1"/>
@@ -1344,7 +1430,7 @@
     <w:p>
       <w:pPr>
         <w:spacing w:line="259" w:lineRule="auto"/>
-        <w:jc w:val="both"/>
+        <w:jc w:val="center"/>
         <w:rPr>
           <w:rFonts w:eastAsia="宋体"/>
           <w:color w:val="000000" w:themeColor="text1"/>
@@ -1413,7 +1499,7 @@
           </mc:Choice>
           <mc:Fallback>
             <w:pict>
-              <v:shape w14:anchorId="6DA2252F" id="直接箭头连接符 10" o:spid="_x0000_s1026" type="#_x0000_t32" style="position:absolute;margin-left:69.15pt;margin-top:6.2pt;width:.35pt;height:15.75pt;z-index:251669504;visibility:visible;mso-wrap-style:square;mso-wrap-distance-left:9pt;mso-wrap-distance-top:0;mso-wrap-distance-right:9pt;mso-wrap-distance-bottom:0;mso-position-horizontal:absolute;mso-position-horizontal-relative:text;mso-position-vertical:absolute;mso-position-vertical-relative:text" o:gfxdata="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" strokecolor="#4472c4 [3204]" strokeweight=".5pt">
+              <v:shape w14:anchorId="270279FC" id="直接箭头连接符 10" o:spid="_x0000_s1026" type="#_x0000_t32" style="position:absolute;margin-left:69.15pt;margin-top:6.2pt;width:.35pt;height:15.75pt;z-index:251669504;visibility:visible;mso-wrap-style:square;mso-wrap-distance-left:9pt;mso-wrap-distance-top:0;mso-wrap-distance-right:9pt;mso-wrap-distance-bottom:0;mso-position-horizontal:absolute;mso-position-horizontal-relative:text;mso-position-vertical:absolute;mso-position-vertical-relative:text" o:gfxdata="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" strokecolor="#4472c4 [3204]" strokeweight=".5pt">
                 <v:stroke endarrow="block" joinstyle="miter"/>
               </v:shape>
             </w:pict>
@@ -1546,7 +1632,7 @@
     <w:p>
       <w:pPr>
         <w:spacing w:line="259" w:lineRule="auto"/>
-        <w:jc w:val="both"/>
+        <w:jc w:val="center"/>
         <w:rPr>
           <w:rFonts w:eastAsia="宋体"/>
           <w:color w:val="000000" w:themeColor="text1"/>
@@ -1621,7 +1707,14 @@
                                 <w:rFonts w:eastAsia="等线" w:hint="eastAsia"/>
                                 <w:lang w:eastAsia="zh-CN"/>
                               </w:rPr>
-                              <w:t>Green LED on</w:t>
+                              <w:t xml:space="preserve">Green LED </w:t>
+                            </w:r>
+                            <w:r>
+                              <w:rPr>
+                                <w:rFonts w:eastAsia="等线" w:hint="eastAsia"/>
+                                <w:lang w:eastAsia="zh-CN"/>
+                              </w:rPr>
+                              <w:t>ON</w:t>
                             </w:r>
                           </w:p>
                         </w:txbxContent>
@@ -1659,7 +1752,14 @@
                           <w:rFonts w:eastAsia="等线" w:hint="eastAsia"/>
                           <w:lang w:eastAsia="zh-CN"/>
                         </w:rPr>
-                        <w:t>Green LED on</w:t>
+                        <w:t xml:space="preserve">Green LED </w:t>
+                      </w:r>
+                      <w:r>
+                        <w:rPr>
+                          <w:rFonts w:eastAsia="等线" w:hint="eastAsia"/>
+                          <w:lang w:eastAsia="zh-CN"/>
+                        </w:rPr>
+                        <w:t>ON</w:t>
                       </w:r>
                     </w:p>
                   </w:txbxContent>
@@ -1799,7 +1899,7 @@
     <w:p>
       <w:pPr>
         <w:spacing w:line="259" w:lineRule="auto"/>
-        <w:jc w:val="both"/>
+        <w:jc w:val="center"/>
         <w:rPr>
           <w:rFonts w:eastAsia="宋体"/>
           <w:color w:val="000000" w:themeColor="text1"/>
@@ -1868,7 +1968,7 @@
           </mc:Choice>
           <mc:Fallback>
             <w:pict>
-              <v:shape w14:anchorId="278E9D5F" id="直接箭头连接符 15" o:spid="_x0000_s1026" type="#_x0000_t32" style="position:absolute;margin-left:151pt;margin-top:16.65pt;width:63.1pt;height:.45pt;flip:y;z-index:251672576;visibility:visible;mso-wrap-style:square;mso-wrap-distance-left:9pt;mso-wrap-distance-top:0;mso-wrap-distance-right:9pt;mso-wrap-distance-bottom:0;mso-position-horizontal:absolute;mso-position-horizontal-relative:text;mso-position-vertical:absolute;mso-position-vertical-relative:text" o:gfxdata="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" strokecolor="#4472c4 [3204]" strokeweight=".5pt">
+              <v:shape w14:anchorId="76CDC29F" id="直接箭头连接符 15" o:spid="_x0000_s1026" type="#_x0000_t32" style="position:absolute;margin-left:151pt;margin-top:16.65pt;width:63.1pt;height:.45pt;flip:y;z-index:251672576;visibility:visible;mso-wrap-style:square;mso-wrap-distance-left:9pt;mso-wrap-distance-top:0;mso-wrap-distance-right:9pt;mso-wrap-distance-bottom:0;mso-position-horizontal:absolute;mso-position-horizontal-relative:text;mso-position-vertical:absolute;mso-position-vertical-relative:text" o:gfxdata="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" strokecolor="#4472c4 [3204]" strokeweight=".5pt">
                 <v:stroke endarrow="block" joinstyle="miter"/>
               </v:shape>
             </w:pict>
@@ -1879,7 +1979,7 @@
     <w:p>
       <w:pPr>
         <w:spacing w:line="259" w:lineRule="auto"/>
-        <w:jc w:val="both"/>
+        <w:jc w:val="center"/>
         <w:rPr>
           <w:rFonts w:eastAsia="宋体"/>
           <w:color w:val="000000" w:themeColor="text1"/>
@@ -1891,7 +1991,7 @@
     <w:p>
       <w:pPr>
         <w:spacing w:line="259" w:lineRule="auto"/>
-        <w:jc w:val="both"/>
+        <w:jc w:val="center"/>
         <w:rPr>
           <w:rFonts w:eastAsia="宋体"/>
           <w:color w:val="000000" w:themeColor="text1"/>
@@ -1960,7 +2060,7 @@
           </mc:Choice>
           <mc:Fallback>
             <w:pict>
-              <v:shape w14:anchorId="2CCACF32" id="直接箭头连接符 18" o:spid="_x0000_s1026" type="#_x0000_t32" style="position:absolute;margin-left:70.15pt;margin-top:15.45pt;width:.45pt;height:46.75pt;z-index:251676672;visibility:visible;mso-wrap-style:square;mso-wrap-distance-left:9pt;mso-wrap-distance-top:0;mso-wrap-distance-right:9pt;mso-wrap-distance-bottom:0;mso-position-horizontal:absolute;mso-position-horizontal-relative:text;mso-position-vertical:absolute;mso-position-vertical-relative:text" o:gfxdata="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" strokecolor="#4472c4 [3204]" strokeweight=".5pt">
+              <v:shape w14:anchorId="374C4E5D" id="直接箭头连接符 18" o:spid="_x0000_s1026" type="#_x0000_t32" style="position:absolute;margin-left:70.15pt;margin-top:15.45pt;width:.45pt;height:46.75pt;z-index:251676672;visibility:visible;mso-wrap-style:square;mso-wrap-distance-left:9pt;mso-wrap-distance-top:0;mso-wrap-distance-right:9pt;mso-wrap-distance-bottom:0;mso-position-horizontal:absolute;mso-position-horizontal-relative:text;mso-position-vertical:absolute;mso-position-vertical-relative:text" o:gfxdata="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" strokecolor="#4472c4 [3204]" strokeweight=".5pt">
                 <v:stroke endarrow="block" joinstyle="miter"/>
               </v:shape>
             </w:pict>
@@ -1971,7 +2071,7 @@
     <w:p>
       <w:pPr>
         <w:spacing w:line="259" w:lineRule="auto"/>
-        <w:jc w:val="both"/>
+        <w:jc w:val="center"/>
         <w:rPr>
           <w:rFonts w:eastAsia="宋体"/>
           <w:color w:val="000000" w:themeColor="text1"/>
@@ -2130,7 +2230,7 @@
     <w:p>
       <w:pPr>
         <w:spacing w:line="259" w:lineRule="auto"/>
-        <w:jc w:val="both"/>
+        <w:jc w:val="center"/>
         <w:rPr>
           <w:rFonts w:eastAsia="宋体"/>
           <w:color w:val="000000" w:themeColor="text1"/>
@@ -2287,7 +2387,7 @@
     <w:p>
       <w:pPr>
         <w:spacing w:line="259" w:lineRule="auto"/>
-        <w:jc w:val="both"/>
+        <w:jc w:val="center"/>
         <w:rPr>
           <w:rFonts w:eastAsia="宋体"/>
           <w:color w:val="000000" w:themeColor="text1"/>
@@ -2376,6 +2476,13 @@
                                 <w:lang w:eastAsia="zh-CN"/>
                               </w:rPr>
                               <w:t>blink</w:t>
+                            </w:r>
+                            <w:r>
+                              <w:rPr>
+                                <w:rFonts w:eastAsia="等线" w:hint="eastAsia"/>
+                                <w:lang w:eastAsia="zh-CN"/>
+                              </w:rPr>
+                              <w:t xml:space="preserve"> (0.5s)</w:t>
                             </w:r>
                           </w:p>
                         </w:txbxContent>
@@ -2428,6 +2535,13 @@
                           <w:lang w:eastAsia="zh-CN"/>
                         </w:rPr>
                         <w:t>blink</w:t>
+                      </w:r>
+                      <w:r>
+                        <w:rPr>
+                          <w:rFonts w:eastAsia="等线" w:hint="eastAsia"/>
+                          <w:lang w:eastAsia="zh-CN"/>
+                        </w:rPr>
+                        <w:t xml:space="preserve"> (0.5s)</w:t>
                       </w:r>
                     </w:p>
                   </w:txbxContent>
@@ -2567,7 +2681,7 @@
     <w:p>
       <w:pPr>
         <w:spacing w:line="259" w:lineRule="auto"/>
-        <w:jc w:val="both"/>
+        <w:jc w:val="center"/>
         <w:rPr>
           <w:rFonts w:eastAsia="宋体"/>
           <w:color w:val="000000" w:themeColor="text1"/>
@@ -2636,7 +2750,7 @@
           </mc:Choice>
           <mc:Fallback>
             <w:pict>
-              <v:shape w14:anchorId="53BC3952" id="直接箭头连接符 15" o:spid="_x0000_s1026" type="#_x0000_t32" style="position:absolute;margin-left:132.3pt;margin-top:6.05pt;width:63.1pt;height:.45pt;flip:y;z-index:251681792;visibility:visible;mso-wrap-style:square;mso-wrap-distance-left:9pt;mso-wrap-distance-top:0;mso-wrap-distance-right:9pt;mso-wrap-distance-bottom:0;mso-position-horizontal:absolute;mso-position-horizontal-relative:text;mso-position-vertical:absolute;mso-position-vertical-relative:text" o:gfxdata="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" strokecolor="#4472c4 [3204]" strokeweight=".5pt">
+              <v:shape w14:anchorId="0DBCC299" id="直接箭头连接符 15" o:spid="_x0000_s1026" type="#_x0000_t32" style="position:absolute;margin-left:132.3pt;margin-top:6.05pt;width:63.1pt;height:.45pt;flip:y;z-index:251681792;visibility:visible;mso-wrap-style:square;mso-wrap-distance-left:9pt;mso-wrap-distance-top:0;mso-wrap-distance-right:9pt;mso-wrap-distance-bottom:0;mso-position-horizontal:absolute;mso-position-horizontal-relative:text;mso-position-vertical:absolute;mso-position-vertical-relative:text" o:gfxdata="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" strokecolor="#4472c4 [3204]" strokeweight=".5pt">
                 <v:stroke endarrow="block" joinstyle="miter"/>
               </v:shape>
             </w:pict>
@@ -2647,7 +2761,7 @@
     <w:p>
       <w:pPr>
         <w:spacing w:line="259" w:lineRule="auto"/>
-        <w:jc w:val="both"/>
+        <w:jc w:val="center"/>
         <w:rPr>
           <w:rFonts w:eastAsia="宋体"/>
           <w:color w:val="000000" w:themeColor="text1"/>
@@ -2716,7 +2830,7 @@
           </mc:Choice>
           <mc:Fallback>
             <w:pict>
-              <v:shape w14:anchorId="4BC87F6D" id="直接箭头连接符 18" o:spid="_x0000_s1026" type="#_x0000_t32" style="position:absolute;margin-left:70.35pt;margin-top:11.7pt;width:.45pt;height:46.75pt;z-index:251686912;visibility:visible;mso-wrap-style:square;mso-wrap-distance-left:9pt;mso-wrap-distance-top:0;mso-wrap-distance-right:9pt;mso-wrap-distance-bottom:0;mso-position-horizontal:absolute;mso-position-horizontal-relative:text;mso-position-vertical:absolute;mso-position-vertical-relative:text" o:gfxdata="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" strokecolor="#4472c4 [3204]" strokeweight=".5pt">
+              <v:shape w14:anchorId="0E3E2D74" id="直接箭头连接符 18" o:spid="_x0000_s1026" type="#_x0000_t32" style="position:absolute;margin-left:70.35pt;margin-top:11.7pt;width:.45pt;height:46.75pt;z-index:251686912;visibility:visible;mso-wrap-style:square;mso-wrap-distance-left:9pt;mso-wrap-distance-top:0;mso-wrap-distance-right:9pt;mso-wrap-distance-bottom:0;mso-position-horizontal:absolute;mso-position-horizontal-relative:text;mso-position-vertical:absolute;mso-position-vertical-relative:text" o:gfxdata="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" strokecolor="#4472c4 [3204]" strokeweight=".5pt">
                 <v:stroke endarrow="block" joinstyle="miter"/>
               </v:shape>
             </w:pict>
@@ -2727,7 +2841,7 @@
     <w:p>
       <w:pPr>
         <w:spacing w:line="259" w:lineRule="auto"/>
-        <w:jc w:val="both"/>
+        <w:jc w:val="center"/>
         <w:rPr>
           <w:rFonts w:eastAsia="宋体"/>
           <w:color w:val="000000" w:themeColor="text1"/>
@@ -2886,7 +3000,7 @@
     <w:p>
       <w:pPr>
         <w:spacing w:line="259" w:lineRule="auto"/>
-        <w:jc w:val="both"/>
+        <w:jc w:val="center"/>
         <w:rPr>
           <w:rFonts w:eastAsia="宋体"/>
           <w:color w:val="000000" w:themeColor="text1"/>
@@ -2968,6 +3082,13 @@
                                 <w:lang w:eastAsia="zh-CN"/>
                               </w:rPr>
                               <w:t xml:space="preserve"> LED blink</w:t>
+                            </w:r>
+                            <w:r>
+                              <w:rPr>
+                                <w:rFonts w:eastAsia="等线" w:hint="eastAsia"/>
+                                <w:lang w:eastAsia="zh-CN"/>
+                              </w:rPr>
+                              <w:t xml:space="preserve"> (0.25s)</w:t>
                             </w:r>
                           </w:p>
                         </w:txbxContent>
@@ -3014,6 +3135,13 @@
                         </w:rPr>
                         <w:t xml:space="preserve"> LED blink</w:t>
                       </w:r>
+                      <w:r>
+                        <w:rPr>
+                          <w:rFonts w:eastAsia="等线" w:hint="eastAsia"/>
+                          <w:lang w:eastAsia="zh-CN"/>
+                        </w:rPr>
+                        <w:t xml:space="preserve"> (0.25s)</w:t>
+                      </w:r>
                     </w:p>
                   </w:txbxContent>
                 </v:textbox>
@@ -3026,18 +3154,18 @@
     <w:p>
       <w:pPr>
         <w:spacing w:line="259" w:lineRule="auto"/>
-        <w:jc w:val="both"/>
-        <w:rPr>
-          <w:rFonts w:eastAsia="宋体"/>
-          <w:color w:val="000000" w:themeColor="text1"/>
-          <w:lang w:val="en-US" w:eastAsia="zh-CN"/>
-        </w:rPr>
-      </w:pPr>
-    </w:p>
-    <w:p>
-      <w:pPr>
-        <w:spacing w:line="259" w:lineRule="auto"/>
-        <w:jc w:val="both"/>
+        <w:jc w:val="center"/>
+        <w:rPr>
+          <w:rFonts w:eastAsia="宋体"/>
+          <w:color w:val="000000" w:themeColor="text1"/>
+          <w:lang w:val="en-US" w:eastAsia="zh-CN"/>
+        </w:rPr>
+      </w:pPr>
+    </w:p>
+    <w:p>
+      <w:pPr>
+        <w:spacing w:line="259" w:lineRule="auto"/>
+        <w:jc w:val="center"/>
         <w:rPr>
           <w:rFonts w:eastAsia="宋体"/>
           <w:color w:val="000000" w:themeColor="text1"/>
@@ -3049,24 +3177,54 @@
     <w:p>
       <w:pPr>
         <w:spacing w:line="259" w:lineRule="auto"/>
-        <w:jc w:val="both"/>
+        <w:jc w:val="center"/>
+        <w:rPr>
+          <w:rFonts w:eastAsia="宋体"/>
+          <w:color w:val="000000" w:themeColor="text1"/>
+          <w:lang w:val="en-US" w:eastAsia="zh-CN"/>
+        </w:rPr>
+      </w:pPr>
+      <w:r>
+        <w:rPr>
+          <w:rFonts w:eastAsia="宋体"/>
+          <w:color w:val="000000" w:themeColor="text1"/>
+          <w:lang w:val="en-US" w:eastAsia="zh-CN"/>
+        </w:rPr>
+        <w:t xml:space="preserve">Figure </w:t>
+      </w:r>
+      <w:r>
         <w:rPr>
           <w:rFonts w:eastAsia="宋体" w:hint="eastAsia"/>
           <w:color w:val="000000" w:themeColor="text1"/>
           <w:lang w:val="en-US" w:eastAsia="zh-CN"/>
         </w:rPr>
-      </w:pPr>
-    </w:p>
-    <w:p>
-      <w:pPr>
-        <w:spacing w:line="259" w:lineRule="auto"/>
-        <w:jc w:val="both"/>
+        <w:t>3</w:t>
+      </w:r>
+      <w:r>
+        <w:rPr>
+          <w:rFonts w:eastAsia="宋体"/>
+          <w:color w:val="000000" w:themeColor="text1"/>
+          <w:lang w:val="en-US" w:eastAsia="zh-CN"/>
+        </w:rPr>
+        <w:t>. Flowchart of the initial design for the temperature monitoring system (Task 2g).</w:t>
+      </w:r>
+    </w:p>
+    <w:p>
+      <w:pPr>
+        <w:spacing w:line="259" w:lineRule="auto"/>
+        <w:jc w:val="center"/>
+        <w:rPr>
+          <w:rFonts w:eastAsia="宋体"/>
+          <w:color w:val="000000" w:themeColor="text1"/>
+          <w:lang w:val="en-US" w:eastAsia="zh-CN"/>
+        </w:rPr>
       </w:pPr>
       <w:r>
         <w:rPr>
           <w:noProof/>
           <w:lang w:val="en-US" w:eastAsia="zh-CN"/>
         </w:rPr>
+        <w:lastRenderedPageBreak/>
         <w:drawing>
           <wp:inline distT="0" distB="0" distL="114300" distR="114300" wp14:anchorId="1DB439EE" wp14:editId="261F2020">
             <wp:extent cx="1350010" cy="1800225"/>
@@ -3105,6 +3263,66 @@
           </wp:inline>
         </w:drawing>
       </w:r>
+    </w:p>
+    <w:p>
+      <w:pPr>
+        <w:spacing w:line="259" w:lineRule="auto"/>
+        <w:jc w:val="center"/>
+        <w:rPr>
+          <w:rFonts w:eastAsia="等线" w:hint="eastAsia"/>
+          <w:lang w:eastAsia="zh-CN"/>
+        </w:rPr>
+      </w:pPr>
+      <w:r>
+        <w:rPr>
+          <w:rFonts w:eastAsia="宋体"/>
+          <w:color w:val="000000" w:themeColor="text1"/>
+          <w:lang w:val="en-US" w:eastAsia="zh-CN"/>
+        </w:rPr>
+        <w:t xml:space="preserve">Figure </w:t>
+      </w:r>
+      <w:r>
+        <w:rPr>
+          <w:rFonts w:eastAsia="宋体" w:hint="eastAsia"/>
+          <w:color w:val="000000" w:themeColor="text1"/>
+          <w:lang w:val="en-US" w:eastAsia="zh-CN"/>
+        </w:rPr>
+        <w:t>4</w:t>
+      </w:r>
+      <w:r>
+        <w:rPr>
+          <w:rFonts w:eastAsia="宋体"/>
+          <w:color w:val="000000" w:themeColor="text1"/>
+          <w:lang w:val="en-US" w:eastAsia="zh-CN"/>
+        </w:rPr>
+        <w:t>. Connection of the MCP9700A temperature sensor</w:t>
+      </w:r>
+      <w:r>
+        <w:rPr>
+          <w:rFonts w:eastAsia="宋体" w:hint="eastAsia"/>
+          <w:color w:val="000000" w:themeColor="text1"/>
+          <w:lang w:val="en-US" w:eastAsia="zh-CN"/>
+        </w:rPr>
+        <w:t xml:space="preserve"> and LEDS</w:t>
+      </w:r>
+      <w:r>
+        <w:rPr>
+          <w:rFonts w:eastAsia="宋体"/>
+          <w:color w:val="000000" w:themeColor="text1"/>
+          <w:lang w:val="en-US" w:eastAsia="zh-CN"/>
+        </w:rPr>
+        <w:t xml:space="preserve"> on the breadboard.</w:t>
+      </w:r>
+    </w:p>
+    <w:p>
+      <w:pPr>
+        <w:spacing w:line="259" w:lineRule="auto"/>
+        <w:jc w:val="center"/>
+        <w:rPr>
+          <w:rFonts w:eastAsia="等线"/>
+          <w:lang w:eastAsia="zh-CN"/>
+        </w:rPr>
+      </w:pPr>
       <w:r>
         <w:rPr>
           <w:noProof/>
@@ -3155,16 +3373,7 @@
     <w:p>
       <w:pPr>
         <w:spacing w:line="259" w:lineRule="auto"/>
-        <w:jc w:val="both"/>
-        <w:rPr>
-          <w:lang w:val="en-US" w:eastAsia="zh-CN"/>
-        </w:rPr>
-      </w:pPr>
-    </w:p>
-    <w:p>
-      <w:pPr>
-        <w:spacing w:line="259" w:lineRule="auto"/>
-        <w:jc w:val="both"/>
+        <w:jc w:val="center"/>
         <w:rPr>
           <w:rFonts w:eastAsia="等线" w:hint="eastAsia"/>
           <w:lang w:eastAsia="zh-CN"/>
@@ -3172,10 +3381,49 @@
       </w:pPr>
       <w:r>
         <w:rPr>
+          <w:rFonts w:eastAsia="等线"/>
+          <w:lang w:eastAsia="zh-CN"/>
+        </w:rPr>
+        <w:t xml:space="preserve">Figure </w:t>
+      </w:r>
+      <w:r>
+        <w:rPr>
+          <w:rFonts w:eastAsia="等线" w:hint="eastAsia"/>
+          <w:lang w:eastAsia="zh-CN"/>
+        </w:rPr>
+        <w:t>5</w:t>
+      </w:r>
+      <w:r>
+        <w:rPr>
+          <w:rFonts w:eastAsia="等线"/>
+          <w:lang w:eastAsia="zh-CN"/>
+        </w:rPr>
+        <w:t>. Live temperature plot during real-time monitoring.</w:t>
+      </w:r>
+    </w:p>
+    <w:p>
+      <w:pPr>
+        <w:spacing w:line="259" w:lineRule="auto"/>
+        <w:jc w:val="center"/>
+        <w:rPr>
+          <w:lang w:val="en-US" w:eastAsia="zh-CN"/>
+        </w:rPr>
+      </w:pPr>
+    </w:p>
+    <w:p>
+      <w:pPr>
+        <w:spacing w:line="259" w:lineRule="auto"/>
+        <w:jc w:val="center"/>
+        <w:rPr>
+          <w:rFonts w:eastAsia="等线"/>
+          <w:lang w:eastAsia="zh-CN"/>
+        </w:rPr>
+      </w:pPr>
+      <w:r>
+        <w:rPr>
           <w:noProof/>
           <w:lang w:eastAsia="zh-CN"/>
         </w:rPr>
-        <w:lastRenderedPageBreak/>
         <w:drawing>
           <wp:inline distT="0" distB="0" distL="114300" distR="114300" wp14:anchorId="7BDB3DF9" wp14:editId="24E56595">
             <wp:extent cx="1889760" cy="2520315"/>
@@ -3220,6 +3468,49 @@
           <w:lang w:eastAsia="zh-CN"/>
         </w:rPr>
         <w:drawing>
+          <wp:inline distT="0" distB="0" distL="114300" distR="114300" wp14:anchorId="216DBAC8" wp14:editId="09A34B2C">
+            <wp:extent cx="1890395" cy="2520315"/>
+            <wp:effectExtent l="0" t="0" r="14605" b="13335"/>
+            <wp:docPr id="10" name="图片 10" descr="07e3a5fa5e241f137d81d9feecd354be"/>
+            <wp:cNvGraphicFramePr>
+              <a:graphicFrameLocks xmlns:a="http://schemas.openxmlformats.org/drawingml/2006/main" noChangeAspect="1"/>
+            </wp:cNvGraphicFramePr>
+            <a:graphic xmlns:a="http://schemas.openxmlformats.org/drawingml/2006/main">
+              <a:graphicData uri="http://schemas.openxmlformats.org/drawingml/2006/picture">
+                <pic:pic xmlns:pic="http://schemas.openxmlformats.org/drawingml/2006/picture">
+                  <pic:nvPicPr>
+                    <pic:cNvPr id="10" name="图片 10" descr="07e3a5fa5e241f137d81d9feecd354be"/>
+                    <pic:cNvPicPr>
+                      <a:picLocks noChangeAspect="1"/>
+                    </pic:cNvPicPr>
+                  </pic:nvPicPr>
+                  <pic:blipFill>
+                    <a:blip r:embed="rId14"/>
+                    <a:stretch>
+                      <a:fillRect/>
+                    </a:stretch>
+                  </pic:blipFill>
+                  <pic:spPr>
+                    <a:xfrm>
+                      <a:off x="0" y="0"/>
+                      <a:ext cx="1890395" cy="2520315"/>
+                    </a:xfrm>
+                    <a:prstGeom prst="rect">
+                      <a:avLst/>
+                    </a:prstGeom>
+                  </pic:spPr>
+                </pic:pic>
+              </a:graphicData>
+            </a:graphic>
+          </wp:inline>
+        </w:drawing>
+      </w:r>
+      <w:r>
+        <w:rPr>
+          <w:noProof/>
+          <w:lang w:eastAsia="zh-CN"/>
+        </w:rPr>
+        <w:drawing>
           <wp:inline distT="0" distB="0" distL="114300" distR="114300" wp14:anchorId="0F76BCCE" wp14:editId="5935DCBD">
             <wp:extent cx="1889760" cy="2520315"/>
             <wp:effectExtent l="0" t="0" r="15240" b="13335"/>
@@ -3237,7 +3528,7 @@
                     </pic:cNvPicPr>
                   </pic:nvPicPr>
                   <pic:blipFill>
-                    <a:blip r:embed="rId14"/>
+                    <a:blip r:embed="rId15"/>
                     <a:stretch>
                       <a:fillRect/>
                     </a:stretch>
@@ -3257,55 +3548,165 @@
           </wp:inline>
         </w:drawing>
       </w:r>
-      <w:r>
-        <w:rPr>
-          <w:noProof/>
+    </w:p>
+    <w:p>
+      <w:pPr>
+        <w:spacing w:line="259" w:lineRule="auto"/>
+        <w:jc w:val="center"/>
+        <w:rPr>
+          <w:rFonts w:eastAsia="等线"/>
           <w:lang w:eastAsia="zh-CN"/>
         </w:rPr>
-        <w:drawing>
-          <wp:inline distT="0" distB="0" distL="114300" distR="114300" wp14:anchorId="02621774" wp14:editId="082A79FC">
-            <wp:extent cx="1890395" cy="2520315"/>
-            <wp:effectExtent l="0" t="0" r="14605" b="13335"/>
-            <wp:docPr id="10" name="图片 10" descr="07e3a5fa5e241f137d81d9feecd354be"/>
-            <wp:cNvGraphicFramePr>
-              <a:graphicFrameLocks xmlns:a="http://schemas.openxmlformats.org/drawingml/2006/main" noChangeAspect="1"/>
-            </wp:cNvGraphicFramePr>
-            <a:graphic xmlns:a="http://schemas.openxmlformats.org/drawingml/2006/main">
-              <a:graphicData uri="http://schemas.openxmlformats.org/drawingml/2006/picture">
-                <pic:pic xmlns:pic="http://schemas.openxmlformats.org/drawingml/2006/picture">
-                  <pic:nvPicPr>
-                    <pic:cNvPr id="10" name="图片 10" descr="07e3a5fa5e241f137d81d9feecd354be"/>
-                    <pic:cNvPicPr>
-                      <a:picLocks noChangeAspect="1"/>
-                    </pic:cNvPicPr>
-                  </pic:nvPicPr>
-                  <pic:blipFill>
-                    <a:blip r:embed="rId15"/>
-                    <a:stretch>
-                      <a:fillRect/>
-                    </a:stretch>
-                  </pic:blipFill>
-                  <pic:spPr>
-                    <a:xfrm>
-                      <a:off x="0" y="0"/>
-                      <a:ext cx="1890395" cy="2520315"/>
-                    </a:xfrm>
-                    <a:prstGeom prst="rect">
-                      <a:avLst/>
-                    </a:prstGeom>
-                  </pic:spPr>
-                </pic:pic>
-              </a:graphicData>
-            </a:graphic>
-          </wp:inline>
-        </w:drawing>
-      </w:r>
+      </w:pPr>
+      <w:bookmarkStart w:id="2" w:name="OLE_LINK3"/>
+      <w:r>
+        <w:rPr>
+          <w:rFonts w:eastAsia="等线"/>
+          <w:lang w:eastAsia="zh-CN"/>
+        </w:rPr>
+        <w:t xml:space="preserve">Figure </w:t>
+      </w:r>
+      <w:r>
+        <w:rPr>
+          <w:rFonts w:eastAsia="等线" w:hint="eastAsia"/>
+          <w:lang w:eastAsia="zh-CN"/>
+        </w:rPr>
+        <w:t>6</w:t>
+      </w:r>
+      <w:r>
+        <w:rPr>
+          <w:rFonts w:eastAsia="等线"/>
+          <w:lang w:eastAsia="zh-CN"/>
+        </w:rPr>
+        <w:t>. Green LED indicating temperature within the comfort range (18–24°C).</w:t>
+      </w:r>
+    </w:p>
+    <w:p>
+      <w:pPr>
+        <w:spacing w:line="259" w:lineRule="auto"/>
+        <w:jc w:val="center"/>
+        <w:rPr>
+          <w:rFonts w:eastAsia="等线"/>
+          <w:lang w:eastAsia="zh-CN"/>
+        </w:rPr>
+      </w:pPr>
+      <w:r>
+        <w:rPr>
+          <w:rFonts w:eastAsia="等线"/>
+          <w:lang w:eastAsia="zh-CN"/>
+        </w:rPr>
+        <w:t xml:space="preserve">Figure </w:t>
+      </w:r>
+      <w:r>
+        <w:rPr>
+          <w:rFonts w:eastAsia="等线" w:hint="eastAsia"/>
+          <w:lang w:eastAsia="zh-CN"/>
+        </w:rPr>
+        <w:t>7</w:t>
+      </w:r>
+      <w:r>
+        <w:rPr>
+          <w:rFonts w:eastAsia="等线"/>
+          <w:lang w:eastAsia="zh-CN"/>
+        </w:rPr>
+        <w:t>. Yellow LED indicating temperature below the comfort range</w:t>
+      </w:r>
+      <w:r>
+        <w:rPr>
+          <w:rFonts w:eastAsia="等线" w:hint="eastAsia"/>
+          <w:lang w:eastAsia="zh-CN"/>
+        </w:rPr>
+        <w:t xml:space="preserve"> (with ice)</w:t>
+      </w:r>
+      <w:r>
+        <w:rPr>
+          <w:rFonts w:eastAsia="等线"/>
+          <w:lang w:eastAsia="zh-CN"/>
+        </w:rPr>
+        <w:t>.</w:t>
+      </w:r>
+    </w:p>
+    <w:p>
+      <w:pPr>
+        <w:spacing w:line="259" w:lineRule="auto"/>
+        <w:jc w:val="center"/>
+        <w:rPr>
+          <w:rFonts w:eastAsia="等线" w:hint="eastAsia"/>
+          <w:lang w:eastAsia="zh-CN"/>
+        </w:rPr>
+      </w:pPr>
+      <w:r>
+        <w:rPr>
+          <w:rFonts w:eastAsia="等线"/>
+          <w:lang w:eastAsia="zh-CN"/>
+        </w:rPr>
+        <w:t xml:space="preserve">Figure </w:t>
+      </w:r>
+      <w:r>
+        <w:rPr>
+          <w:rFonts w:eastAsia="等线" w:hint="eastAsia"/>
+          <w:lang w:eastAsia="zh-CN"/>
+        </w:rPr>
+        <w:t>8</w:t>
+      </w:r>
+      <w:r>
+        <w:rPr>
+          <w:rFonts w:eastAsia="等线"/>
+          <w:lang w:eastAsia="zh-CN"/>
+        </w:rPr>
+        <w:t>. Red LED indicating temperature above the comfort range</w:t>
+      </w:r>
+      <w:r>
+        <w:rPr>
+          <w:rFonts w:eastAsia="等线" w:hint="eastAsia"/>
+          <w:lang w:eastAsia="zh-CN"/>
+        </w:rPr>
+        <w:t xml:space="preserve"> (with hand)</w:t>
+      </w:r>
+      <w:r>
+        <w:rPr>
+          <w:rFonts w:eastAsia="等线"/>
+          <w:lang w:eastAsia="zh-CN"/>
+        </w:rPr>
+        <w:t>.</w:t>
+      </w:r>
+    </w:p>
+    <w:bookmarkEnd w:id="2"/>
+    <w:p>
+      <w:pPr>
+        <w:spacing w:line="259" w:lineRule="auto"/>
+        <w:jc w:val="center"/>
+        <w:rPr>
+          <w:rFonts w:eastAsia="等线"/>
+          <w:lang w:eastAsia="zh-CN"/>
+        </w:rPr>
+      </w:pPr>
+    </w:p>
+    <w:p>
+      <w:pPr>
+        <w:spacing w:line="259" w:lineRule="auto"/>
+        <w:jc w:val="center"/>
+        <w:rPr>
+          <w:rFonts w:eastAsia="等线"/>
+          <w:lang w:eastAsia="zh-CN"/>
+        </w:rPr>
+      </w:pPr>
     </w:p>
     <w:p>
       <w:pPr>
         <w:spacing w:line="259" w:lineRule="auto"/>
         <w:jc w:val="both"/>
         <w:rPr>
+          <w:rFonts w:eastAsia="等线" w:hint="eastAsia"/>
+          <w:lang w:eastAsia="zh-CN"/>
+        </w:rPr>
+      </w:pPr>
+    </w:p>
+    <w:p>
+      <w:pPr>
+        <w:spacing w:line="259" w:lineRule="auto"/>
+        <w:jc w:val="both"/>
+        <w:rPr>
           <w:rFonts w:eastAsia="宋体"/>
           <w:color w:val="000000" w:themeColor="text1"/>
           <w:lang w:val="en-US" w:eastAsia="zh-CN"/>
@@ -3317,13 +3718,14 @@
           <w:color w:val="000000" w:themeColor="text1"/>
           <w:lang w:val="en-US" w:eastAsia="zh-CN"/>
         </w:rPr>
+        <w:lastRenderedPageBreak/>
         <w:t>Task 2</w:t>
       </w:r>
     </w:p>
     <w:p>
       <w:pPr>
         <w:spacing w:line="259" w:lineRule="auto"/>
-        <w:jc w:val="both"/>
+        <w:jc w:val="center"/>
         <w:rPr>
           <w:rFonts w:eastAsia="宋体" w:hint="eastAsia"/>
           <w:color w:val="000000" w:themeColor="text1"/>
@@ -3340,7 +3742,7 @@
         <mc:AlternateContent>
           <mc:Choice Requires="wps">
             <w:drawing>
-              <wp:anchor distT="0" distB="0" distL="114300" distR="114300" simplePos="0" relativeHeight="251761664" behindDoc="0" locked="0" layoutInCell="1" allowOverlap="1" wp14:anchorId="17BFE7EA" wp14:editId="420AE7E8">
+              <wp:anchor distT="0" distB="0" distL="114300" distR="114300" simplePos="0" relativeHeight="251761664" behindDoc="0" locked="0" layoutInCell="1" allowOverlap="1" wp14:anchorId="17BFE7EA" wp14:editId="4739E072">
                 <wp:simplePos x="0" y="0"/>
                 <wp:positionH relativeFrom="column">
                   <wp:posOffset>1341880</wp:posOffset>
@@ -3400,7 +3802,7 @@
           </mc:Choice>
           <mc:Fallback>
             <w:pict>
-              <v:shape w14:anchorId="13A9A2FA" id="连接符: 肘形 19" o:spid="_x0000_s1026" type="#_x0000_t34" style="position:absolute;margin-left:105.65pt;margin-top:20.35pt;width:16.2pt;height:392.8pt;flip:y;z-index:251761664;visibility:visible;mso-wrap-style:square;mso-width-percent:0;mso-height-percent:0;mso-wrap-distance-left:9pt;mso-wrap-distance-top:0;mso-wrap-distance-right:9pt;mso-wrap-distance-bottom:0;mso-position-horizontal:absolute;mso-position-horizontal-relative:text;mso-position-vertical:absolute;mso-position-vertical-relative:text;mso-width-percent:0;mso-height-percent:0;mso-width-relative:margin;mso-height-relative:margin" o:gfxdata="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" adj="74570" strokecolor="#4472c4 [3204]" strokeweight=".5pt">
+              <v:shape w14:anchorId="69E97A4D" id="连接符: 肘形 19" o:spid="_x0000_s1026" type="#_x0000_t34" style="position:absolute;margin-left:105.65pt;margin-top:20.35pt;width:16.2pt;height:392.8pt;flip:y;z-index:251761664;visibility:visible;mso-wrap-style:square;mso-width-percent:0;mso-height-percent:0;mso-wrap-distance-left:9pt;mso-wrap-distance-top:0;mso-wrap-distance-right:9pt;mso-wrap-distance-bottom:0;mso-position-horizontal:absolute;mso-position-horizontal-relative:text;mso-position-vertical:absolute;mso-position-vertical-relative:text;mso-width-percent:0;mso-height-percent:0;mso-width-relative:margin;mso-height-relative:margin" o:gfxdata="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" adj="74570" strokecolor="#4472c4 [3204]" strokeweight=".5pt">
                 <v:stroke endarrow="block"/>
               </v:shape>
             </w:pict>
@@ -3417,7 +3819,7 @@
         <mc:AlternateContent>
           <mc:Choice Requires="wps">
             <w:drawing>
-              <wp:anchor distT="0" distB="0" distL="114300" distR="114300" simplePos="0" relativeHeight="251740160" behindDoc="0" locked="0" layoutInCell="1" allowOverlap="1" wp14:anchorId="3FAEEF5F" wp14:editId="3521F87D">
+              <wp:anchor distT="0" distB="0" distL="114300" distR="114300" simplePos="0" relativeHeight="251740160" behindDoc="0" locked="0" layoutInCell="1" allowOverlap="1" wp14:anchorId="3FAEEF5F" wp14:editId="39962913">
                 <wp:simplePos x="0" y="0"/>
                 <wp:positionH relativeFrom="column">
                   <wp:posOffset>142875</wp:posOffset>
@@ -3498,12 +3900,18 @@
                     </wps:wsp>
                   </a:graphicData>
                 </a:graphic>
+                <wp14:sizeRelH relativeFrom="margin">
+                  <wp14:pctWidth>0</wp14:pctWidth>
+                </wp14:sizeRelH>
+                <wp14:sizeRelV relativeFrom="margin">
+                  <wp14:pctHeight>0</wp14:pctHeight>
+                </wp14:sizeRelV>
               </wp:anchor>
             </w:drawing>
           </mc:Choice>
           <mc:Fallback>
             <w:pict>
-              <v:oval w14:anchorId="3FAEEF5F" id="_x0000_s1039" style="position:absolute;left:0;text-align:left;margin-left:11.25pt;margin-top:3.65pt;width:110.25pt;height:31.5pt;z-index:251740160;visibility:visible;mso-wrap-style:square;mso-wrap-distance-left:9pt;mso-wrap-distance-top:0;mso-wrap-distance-right:9pt;mso-wrap-distance-bottom:0;mso-position-horizontal:absolute;mso-position-horizontal-relative:text;mso-position-vertical:absolute;mso-position-vertical-relative:text;v-text-anchor:middle" o:gfxdata="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" fillcolor="#4472c4 [3204]" strokecolor="#09101d [484]" strokeweight="1pt">
+              <v:oval w14:anchorId="3FAEEF5F" id="_x0000_s1039" style="position:absolute;left:0;text-align:left;margin-left:11.25pt;margin-top:3.65pt;width:110.25pt;height:31.5pt;z-index:251740160;visibility:visible;mso-wrap-style:square;mso-width-percent:0;mso-height-percent:0;mso-wrap-distance-left:9pt;mso-wrap-distance-top:0;mso-wrap-distance-right:9pt;mso-wrap-distance-bottom:0;mso-position-horizontal:absolute;mso-position-horizontal-relative:text;mso-position-vertical:absolute;mso-position-vertical-relative:text;mso-width-percent:0;mso-height-percent:0;mso-width-relative:margin;mso-height-relative:margin;v-text-anchor:middle" o:gfxdata="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" fillcolor="#4472c4 [3204]" strokecolor="#09101d [484]" strokeweight="1pt">
                 <v:stroke joinstyle="miter"/>
                 <v:textbox>
                   <w:txbxContent>
@@ -3544,7 +3952,7 @@
     <w:p>
       <w:pPr>
         <w:spacing w:line="259" w:lineRule="auto"/>
-        <w:jc w:val="both"/>
+        <w:jc w:val="center"/>
         <w:rPr>
           <w:rFonts w:eastAsia="宋体"/>
           <w:color w:val="000000" w:themeColor="text1"/>
@@ -3613,7 +4021,7 @@
           </mc:Choice>
           <mc:Fallback>
             <w:pict>
-              <v:shape w14:anchorId="78E8052D" id="直接箭头连接符 6" o:spid="_x0000_s1026" type="#_x0000_t32" style="position:absolute;margin-left:67.3pt;margin-top:14.4pt;width:.45pt;height:23.9pt;z-index:251742208;visibility:visible;mso-wrap-style:square;mso-wrap-distance-left:9pt;mso-wrap-distance-top:0;mso-wrap-distance-right:9pt;mso-wrap-distance-bottom:0;mso-position-horizontal:absolute;mso-position-horizontal-relative:text;mso-position-vertical:absolute;mso-position-vertical-relative:text" o:gfxdata="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" strokecolor="#4472c4 [3204]" strokeweight=".5pt">
+              <v:shape w14:anchorId="45BFD411" id="直接箭头连接符 6" o:spid="_x0000_s1026" type="#_x0000_t32" style="position:absolute;margin-left:67.3pt;margin-top:14.4pt;width:.45pt;height:23.9pt;z-index:251742208;visibility:visible;mso-wrap-style:square;mso-wrap-distance-left:9pt;mso-wrap-distance-top:0;mso-wrap-distance-right:9pt;mso-wrap-distance-bottom:0;mso-position-horizontal:absolute;mso-position-horizontal-relative:text;mso-position-vertical:absolute;mso-position-vertical-relative:text" o:gfxdata="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" strokecolor="#4472c4 [3204]" strokeweight=".5pt">
                 <v:stroke endarrow="block" joinstyle="miter"/>
               </v:shape>
             </w:pict>
@@ -3624,7 +4032,7 @@
     <w:p>
       <w:pPr>
         <w:spacing w:line="259" w:lineRule="auto"/>
-        <w:jc w:val="both"/>
+        <w:jc w:val="center"/>
         <w:rPr>
           <w:rFonts w:eastAsia="宋体"/>
           <w:color w:val="000000" w:themeColor="text1"/>
@@ -3753,18 +4161,18 @@
     <w:p>
       <w:pPr>
         <w:spacing w:line="259" w:lineRule="auto"/>
-        <w:jc w:val="both"/>
-        <w:rPr>
-          <w:rFonts w:eastAsia="宋体"/>
-          <w:color w:val="000000" w:themeColor="text1"/>
-          <w:lang w:val="en-US" w:eastAsia="zh-CN"/>
-        </w:rPr>
-      </w:pPr>
-    </w:p>
-    <w:p>
-      <w:pPr>
-        <w:spacing w:line="259" w:lineRule="auto"/>
-        <w:jc w:val="both"/>
+        <w:jc w:val="center"/>
+        <w:rPr>
+          <w:rFonts w:eastAsia="宋体"/>
+          <w:color w:val="000000" w:themeColor="text1"/>
+          <w:lang w:val="en-US" w:eastAsia="zh-CN"/>
+        </w:rPr>
+      </w:pPr>
+    </w:p>
+    <w:p>
+      <w:pPr>
+        <w:spacing w:line="259" w:lineRule="auto"/>
+        <w:jc w:val="center"/>
         <w:rPr>
           <w:rFonts w:eastAsia="宋体"/>
           <w:color w:val="000000" w:themeColor="text1"/>
@@ -3833,7 +4241,7 @@
           </mc:Choice>
           <mc:Fallback>
             <w:pict>
-              <v:shape w14:anchorId="668F7857" id="直接箭头连接符 8" o:spid="_x0000_s1026" type="#_x0000_t32" style="position:absolute;margin-left:67.85pt;margin-top:15.05pt;width:.45pt;height:14.05pt;z-index:251763712;visibility:visible;mso-wrap-style:square;mso-wrap-distance-left:9pt;mso-wrap-distance-top:0;mso-wrap-distance-right:9pt;mso-wrap-distance-bottom:0;mso-position-horizontal:absolute;mso-position-horizontal-relative:text;mso-position-vertical:absolute;mso-position-vertical-relative:text" o:gfxdata="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" strokecolor="#4472c4 [3204]" strokeweight=".5pt">
+              <v:shape w14:anchorId="571E9AA2" id="直接箭头连接符 8" o:spid="_x0000_s1026" type="#_x0000_t32" style="position:absolute;margin-left:67.85pt;margin-top:15.05pt;width:.45pt;height:14.05pt;z-index:251763712;visibility:visible;mso-wrap-style:square;mso-wrap-distance-left:9pt;mso-wrap-distance-top:0;mso-wrap-distance-right:9pt;mso-wrap-distance-bottom:0;mso-position-horizontal:absolute;mso-position-horizontal-relative:text;mso-position-vertical:absolute;mso-position-vertical-relative:text" o:gfxdata="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" strokecolor="#4472c4 [3204]" strokeweight=".5pt">
                 <v:stroke endarrow="block" joinstyle="miter"/>
               </v:shape>
             </w:pict>
@@ -3844,7 +4252,7 @@
     <w:p>
       <w:pPr>
         <w:spacing w:line="259" w:lineRule="auto"/>
-        <w:jc w:val="both"/>
+        <w:jc w:val="center"/>
         <w:rPr>
           <w:rFonts w:eastAsia="宋体"/>
           <w:color w:val="000000" w:themeColor="text1"/>
@@ -3973,7 +4381,7 @@
     <w:p>
       <w:pPr>
         <w:spacing w:line="259" w:lineRule="auto"/>
-        <w:jc w:val="both"/>
+        <w:jc w:val="center"/>
         <w:rPr>
           <w:rFonts w:eastAsia="宋体"/>
           <w:color w:val="000000" w:themeColor="text1"/>
@@ -4042,7 +4450,7 @@
           </mc:Choice>
           <mc:Fallback>
             <w:pict>
-              <v:shape w14:anchorId="080F2743" id="直接箭头连接符 8" o:spid="_x0000_s1026" type="#_x0000_t32" style="position:absolute;margin-left:67.2pt;margin-top:10.7pt;width:.45pt;height:14.05pt;z-index:251746304;visibility:visible;mso-wrap-style:square;mso-wrap-distance-left:9pt;mso-wrap-distance-top:0;mso-wrap-distance-right:9pt;mso-wrap-distance-bottom:0;mso-position-horizontal:absolute;mso-position-horizontal-relative:text;mso-position-vertical:absolute;mso-position-vertical-relative:text" o:gfxdata="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" strokecolor="#4472c4 [3204]" strokeweight=".5pt">
+              <v:shape w14:anchorId="11B16575" id="直接箭头连接符 8" o:spid="_x0000_s1026" type="#_x0000_t32" style="position:absolute;margin-left:67.2pt;margin-top:10.7pt;width:.45pt;height:14.05pt;z-index:251746304;visibility:visible;mso-wrap-style:square;mso-wrap-distance-left:9pt;mso-wrap-distance-top:0;mso-wrap-distance-right:9pt;mso-wrap-distance-bottom:0;mso-position-horizontal:absolute;mso-position-horizontal-relative:text;mso-position-vertical:absolute;mso-position-vertical-relative:text" o:gfxdata="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" strokecolor="#4472c4 [3204]" strokeweight=".5pt">
                 <v:stroke endarrow="block" joinstyle="miter"/>
               </v:shape>
             </w:pict>
@@ -4053,7 +4461,7 @@
     <w:p>
       <w:pPr>
         <w:spacing w:line="259" w:lineRule="auto"/>
-        <w:jc w:val="both"/>
+        <w:jc w:val="center"/>
         <w:rPr>
           <w:rFonts w:eastAsia="宋体"/>
           <w:color w:val="000000" w:themeColor="text1"/>
@@ -4210,7 +4618,7 @@
     <w:p>
       <w:pPr>
         <w:spacing w:line="259" w:lineRule="auto"/>
-        <w:jc w:val="both"/>
+        <w:jc w:val="center"/>
         <w:rPr>
           <w:rFonts w:eastAsia="宋体"/>
           <w:color w:val="000000" w:themeColor="text1"/>
@@ -4279,7 +4687,7 @@
           </mc:Choice>
           <mc:Fallback>
             <w:pict>
-              <v:shape w14:anchorId="21021460" id="直接箭头连接符 10" o:spid="_x0000_s1026" type="#_x0000_t32" style="position:absolute;margin-left:69.15pt;margin-top:6.2pt;width:.35pt;height:15.75pt;z-index:251748352;visibility:visible;mso-wrap-style:square;mso-wrap-distance-left:9pt;mso-wrap-distance-top:0;mso-wrap-distance-right:9pt;mso-wrap-distance-bottom:0;mso-position-horizontal:absolute;mso-position-horizontal-relative:text;mso-position-vertical:absolute;mso-position-vertical-relative:text" o:gfxdata="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" strokecolor="#4472c4 [3204]" strokeweight=".5pt">
+              <v:shape w14:anchorId="49AAE25A" id="直接箭头连接符 10" o:spid="_x0000_s1026" type="#_x0000_t32" style="position:absolute;margin-left:69.15pt;margin-top:6.2pt;width:.35pt;height:15.75pt;z-index:251748352;visibility:visible;mso-wrap-style:square;mso-wrap-distance-left:9pt;mso-wrap-distance-top:0;mso-wrap-distance-right:9pt;mso-wrap-distance-bottom:0;mso-position-horizontal:absolute;mso-position-horizontal-relative:text;mso-position-vertical:absolute;mso-position-vertical-relative:text" o:gfxdata="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" strokecolor="#4472c4 [3204]" strokeweight=".5pt">
                 <v:stroke endarrow="block" joinstyle="miter"/>
               </v:shape>
             </w:pict>
@@ -4290,7 +4698,7 @@
     <w:p>
       <w:pPr>
         <w:spacing w:line="259" w:lineRule="auto"/>
-        <w:jc w:val="both"/>
+        <w:jc w:val="center"/>
         <w:rPr>
           <w:rFonts w:eastAsia="宋体"/>
           <w:color w:val="000000" w:themeColor="text1"/>
@@ -4420,7 +4828,7 @@
     <w:p>
       <w:pPr>
         <w:spacing w:line="259" w:lineRule="auto"/>
-        <w:jc w:val="both"/>
+        <w:jc w:val="center"/>
         <w:rPr>
           <w:rFonts w:eastAsia="宋体"/>
           <w:color w:val="000000" w:themeColor="text1"/>
@@ -4489,7 +4897,7 @@
           </mc:Choice>
           <mc:Fallback>
             <w:pict>
-              <v:shape w14:anchorId="57576F7D" id="直接箭头连接符 10" o:spid="_x0000_s1026" type="#_x0000_t32" style="position:absolute;margin-left:70.05pt;margin-top:2.65pt;width:.35pt;height:15.75pt;z-index:251767808;visibility:visible;mso-wrap-style:square;mso-wrap-distance-left:9pt;mso-wrap-distance-top:0;mso-wrap-distance-right:9pt;mso-wrap-distance-bottom:0;mso-position-horizontal:absolute;mso-position-horizontal-relative:text;mso-position-vertical:absolute;mso-position-vertical-relative:text" o:gfxdata="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" strokecolor="#4472c4 [3204]" strokeweight=".5pt">
+              <v:shape w14:anchorId="021DAF22" id="直接箭头连接符 10" o:spid="_x0000_s1026" type="#_x0000_t32" style="position:absolute;margin-left:70.05pt;margin-top:2.65pt;width:.35pt;height:15.75pt;z-index:251767808;visibility:visible;mso-wrap-style:square;mso-wrap-distance-left:9pt;mso-wrap-distance-top:0;mso-wrap-distance-right:9pt;mso-wrap-distance-bottom:0;mso-position-horizontal:absolute;mso-position-horizontal-relative:text;mso-position-vertical:absolute;mso-position-vertical-relative:text" o:gfxdata="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" strokecolor="#4472c4 [3204]" strokeweight=".5pt">
                 <v:stroke endarrow="block" joinstyle="miter"/>
               </v:shape>
             </w:pict>
@@ -4619,7 +5027,7 @@
     <w:p>
       <w:pPr>
         <w:spacing w:line="259" w:lineRule="auto"/>
-        <w:jc w:val="both"/>
+        <w:jc w:val="center"/>
         <w:rPr>
           <w:rFonts w:eastAsia="宋体"/>
           <w:color w:val="000000" w:themeColor="text1"/>
@@ -4688,7 +5096,7 @@
           </mc:Choice>
           <mc:Fallback>
             <w:pict>
-              <v:shape w14:anchorId="2EF7C31F" id="直接箭头连接符 10" o:spid="_x0000_s1026" type="#_x0000_t32" style="position:absolute;margin-left:69.8pt;margin-top:18.35pt;width:.35pt;height:15.75pt;z-index:251771904;visibility:visible;mso-wrap-style:square;mso-wrap-distance-left:9pt;mso-wrap-distance-top:0;mso-wrap-distance-right:9pt;mso-wrap-distance-bottom:0;mso-position-horizontal:absolute;mso-position-horizontal-relative:text;mso-position-vertical:absolute;mso-position-vertical-relative:text" o:gfxdata="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" strokecolor="#4472c4 [3204]" strokeweight=".5pt">
+              <v:shape w14:anchorId="54304D99" id="直接箭头连接符 10" o:spid="_x0000_s1026" type="#_x0000_t32" style="position:absolute;margin-left:69.8pt;margin-top:18.35pt;width:.35pt;height:15.75pt;z-index:251771904;visibility:visible;mso-wrap-style:square;mso-wrap-distance-left:9pt;mso-wrap-distance-top:0;mso-wrap-distance-right:9pt;mso-wrap-distance-bottom:0;mso-position-horizontal:absolute;mso-position-horizontal-relative:text;mso-position-vertical:absolute;mso-position-vertical-relative:text" o:gfxdata="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" strokecolor="#4472c4 [3204]" strokeweight=".5pt">
                 <v:stroke endarrow="block" joinstyle="miter"/>
               </v:shape>
             </w:pict>
@@ -4699,7 +5107,7 @@
     <w:p>
       <w:pPr>
         <w:spacing w:line="259" w:lineRule="auto"/>
-        <w:jc w:val="both"/>
+        <w:jc w:val="center"/>
         <w:rPr>
           <w:rFonts w:eastAsia="宋体"/>
           <w:color w:val="000000" w:themeColor="text1"/>
@@ -4775,13 +5183,15 @@
                               </w:rPr>
                               <w:t>Update plot (</w:t>
                             </w:r>
+                            <w:proofErr w:type="spellStart"/>
                             <w:r>
                               <w:rPr>
                                 <w:rFonts w:eastAsia="等线"/>
                                 <w:lang w:eastAsia="zh-CN"/>
                               </w:rPr>
-                              <w:t>drawn now</w:t>
+                              <w:t>drawnow</w:t>
                             </w:r>
+                            <w:proofErr w:type="spellEnd"/>
                             <w:r>
                               <w:rPr>
                                 <w:rFonts w:eastAsia="等线" w:hint="eastAsia"/>
@@ -4830,13 +5240,15 @@
                         </w:rPr>
                         <w:t>Update plot (</w:t>
                       </w:r>
+                      <w:proofErr w:type="spellStart"/>
                       <w:r>
                         <w:rPr>
                           <w:rFonts w:eastAsia="等线"/>
                           <w:lang w:eastAsia="zh-CN"/>
                         </w:rPr>
-                        <w:t>drawn now</w:t>
+                        <w:t>drawnow</w:t>
                       </w:r>
+                      <w:proofErr w:type="spellEnd"/>
                       <w:r>
                         <w:rPr>
                           <w:rFonts w:eastAsia="等线" w:hint="eastAsia"/>
@@ -4857,18 +5269,18 @@
     <w:p>
       <w:pPr>
         <w:spacing w:line="259" w:lineRule="auto"/>
-        <w:jc w:val="both"/>
-        <w:rPr>
-          <w:rFonts w:eastAsia="宋体"/>
-          <w:color w:val="000000" w:themeColor="text1"/>
-          <w:lang w:val="en-US" w:eastAsia="zh-CN"/>
-        </w:rPr>
-      </w:pPr>
-    </w:p>
-    <w:p>
-      <w:pPr>
-        <w:spacing w:line="259" w:lineRule="auto"/>
-        <w:jc w:val="both"/>
+        <w:jc w:val="center"/>
+        <w:rPr>
+          <w:rFonts w:eastAsia="宋体"/>
+          <w:color w:val="000000" w:themeColor="text1"/>
+          <w:lang w:val="en-US" w:eastAsia="zh-CN"/>
+        </w:rPr>
+      </w:pPr>
+    </w:p>
+    <w:p>
+      <w:pPr>
+        <w:spacing w:line="259" w:lineRule="auto"/>
+        <w:jc w:val="center"/>
         <w:rPr>
           <w:rFonts w:eastAsia="宋体"/>
           <w:color w:val="000000" w:themeColor="text1"/>
@@ -4937,7 +5349,7 @@
           </mc:Choice>
           <mc:Fallback>
             <w:pict>
-              <v:shape w14:anchorId="614FF5E3" id="直接箭头连接符 10" o:spid="_x0000_s1026" type="#_x0000_t32" style="position:absolute;margin-left:69.4pt;margin-top:8.45pt;width:.35pt;height:15.75pt;z-index:251776000;visibility:visible;mso-wrap-style:square;mso-wrap-distance-left:9pt;mso-wrap-distance-top:0;mso-wrap-distance-right:9pt;mso-wrap-distance-bottom:0;mso-position-horizontal:absolute;mso-position-horizontal-relative:text;mso-position-vertical:absolute;mso-position-vertical-relative:text" o:gfxdata="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" strokecolor="#4472c4 [3204]" strokeweight=".5pt">
+              <v:shape w14:anchorId="0FBBC9CF" id="直接箭头连接符 10" o:spid="_x0000_s1026" type="#_x0000_t32" style="position:absolute;margin-left:69.4pt;margin-top:8.45pt;width:.35pt;height:15.75pt;z-index:251776000;visibility:visible;mso-wrap-style:square;mso-wrap-distance-left:9pt;mso-wrap-distance-top:0;mso-wrap-distance-right:9pt;mso-wrap-distance-bottom:0;mso-position-horizontal:absolute;mso-position-horizontal-relative:text;mso-position-vertical:absolute;mso-position-vertical-relative:text" o:gfxdata="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" strokecolor="#4472c4 [3204]" strokeweight=".5pt">
                 <v:stroke endarrow="block" joinstyle="miter"/>
               </v:shape>
             </w:pict>
@@ -4948,7 +5360,7 @@
     <w:p>
       <w:pPr>
         <w:spacing w:line="259" w:lineRule="auto"/>
-        <w:jc w:val="both"/>
+        <w:jc w:val="center"/>
         <w:rPr>
           <w:rFonts w:eastAsia="宋体"/>
           <w:color w:val="000000" w:themeColor="text1"/>
@@ -5078,7 +5490,7 @@
     <w:p>
       <w:pPr>
         <w:spacing w:line="259" w:lineRule="auto"/>
-        <w:jc w:val="both"/>
+        <w:jc w:val="center"/>
         <w:rPr>
           <w:rFonts w:eastAsia="宋体"/>
           <w:color w:val="000000" w:themeColor="text1"/>
@@ -5095,16 +5507,16 @@
         <mc:AlternateContent>
           <mc:Choice Requires="wps">
             <w:drawing>
-              <wp:anchor distT="0" distB="0" distL="114300" distR="114300" simplePos="0" relativeHeight="251782144" behindDoc="0" locked="0" layoutInCell="1" allowOverlap="1" wp14:anchorId="51BE76E6" wp14:editId="71B7B781">
+              <wp:anchor distT="0" distB="0" distL="114300" distR="114300" simplePos="0" relativeHeight="251782144" behindDoc="0" locked="0" layoutInCell="1" allowOverlap="1" wp14:anchorId="51BE76E6" wp14:editId="37744015">
                 <wp:simplePos x="0" y="0"/>
                 <wp:positionH relativeFrom="margin">
-                  <wp:posOffset>433153</wp:posOffset>
+                  <wp:posOffset>381635</wp:posOffset>
                 </wp:positionH>
                 <wp:positionV relativeFrom="paragraph">
-                  <wp:posOffset>230406</wp:posOffset>
+                  <wp:posOffset>239395</wp:posOffset>
                 </wp:positionV>
-                <wp:extent cx="932213" cy="279071"/>
-                <wp:effectExtent l="0" t="0" r="20320" b="26035"/>
+                <wp:extent cx="1028948" cy="279071"/>
+                <wp:effectExtent l="0" t="0" r="19050" b="26035"/>
                 <wp:wrapNone/>
                 <wp:docPr id="784930648" name="矩形 7"/>
                 <wp:cNvGraphicFramePr/>
@@ -5115,7 +5527,7 @@
                       <wps:spPr>
                         <a:xfrm>
                           <a:off x="0" y="0"/>
-                          <a:ext cx="932213" cy="279071"/>
+                          <a:ext cx="1028948" cy="279071"/>
                         </a:xfrm>
                         <a:prstGeom prst="rect">
                           <a:avLst/>
@@ -5152,7 +5564,21 @@
                                 <w:rFonts w:eastAsia="等线" w:hint="eastAsia"/>
                                 <w:lang w:eastAsia="zh-CN"/>
                               </w:rPr>
-                              <w:t>LED control</w:t>
+                              <w:t xml:space="preserve">Control </w:t>
+                            </w:r>
+                            <w:r>
+                              <w:rPr>
+                                <w:rFonts w:eastAsia="等线" w:hint="eastAsia"/>
+                                <w:lang w:eastAsia="zh-CN"/>
+                              </w:rPr>
+                              <w:t>LED</w:t>
+                            </w:r>
+                            <w:r>
+                              <w:rPr>
+                                <w:rFonts w:eastAsia="等线" w:hint="eastAsia"/>
+                                <w:lang w:eastAsia="zh-CN"/>
+                              </w:rPr>
+                              <w:t>s</w:t>
                             </w:r>
                           </w:p>
                         </w:txbxContent>
@@ -5177,7 +5603,7 @@
           </mc:Choice>
           <mc:Fallback>
             <w:pict>
-              <v:rect w14:anchorId="51BE76E6" id="_x0000_s1047" style="position:absolute;left:0;text-align:left;margin-left:34.1pt;margin-top:18.15pt;width:73.4pt;height:21.95pt;z-index:251782144;visibility:visible;mso-wrap-style:square;mso-width-percent:0;mso-height-percent:0;mso-wrap-distance-left:9pt;mso-wrap-distance-top:0;mso-wrap-distance-right:9pt;mso-wrap-distance-bottom:0;mso-position-horizontal:absolute;mso-position-horizontal-relative:margin;mso-position-vertical:absolute;mso-position-vertical-relative:text;mso-width-percent:0;mso-height-percent:0;mso-width-relative:margin;mso-height-relative:margin;v-text-anchor:middle" o:gfxdata="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" fillcolor="#4472c4 [3204]" strokecolor="#09101d [484]" strokeweight="1pt">
+              <v:rect w14:anchorId="51BE76E6" id="_x0000_s1047" style="position:absolute;left:0;text-align:left;margin-left:30.05pt;margin-top:18.85pt;width:81pt;height:21.95pt;z-index:251782144;visibility:visible;mso-wrap-style:square;mso-width-percent:0;mso-height-percent:0;mso-wrap-distance-left:9pt;mso-wrap-distance-top:0;mso-wrap-distance-right:9pt;mso-wrap-distance-bottom:0;mso-position-horizontal:absolute;mso-position-horizontal-relative:margin;mso-position-vertical:absolute;mso-position-vertical-relative:text;mso-width-percent:0;mso-height-percent:0;mso-width-relative:margin;mso-height-relative:margin;v-text-anchor:middle" o:gfxdata="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" fillcolor="#4472c4 [3204]" strokecolor="#09101d [484]" strokeweight="1pt">
                 <v:textbox>
                   <w:txbxContent>
                     <w:p>
@@ -5193,7 +5619,21 @@
                           <w:rFonts w:eastAsia="等线" w:hint="eastAsia"/>
                           <w:lang w:eastAsia="zh-CN"/>
                         </w:rPr>
-                        <w:t>LED control</w:t>
+                        <w:t xml:space="preserve">Control </w:t>
+                      </w:r>
+                      <w:r>
+                        <w:rPr>
+                          <w:rFonts w:eastAsia="等线" w:hint="eastAsia"/>
+                          <w:lang w:eastAsia="zh-CN"/>
+                        </w:rPr>
+                        <w:t>LED</w:t>
+                      </w:r>
+                      <w:r>
+                        <w:rPr>
+                          <w:rFonts w:eastAsia="等线" w:hint="eastAsia"/>
+                          <w:lang w:eastAsia="zh-CN"/>
+                        </w:rPr>
+                        <w:t>s</w:t>
                       </w:r>
                     </w:p>
                   </w:txbxContent>
@@ -5266,7 +5706,7 @@
           </mc:Choice>
           <mc:Fallback>
             <w:pict>
-              <v:shape w14:anchorId="52A43C25" id="直接箭头连接符 10" o:spid="_x0000_s1026" type="#_x0000_t32" style="position:absolute;margin-left:69.9pt;margin-top:.2pt;width:.35pt;height:15.75pt;z-index:251780096;visibility:visible;mso-wrap-style:square;mso-wrap-distance-left:9pt;mso-wrap-distance-top:0;mso-wrap-distance-right:9pt;mso-wrap-distance-bottom:0;mso-position-horizontal:absolute;mso-position-horizontal-relative:text;mso-position-vertical:absolute;mso-position-vertical-relative:text" o:gfxdata="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" strokecolor="#4472c4 [3204]" strokeweight=".5pt">
+              <v:shape w14:anchorId="0FD7487D" id="直接箭头连接符 10" o:spid="_x0000_s1026" type="#_x0000_t32" style="position:absolute;margin-left:69.9pt;margin-top:.2pt;width:.35pt;height:15.75pt;z-index:251780096;visibility:visible;mso-wrap-style:square;mso-wrap-distance-left:9pt;mso-wrap-distance-top:0;mso-wrap-distance-right:9pt;mso-wrap-distance-bottom:0;mso-position-horizontal:absolute;mso-position-horizontal-relative:text;mso-position-vertical:absolute;mso-position-vertical-relative:text" o:gfxdata="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" strokecolor="#4472c4 [3204]" strokeweight=".5pt">
                 <v:stroke endarrow="block" joinstyle="miter"/>
               </v:shape>
             </w:pict>
@@ -5277,7 +5717,7 @@
     <w:p>
       <w:pPr>
         <w:spacing w:line="259" w:lineRule="auto"/>
-        <w:jc w:val="both"/>
+        <w:jc w:val="center"/>
         <w:rPr>
           <w:rFonts w:eastAsia="宋体"/>
           <w:color w:val="000000" w:themeColor="text1"/>
@@ -5346,7 +5786,7 @@
           </mc:Choice>
           <mc:Fallback>
             <w:pict>
-              <v:shape w14:anchorId="6A894633" id="直接箭头连接符 10" o:spid="_x0000_s1026" type="#_x0000_t32" style="position:absolute;margin-left:68.85pt;margin-top:17.6pt;width:.35pt;height:15.75pt;z-index:251784192;visibility:visible;mso-wrap-style:square;mso-wrap-distance-left:9pt;mso-wrap-distance-top:0;mso-wrap-distance-right:9pt;mso-wrap-distance-bottom:0;mso-position-horizontal:absolute;mso-position-horizontal-relative:text;mso-position-vertical:absolute;mso-position-vertical-relative:text" o:gfxdata="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" strokecolor="#4472c4 [3204]" strokeweight=".5pt">
+              <v:shape w14:anchorId="0B5EFE22" id="直接箭头连接符 10" o:spid="_x0000_s1026" type="#_x0000_t32" style="position:absolute;margin-left:68.85pt;margin-top:17.6pt;width:.35pt;height:15.75pt;z-index:251784192;visibility:visible;mso-wrap-style:square;mso-wrap-distance-left:9pt;mso-wrap-distance-top:0;mso-wrap-distance-right:9pt;mso-wrap-distance-bottom:0;mso-position-horizontal:absolute;mso-position-horizontal-relative:text;mso-position-vertical:absolute;mso-position-vertical-relative:text" o:gfxdata="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" strokecolor="#4472c4 [3204]" strokeweight=".5pt">
                 <v:stroke endarrow="block" joinstyle="miter"/>
               </v:shape>
             </w:pict>
@@ -5357,7 +5797,7 @@
     <w:p>
       <w:pPr>
         <w:spacing w:line="259" w:lineRule="auto"/>
-        <w:jc w:val="both"/>
+        <w:jc w:val="center"/>
         <w:rPr>
           <w:rFonts w:eastAsia="宋体"/>
           <w:color w:val="000000" w:themeColor="text1"/>
@@ -5487,24 +5927,48 @@
     <w:p>
       <w:pPr>
         <w:spacing w:line="259" w:lineRule="auto"/>
-        <w:jc w:val="both"/>
-        <w:rPr>
-          <w:rFonts w:eastAsia="宋体"/>
-          <w:color w:val="000000" w:themeColor="text1"/>
-          <w:lang w:val="en-US" w:eastAsia="zh-CN"/>
-        </w:rPr>
-      </w:pPr>
-    </w:p>
-    <w:p>
-      <w:pPr>
-        <w:spacing w:line="259" w:lineRule="auto"/>
-        <w:jc w:val="both"/>
-        <w:rPr>
-          <w:rFonts w:eastAsia="宋体"/>
-          <w:color w:val="000000" w:themeColor="text1"/>
-          <w:lang w:val="en-US" w:eastAsia="zh-CN"/>
-        </w:rPr>
-      </w:pPr>
+        <w:jc w:val="center"/>
+        <w:rPr>
+          <w:rFonts w:eastAsia="宋体"/>
+          <w:color w:val="000000" w:themeColor="text1"/>
+          <w:lang w:val="en-US" w:eastAsia="zh-CN"/>
+        </w:rPr>
+      </w:pPr>
+    </w:p>
+    <w:p>
+      <w:pPr>
+        <w:spacing w:line="259" w:lineRule="auto"/>
+        <w:jc w:val="center"/>
+        <w:rPr>
+          <w:rFonts w:eastAsia="宋体"/>
+          <w:color w:val="000000" w:themeColor="text1"/>
+          <w:lang w:val="en-US" w:eastAsia="zh-CN"/>
+        </w:rPr>
+      </w:pPr>
+      <w:r>
+        <w:rPr>
+          <w:rFonts w:eastAsia="宋体"/>
+          <w:color w:val="000000" w:themeColor="text1"/>
+          <w:lang w:eastAsia="zh-CN"/>
+        </w:rPr>
+        <w:t xml:space="preserve">Figure </w:t>
+      </w:r>
+      <w:r>
+        <w:rPr>
+          <w:rFonts w:eastAsia="宋体" w:hint="eastAsia"/>
+          <w:color w:val="000000" w:themeColor="text1"/>
+          <w:lang w:eastAsia="zh-CN"/>
+        </w:rPr>
+        <w:t>9</w:t>
+      </w:r>
+      <w:r>
+        <w:rPr>
+          <w:rFonts w:eastAsia="宋体"/>
+          <w:color w:val="000000" w:themeColor="text1"/>
+          <w:lang w:eastAsia="zh-CN"/>
+        </w:rPr>
+        <w:t>. Flowchart of the implemented temperature monitoring function (Task 2m).</w:t>
+      </w:r>
     </w:p>
     <w:p>
       <w:pPr>
@@ -5525,11 +5989,101 @@
           <w:lang w:eastAsia="zh-CN"/>
         </w:rPr>
       </w:pPr>
-      <w:r>
+    </w:p>
+    <w:p>
+      <w:pPr>
+        <w:spacing w:line="259" w:lineRule="auto"/>
+        <w:jc w:val="both"/>
+        <w:rPr>
+          <w:rFonts w:eastAsia="等线"/>
+          <w:lang w:eastAsia="zh-CN"/>
+        </w:rPr>
+      </w:pPr>
+    </w:p>
+    <w:p>
+      <w:pPr>
+        <w:spacing w:line="259" w:lineRule="auto"/>
+        <w:jc w:val="both"/>
+        <w:rPr>
+          <w:rFonts w:eastAsia="等线"/>
+          <w:lang w:eastAsia="zh-CN"/>
+        </w:rPr>
+      </w:pPr>
+    </w:p>
+    <w:p>
+      <w:pPr>
+        <w:spacing w:line="259" w:lineRule="auto"/>
+        <w:jc w:val="both"/>
+        <w:rPr>
+          <w:rFonts w:eastAsia="等线"/>
+          <w:lang w:eastAsia="zh-CN"/>
+        </w:rPr>
+      </w:pPr>
+    </w:p>
+    <w:p>
+      <w:pPr>
+        <w:spacing w:line="259" w:lineRule="auto"/>
+        <w:jc w:val="both"/>
+        <w:rPr>
+          <w:rFonts w:eastAsia="等线"/>
+          <w:lang w:eastAsia="zh-CN"/>
+        </w:rPr>
+      </w:pPr>
+    </w:p>
+    <w:p>
+      <w:pPr>
+        <w:spacing w:line="259" w:lineRule="auto"/>
+        <w:jc w:val="both"/>
+        <w:rPr>
+          <w:rFonts w:eastAsia="等线"/>
+          <w:lang w:eastAsia="zh-CN"/>
+        </w:rPr>
+      </w:pPr>
+    </w:p>
+    <w:p>
+      <w:pPr>
+        <w:spacing w:line="259" w:lineRule="auto"/>
+        <w:jc w:val="both"/>
         <w:rPr>
           <w:rFonts w:eastAsia="等线" w:hint="eastAsia"/>
           <w:lang w:eastAsia="zh-CN"/>
         </w:rPr>
+      </w:pPr>
+    </w:p>
+    <w:p>
+      <w:pPr>
+        <w:spacing w:line="259" w:lineRule="auto"/>
+        <w:jc w:val="both"/>
+        <w:rPr>
+          <w:rFonts w:eastAsia="等线"/>
+          <w:lang w:eastAsia="zh-CN"/>
+        </w:rPr>
+      </w:pPr>
+    </w:p>
+    <w:p>
+      <w:pPr>
+        <w:spacing w:line="259" w:lineRule="auto"/>
+        <w:jc w:val="both"/>
+        <w:rPr>
+          <w:rFonts w:eastAsia="等线" w:hint="eastAsia"/>
+          <w:lang w:eastAsia="zh-CN"/>
+        </w:rPr>
+      </w:pPr>
+    </w:p>
+    <w:p>
+      <w:pPr>
+        <w:spacing w:line="259" w:lineRule="auto"/>
+        <w:jc w:val="both"/>
+        <w:rPr>
+          <w:rFonts w:eastAsia="等线"/>
+          <w:lang w:eastAsia="zh-CN"/>
+        </w:rPr>
+      </w:pPr>
+      <w:r>
+        <w:rPr>
+          <w:rFonts w:eastAsia="等线" w:hint="eastAsia"/>
+          <w:lang w:eastAsia="zh-CN"/>
+        </w:rPr>
         <w:lastRenderedPageBreak/>
         <w:t>Task 3</w:t>
       </w:r>
@@ -5538,6 +6092,23 @@
       <w:pPr>
         <w:spacing w:line="259" w:lineRule="auto"/>
         <w:jc w:val="both"/>
+        <w:rPr>
+          <w:rFonts w:eastAsia="等线"/>
+          <w:lang w:eastAsia="zh-CN"/>
+        </w:rPr>
+      </w:pPr>
+      <w:r>
+        <w:rPr>
+          <w:rFonts w:eastAsia="等线"/>
+          <w:lang w:eastAsia="zh-CN"/>
+        </w:rPr>
+        <w:t>A prediction algorithm was implemented to estimate the rate of temperature change and predict the temperature after 5 minutes. The LEDs were used to indicate whether the temperature was changing too quickly.</w:t>
+      </w:r>
+    </w:p>
+    <w:p>
+      <w:pPr>
+        <w:spacing w:line="259" w:lineRule="auto"/>
+        <w:jc w:val="center"/>
         <w:rPr>
           <w:rFonts w:eastAsia="等线" w:hint="eastAsia"/>
           <w:lang w:eastAsia="zh-CN"/>
@@ -5613,7 +6184,7 @@
           </mc:Choice>
           <mc:Fallback>
             <w:pict>
-              <v:shape w14:anchorId="72C6DF10" id="连接符: 肘形 19" o:spid="_x0000_s1026" type="#_x0000_t34" style="position:absolute;margin-left:110.5pt;margin-top:17.7pt;width:12.7pt;height:616.2pt;flip:y;z-index:251807744;visibility:visible;mso-wrap-style:square;mso-width-percent:0;mso-height-percent:0;mso-wrap-distance-left:9pt;mso-wrap-distance-top:0;mso-wrap-distance-right:9pt;mso-wrap-distance-bottom:0;mso-position-horizontal:absolute;mso-position-horizontal-relative:text;mso-position-vertical:absolute;mso-position-vertical-relative:text;mso-width-percent:0;mso-height-percent:0;mso-width-relative:margin;mso-height-relative:margin" o:gfxdata="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" adj="384566" strokecolor="#4472c4 [3204]" strokeweight=".5pt">
+              <v:shape w14:anchorId="48F07EC8" id="连接符: 肘形 19" o:spid="_x0000_s1026" type="#_x0000_t34" style="position:absolute;margin-left:110.5pt;margin-top:17.7pt;width:12.7pt;height:616.2pt;flip:y;z-index:251807744;visibility:visible;mso-wrap-style:square;mso-width-percent:0;mso-height-percent:0;mso-wrap-distance-left:9pt;mso-wrap-distance-top:0;mso-wrap-distance-right:9pt;mso-wrap-distance-bottom:0;mso-position-horizontal:absolute;mso-position-horizontal-relative:text;mso-position-vertical:absolute;mso-position-vertical-relative:text;mso-width-percent:0;mso-height-percent:0;mso-width-relative:margin;mso-height-relative:margin" o:gfxdata="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" adj="384566" strokecolor="#4472c4 [3204]" strokeweight=".5pt">
                 <v:stroke endarrow="block"/>
               </v:shape>
             </w:pict>
@@ -5757,7 +6328,7 @@
     <w:p>
       <w:pPr>
         <w:spacing w:line="259" w:lineRule="auto"/>
-        <w:jc w:val="both"/>
+        <w:jc w:val="center"/>
         <w:rPr>
           <w:rFonts w:eastAsia="宋体"/>
           <w:color w:val="000000" w:themeColor="text1"/>
@@ -5826,7 +6397,7 @@
           </mc:Choice>
           <mc:Fallback>
             <w:pict>
-              <v:shape w14:anchorId="58502F25" id="直接箭头连接符 6" o:spid="_x0000_s1026" type="#_x0000_t32" style="position:absolute;margin-left:67.3pt;margin-top:14.4pt;width:.45pt;height:23.9pt;z-index:251790336;visibility:visible;mso-wrap-style:square;mso-wrap-distance-left:9pt;mso-wrap-distance-top:0;mso-wrap-distance-right:9pt;mso-wrap-distance-bottom:0;mso-position-horizontal:absolute;mso-position-horizontal-relative:text;mso-position-vertical:absolute;mso-position-vertical-relative:text" o:gfxdata="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" strokecolor="#4472c4 [3204]" strokeweight=".5pt">
+              <v:shape w14:anchorId="56E05EDC" id="直接箭头连接符 6" o:spid="_x0000_s1026" type="#_x0000_t32" style="position:absolute;margin-left:67.3pt;margin-top:14.4pt;width:.45pt;height:23.9pt;z-index:251790336;visibility:visible;mso-wrap-style:square;mso-wrap-distance-left:9pt;mso-wrap-distance-top:0;mso-wrap-distance-right:9pt;mso-wrap-distance-bottom:0;mso-position-horizontal:absolute;mso-position-horizontal-relative:text;mso-position-vertical:absolute;mso-position-vertical-relative:text" o:gfxdata="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" strokecolor="#4472c4 [3204]" strokeweight=".5pt">
                 <v:stroke endarrow="block" joinstyle="miter"/>
               </v:shape>
             </w:pict>
@@ -5837,7 +6408,7 @@
     <w:p>
       <w:pPr>
         <w:spacing w:line="259" w:lineRule="auto"/>
-        <w:jc w:val="both"/>
+        <w:jc w:val="center"/>
         <w:rPr>
           <w:rFonts w:eastAsia="宋体"/>
           <w:color w:val="000000" w:themeColor="text1"/>
@@ -5966,7 +6537,7 @@
     <w:p>
       <w:pPr>
         <w:spacing w:line="259" w:lineRule="auto"/>
-        <w:jc w:val="both"/>
+        <w:jc w:val="center"/>
         <w:rPr>
           <w:rFonts w:eastAsia="宋体"/>
           <w:color w:val="000000" w:themeColor="text1"/>
@@ -6035,7 +6606,7 @@
           </mc:Choice>
           <mc:Fallback>
             <w:pict>
-              <v:shape w14:anchorId="568CF37A" id="直接箭头连接符 8" o:spid="_x0000_s1026" type="#_x0000_t32" style="position:absolute;margin-left:67.2pt;margin-top:21.3pt;width:.45pt;height:14.05pt;z-index:251792384;visibility:visible;mso-wrap-style:square;mso-wrap-distance-left:9pt;mso-wrap-distance-top:0;mso-wrap-distance-right:9pt;mso-wrap-distance-bottom:0;mso-position-horizontal:absolute;mso-position-horizontal-relative:text;mso-position-vertical:absolute;mso-position-vertical-relative:text" o:gfxdata="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" strokecolor="#4472c4 [3204]" strokeweight=".5pt">
+              <v:shape w14:anchorId="6608B415" id="直接箭头连接符 8" o:spid="_x0000_s1026" type="#_x0000_t32" style="position:absolute;margin-left:67.2pt;margin-top:21.3pt;width:.45pt;height:14.05pt;z-index:251792384;visibility:visible;mso-wrap-style:square;mso-wrap-distance-left:9pt;mso-wrap-distance-top:0;mso-wrap-distance-right:9pt;mso-wrap-distance-bottom:0;mso-position-horizontal:absolute;mso-position-horizontal-relative:text;mso-position-vertical:absolute;mso-position-vertical-relative:text" o:gfxdata="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" strokecolor="#4472c4 [3204]" strokeweight=".5pt">
                 <v:stroke endarrow="block" joinstyle="miter"/>
               </v:shape>
             </w:pict>
@@ -6046,7 +6617,7 @@
     <w:p>
       <w:pPr>
         <w:spacing w:line="259" w:lineRule="auto"/>
-        <w:jc w:val="both"/>
+        <w:jc w:val="center"/>
         <w:rPr>
           <w:rFonts w:eastAsia="宋体"/>
           <w:color w:val="000000" w:themeColor="text1"/>
@@ -6172,7 +6743,7 @@
     <w:p>
       <w:pPr>
         <w:spacing w:line="259" w:lineRule="auto"/>
-        <w:jc w:val="both"/>
+        <w:jc w:val="center"/>
         <w:rPr>
           <w:rFonts w:eastAsia="宋体"/>
           <w:color w:val="000000" w:themeColor="text1"/>
@@ -6241,7 +6812,7 @@
           </mc:Choice>
           <mc:Fallback>
             <w:pict>
-              <v:shape w14:anchorId="4AF74A24" id="直接箭头连接符 8" o:spid="_x0000_s1026" type="#_x0000_t32" style="position:absolute;margin-left:66.7pt;margin-top:17.35pt;width:.45pt;height:14.05pt;z-index:251794432;visibility:visible;mso-wrap-style:square;mso-wrap-distance-left:9pt;mso-wrap-distance-top:0;mso-wrap-distance-right:9pt;mso-wrap-distance-bottom:0;mso-position-horizontal:absolute;mso-position-horizontal-relative:text;mso-position-vertical:absolute;mso-position-vertical-relative:text" o:gfxdata="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" strokecolor="#4472c4 [3204]" strokeweight=".5pt">
+              <v:shape w14:anchorId="23551FCF" id="直接箭头连接符 8" o:spid="_x0000_s1026" type="#_x0000_t32" style="position:absolute;margin-left:66.7pt;margin-top:17.35pt;width:.45pt;height:14.05pt;z-index:251794432;visibility:visible;mso-wrap-style:square;mso-wrap-distance-left:9pt;mso-wrap-distance-top:0;mso-wrap-distance-right:9pt;mso-wrap-distance-bottom:0;mso-position-horizontal:absolute;mso-position-horizontal-relative:text;mso-position-vertical:absolute;mso-position-vertical-relative:text" o:gfxdata="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" strokecolor="#4472c4 [3204]" strokeweight=".5pt">
                 <v:stroke endarrow="block" joinstyle="miter"/>
               </v:shape>
             </w:pict>
@@ -6252,7 +6823,7 @@
     <w:p>
       <w:pPr>
         <w:spacing w:line="259" w:lineRule="auto"/>
-        <w:jc w:val="both"/>
+        <w:jc w:val="center"/>
         <w:rPr>
           <w:rFonts w:eastAsia="宋体"/>
           <w:color w:val="000000" w:themeColor="text1"/>
@@ -6269,16 +6840,16 @@
         <mc:AlternateContent>
           <mc:Choice Requires="wps">
             <w:drawing>
-              <wp:anchor distT="0" distB="0" distL="114300" distR="114300" simplePos="0" relativeHeight="251793408" behindDoc="0" locked="0" layoutInCell="1" allowOverlap="1" wp14:anchorId="6711B55D" wp14:editId="2D67A0CE">
+              <wp:anchor distT="0" distB="0" distL="114300" distR="114300" simplePos="0" relativeHeight="251793408" behindDoc="0" locked="0" layoutInCell="1" allowOverlap="1" wp14:anchorId="6711B55D" wp14:editId="48416F60">
                 <wp:simplePos x="0" y="0"/>
                 <wp:positionH relativeFrom="column">
-                  <wp:posOffset>154760</wp:posOffset>
+                  <wp:posOffset>154379</wp:posOffset>
                 </wp:positionH>
                 <wp:positionV relativeFrom="paragraph">
-                  <wp:posOffset>163195</wp:posOffset>
+                  <wp:posOffset>165372</wp:posOffset>
                 </wp:positionV>
-                <wp:extent cx="1414732" cy="465827"/>
-                <wp:effectExtent l="0" t="0" r="14605" b="10795"/>
+                <wp:extent cx="1414732" cy="480951"/>
+                <wp:effectExtent l="0" t="0" r="14605" b="14605"/>
                 <wp:wrapNone/>
                 <wp:docPr id="1963524554" name="矩形 7"/>
                 <wp:cNvGraphicFramePr/>
@@ -6289,7 +6860,7 @@
                       <wps:spPr>
                         <a:xfrm>
                           <a:off x="0" y="0"/>
-                          <a:ext cx="1414732" cy="465827"/>
+                          <a:ext cx="1414732" cy="480951"/>
                         </a:xfrm>
                         <a:prstGeom prst="rect">
                           <a:avLst/>
@@ -6327,6 +6898,29 @@
                                 <w:lang w:eastAsia="zh-CN"/>
                               </w:rPr>
                               <w:t>Calculate rate of change</w:t>
+                            </w:r>
+                            <w:r>
+                              <w:rPr>
+                                <w:rFonts w:eastAsia="等线" w:hint="eastAsia"/>
+                                <w:lang w:eastAsia="zh-CN"/>
+                              </w:rPr>
+                              <w:t xml:space="preserve"> (</w:t>
+                            </w:r>
+                            <w:proofErr w:type="spellStart"/>
+                            <w:r>
+                              <w:rPr>
+                                <w:rFonts w:eastAsia="等线" w:hint="eastAsia"/>
+                                <w:lang w:eastAsia="zh-CN"/>
+                              </w:rPr>
+                              <w:t>degC</w:t>
+                            </w:r>
+                            <w:proofErr w:type="spellEnd"/>
+                            <w:r>
+                              <w:rPr>
+                                <w:rFonts w:eastAsia="等线" w:hint="eastAsia"/>
+                                <w:lang w:eastAsia="zh-CN"/>
+                              </w:rPr>
+                              <w:t>/min)</w:t>
                             </w:r>
                           </w:p>
                         </w:txbxContent>
@@ -6351,7 +6945,7 @@
           </mc:Choice>
           <mc:Fallback>
             <w:pict>
-              <v:rect w14:anchorId="6711B55D" id="_x0000_s1052" style="position:absolute;left:0;text-align:left;margin-left:12.2pt;margin-top:12.85pt;width:111.4pt;height:36.7pt;z-index:251793408;visibility:visible;mso-wrap-style:square;mso-width-percent:0;mso-height-percent:0;mso-wrap-distance-left:9pt;mso-wrap-distance-top:0;mso-wrap-distance-right:9pt;mso-wrap-distance-bottom:0;mso-position-horizontal:absolute;mso-position-horizontal-relative:text;mso-position-vertical:absolute;mso-position-vertical-relative:text;mso-width-percent:0;mso-height-percent:0;mso-width-relative:margin;mso-height-relative:margin;v-text-anchor:middle" o:gfxdata="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" fillcolor="#4472c4 [3204]" strokecolor="#09101d [484]" strokeweight="1pt">
+              <v:rect w14:anchorId="6711B55D" id="_x0000_s1052" style="position:absolute;left:0;text-align:left;margin-left:12.15pt;margin-top:13pt;width:111.4pt;height:37.85pt;z-index:251793408;visibility:visible;mso-wrap-style:square;mso-width-percent:0;mso-height-percent:0;mso-wrap-distance-left:9pt;mso-wrap-distance-top:0;mso-wrap-distance-right:9pt;mso-wrap-distance-bottom:0;mso-position-horizontal:absolute;mso-position-horizontal-relative:text;mso-position-vertical:absolute;mso-position-vertical-relative:text;mso-width-percent:0;mso-height-percent:0;mso-width-relative:margin;mso-height-relative:margin;v-text-anchor:middle" o:gfxdata="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" fillcolor="#4472c4 [3204]" strokecolor="#09101d [484]" strokeweight="1pt">
                 <v:textbox>
                   <w:txbxContent>
                     <w:p>
@@ -6369,6 +6963,29 @@
                         </w:rPr>
                         <w:t>Calculate rate of change</w:t>
                       </w:r>
+                      <w:r>
+                        <w:rPr>
+                          <w:rFonts w:eastAsia="等线" w:hint="eastAsia"/>
+                          <w:lang w:eastAsia="zh-CN"/>
+                        </w:rPr>
+                        <w:t xml:space="preserve"> (</w:t>
+                      </w:r>
+                      <w:proofErr w:type="spellStart"/>
+                      <w:r>
+                        <w:rPr>
+                          <w:rFonts w:eastAsia="等线" w:hint="eastAsia"/>
+                          <w:lang w:eastAsia="zh-CN"/>
+                        </w:rPr>
+                        <w:t>degC</w:t>
+                      </w:r>
+                      <w:proofErr w:type="spellEnd"/>
+                      <w:r>
+                        <w:rPr>
+                          <w:rFonts w:eastAsia="等线" w:hint="eastAsia"/>
+                          <w:lang w:eastAsia="zh-CN"/>
+                        </w:rPr>
+                        <w:t>/min)</w:t>
+                      </w:r>
                     </w:p>
                   </w:txbxContent>
                 </v:textbox>
@@ -6381,18 +6998,18 @@
     <w:p>
       <w:pPr>
         <w:spacing w:line="259" w:lineRule="auto"/>
-        <w:jc w:val="both"/>
-        <w:rPr>
-          <w:rFonts w:eastAsia="宋体"/>
-          <w:color w:val="000000" w:themeColor="text1"/>
-          <w:lang w:val="en-US" w:eastAsia="zh-CN"/>
-        </w:rPr>
-      </w:pPr>
-    </w:p>
-    <w:p>
-      <w:pPr>
-        <w:spacing w:line="259" w:lineRule="auto"/>
-        <w:jc w:val="both"/>
+        <w:jc w:val="center"/>
+        <w:rPr>
+          <w:rFonts w:eastAsia="宋体"/>
+          <w:color w:val="000000" w:themeColor="text1"/>
+          <w:lang w:val="en-US" w:eastAsia="zh-CN"/>
+        </w:rPr>
+      </w:pPr>
+    </w:p>
+    <w:p>
+      <w:pPr>
+        <w:spacing w:line="259" w:lineRule="auto"/>
+        <w:jc w:val="center"/>
         <w:rPr>
           <w:rFonts w:eastAsia="宋体"/>
           <w:color w:val="000000" w:themeColor="text1"/>
@@ -6461,7 +7078,7 @@
           </mc:Choice>
           <mc:Fallback>
             <w:pict>
-              <v:shape w14:anchorId="467B6BBE" id="直接箭头连接符 10" o:spid="_x0000_s1026" type="#_x0000_t32" style="position:absolute;margin-left:69.15pt;margin-top:6.2pt;width:.35pt;height:15.75pt;z-index:251796480;visibility:visible;mso-wrap-style:square;mso-wrap-distance-left:9pt;mso-wrap-distance-top:0;mso-wrap-distance-right:9pt;mso-wrap-distance-bottom:0;mso-position-horizontal:absolute;mso-position-horizontal-relative:text;mso-position-vertical:absolute;mso-position-vertical-relative:text" o:gfxdata="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" strokecolor="#4472c4 [3204]" strokeweight=".5pt">
+              <v:shape w14:anchorId="35FE2CBE" id="直接箭头连接符 10" o:spid="_x0000_s1026" type="#_x0000_t32" style="position:absolute;margin-left:69.15pt;margin-top:6.2pt;width:.35pt;height:15.75pt;z-index:251796480;visibility:visible;mso-wrap-style:square;mso-wrap-distance-left:9pt;mso-wrap-distance-top:0;mso-wrap-distance-right:9pt;mso-wrap-distance-bottom:0;mso-position-horizontal:absolute;mso-position-horizontal-relative:text;mso-position-vertical:absolute;mso-position-vertical-relative:text" o:gfxdata="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" strokecolor="#4472c4 [3204]" strokeweight=".5pt">
                 <v:stroke endarrow="block" joinstyle="miter"/>
               </v:shape>
             </w:pict>
@@ -6472,7 +7089,7 @@
     <w:p>
       <w:pPr>
         <w:spacing w:line="259" w:lineRule="auto"/>
-        <w:jc w:val="both"/>
+        <w:jc w:val="center"/>
         <w:rPr>
           <w:rFonts w:eastAsia="宋体"/>
           <w:color w:val="000000" w:themeColor="text1"/>
@@ -6601,18 +7218,18 @@
     <w:p>
       <w:pPr>
         <w:spacing w:line="259" w:lineRule="auto"/>
-        <w:jc w:val="both"/>
-        <w:rPr>
-          <w:rFonts w:eastAsia="宋体"/>
-          <w:color w:val="000000" w:themeColor="text1"/>
-          <w:lang w:val="en-US" w:eastAsia="zh-CN"/>
-        </w:rPr>
-      </w:pPr>
-    </w:p>
-    <w:p>
-      <w:pPr>
-        <w:spacing w:line="259" w:lineRule="auto"/>
-        <w:jc w:val="both"/>
+        <w:jc w:val="center"/>
+        <w:rPr>
+          <w:rFonts w:eastAsia="宋体"/>
+          <w:color w:val="000000" w:themeColor="text1"/>
+          <w:lang w:val="en-US" w:eastAsia="zh-CN"/>
+        </w:rPr>
+      </w:pPr>
+    </w:p>
+    <w:p>
+      <w:pPr>
+        <w:spacing w:line="259" w:lineRule="auto"/>
+        <w:jc w:val="center"/>
         <w:rPr>
           <w:rFonts w:eastAsia="宋体"/>
           <w:color w:val="000000" w:themeColor="text1"/>
@@ -6796,7 +7413,7 @@
           </mc:Choice>
           <mc:Fallback>
             <w:pict>
-              <v:shape w14:anchorId="53B621CE" id="直接箭头连接符 10" o:spid="_x0000_s1026" type="#_x0000_t32" style="position:absolute;margin-left:69pt;margin-top:.65pt;width:.35pt;height:15.75pt;z-index:251809792;visibility:visible;mso-wrap-style:square;mso-wrap-distance-left:9pt;mso-wrap-distance-top:0;mso-wrap-distance-right:9pt;mso-wrap-distance-bottom:0;mso-position-horizontal:absolute;mso-position-horizontal-relative:text;mso-position-vertical:absolute;mso-position-vertical-relative:text" o:gfxdata="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" strokecolor="#4472c4 [3204]" strokeweight=".5pt">
+              <v:shape w14:anchorId="64AC0BE9" id="直接箭头连接符 10" o:spid="_x0000_s1026" type="#_x0000_t32" style="position:absolute;margin-left:69pt;margin-top:.65pt;width:.35pt;height:15.75pt;z-index:251809792;visibility:visible;mso-wrap-style:square;mso-wrap-distance-left:9pt;mso-wrap-distance-top:0;mso-wrap-distance-right:9pt;mso-wrap-distance-bottom:0;mso-position-horizontal:absolute;mso-position-horizontal-relative:text;mso-position-vertical:absolute;mso-position-vertical-relative:text" o:gfxdata="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" strokecolor="#4472c4 [3204]" strokeweight=".5pt">
                 <v:stroke endarrow="block" joinstyle="miter"/>
               </v:shape>
             </w:pict>
@@ -6807,7 +7424,7 @@
     <w:p>
       <w:pPr>
         <w:spacing w:line="259" w:lineRule="auto"/>
-        <w:jc w:val="both"/>
+        <w:jc w:val="center"/>
         <w:rPr>
           <w:rFonts w:eastAsia="宋体"/>
           <w:b/>
@@ -6820,7 +7437,7 @@
     <w:p>
       <w:pPr>
         <w:spacing w:line="259" w:lineRule="auto"/>
-        <w:jc w:val="both"/>
+        <w:jc w:val="center"/>
         <w:rPr>
           <w:rFonts w:eastAsia="宋体"/>
           <w:color w:val="000000" w:themeColor="text1"/>
@@ -7003,7 +7620,7 @@
           </mc:Choice>
           <mc:Fallback>
             <w:pict>
-              <v:shape w14:anchorId="4BE95515" id="直接箭头连接符 10" o:spid="_x0000_s1026" type="#_x0000_t32" style="position:absolute;margin-left:68.9pt;margin-top:.3pt;width:.35pt;height:15.75pt;z-index:251811840;visibility:visible;mso-wrap-style:square;mso-wrap-distance-left:9pt;mso-wrap-distance-top:0;mso-wrap-distance-right:9pt;mso-wrap-distance-bottom:0;mso-position-horizontal:absolute;mso-position-horizontal-relative:text;mso-position-vertical:absolute;mso-position-vertical-relative:text" o:gfxdata="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" strokecolor="#4472c4 [3204]" strokeweight=".5pt">
+              <v:shape w14:anchorId="19A7F602" id="直接箭头连接符 10" o:spid="_x0000_s1026" type="#_x0000_t32" style="position:absolute;margin-left:68.9pt;margin-top:.3pt;width:.35pt;height:15.75pt;z-index:251811840;visibility:visible;mso-wrap-style:square;mso-wrap-distance-left:9pt;mso-wrap-distance-top:0;mso-wrap-distance-right:9pt;mso-wrap-distance-bottom:0;mso-position-horizontal:absolute;mso-position-horizontal-relative:text;mso-position-vertical:absolute;mso-position-vertical-relative:text" o:gfxdata="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" strokecolor="#4472c4 [3204]" strokeweight=".5pt">
                 <v:stroke endarrow="block" joinstyle="miter"/>
               </v:shape>
             </w:pict>
@@ -7014,7 +7631,7 @@
     <w:p>
       <w:pPr>
         <w:spacing w:line="259" w:lineRule="auto"/>
-        <w:jc w:val="both"/>
+        <w:jc w:val="center"/>
         <w:rPr>
           <w:rFonts w:eastAsia="宋体"/>
           <w:color w:val="000000" w:themeColor="text1"/>
@@ -7031,16 +7648,16 @@
         <mc:AlternateContent>
           <mc:Choice Requires="wps">
             <w:drawing>
-              <wp:anchor distT="0" distB="0" distL="114300" distR="114300" simplePos="0" relativeHeight="251804672" behindDoc="0" locked="0" layoutInCell="1" allowOverlap="1" wp14:anchorId="0AEB3AC7" wp14:editId="7D3AAB52">
+              <wp:anchor distT="0" distB="0" distL="114300" distR="114300" simplePos="0" relativeHeight="251804672" behindDoc="0" locked="0" layoutInCell="1" allowOverlap="1" wp14:anchorId="0AEB3AC7" wp14:editId="00F96158">
                 <wp:simplePos x="0" y="0"/>
                 <wp:positionH relativeFrom="column">
-                  <wp:posOffset>2622395</wp:posOffset>
+                  <wp:posOffset>2596709</wp:posOffset>
                 </wp:positionH>
                 <wp:positionV relativeFrom="paragraph">
-                  <wp:posOffset>102511</wp:posOffset>
+                  <wp:posOffset>33848</wp:posOffset>
                 </wp:positionV>
-                <wp:extent cx="979170" cy="284672"/>
-                <wp:effectExtent l="0" t="0" r="11430" b="20320"/>
+                <wp:extent cx="922352" cy="516835"/>
+                <wp:effectExtent l="0" t="0" r="11430" b="17145"/>
                 <wp:wrapNone/>
                 <wp:docPr id="1660186533" name="矩形 16"/>
                 <wp:cNvGraphicFramePr/>
@@ -7051,7 +7668,7 @@
                       <wps:spPr>
                         <a:xfrm>
                           <a:off x="0" y="0"/>
-                          <a:ext cx="979170" cy="284672"/>
+                          <a:ext cx="922352" cy="516835"/>
                         </a:xfrm>
                         <a:prstGeom prst="rect">
                           <a:avLst/>
@@ -7088,7 +7705,14 @@
                                 <w:rFonts w:eastAsia="等线" w:hint="eastAsia"/>
                                 <w:lang w:eastAsia="zh-CN"/>
                               </w:rPr>
-                              <w:t>Red LED on</w:t>
+                              <w:t xml:space="preserve">Red LED </w:t>
+                            </w:r>
+                            <w:r>
+                              <w:rPr>
+                                <w:rFonts w:eastAsia="等线" w:hint="eastAsia"/>
+                                <w:lang w:eastAsia="zh-CN"/>
+                              </w:rPr>
+                              <w:t>ON</w:t>
                             </w:r>
                           </w:p>
                         </w:txbxContent>
@@ -7102,6 +7726,9 @@
                     </wps:wsp>
                   </a:graphicData>
                 </a:graphic>
+                <wp14:sizeRelH relativeFrom="margin">
+                  <wp14:pctWidth>0</wp14:pctWidth>
+                </wp14:sizeRelH>
                 <wp14:sizeRelV relativeFrom="margin">
                   <wp14:pctHeight>0</wp14:pctHeight>
                 </wp14:sizeRelV>
@@ -7110,7 +7737,7 @@
           </mc:Choice>
           <mc:Fallback>
             <w:pict>
-              <v:rect w14:anchorId="0AEB3AC7" id="_x0000_s1056" style="position:absolute;left:0;text-align:left;margin-left:206.5pt;margin-top:8.05pt;width:77.1pt;height:22.4pt;z-index:251804672;visibility:visible;mso-wrap-style:square;mso-height-percent:0;mso-wrap-distance-left:9pt;mso-wrap-distance-top:0;mso-wrap-distance-right:9pt;mso-wrap-distance-bottom:0;mso-position-horizontal:absolute;mso-position-horizontal-relative:text;mso-position-vertical:absolute;mso-position-vertical-relative:text;mso-height-percent:0;mso-height-relative:margin;v-text-anchor:middle" o:gfxdata="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" fillcolor="#4472c4 [3204]" strokecolor="#09101d [484]" strokeweight="1pt">
+              <v:rect w14:anchorId="0AEB3AC7" id="_x0000_s1056" style="position:absolute;left:0;text-align:left;margin-left:204.45pt;margin-top:2.65pt;width:72.65pt;height:40.7pt;z-index:251804672;visibility:visible;mso-wrap-style:square;mso-width-percent:0;mso-height-percent:0;mso-wrap-distance-left:9pt;mso-wrap-distance-top:0;mso-wrap-distance-right:9pt;mso-wrap-distance-bottom:0;mso-position-horizontal:absolute;mso-position-horizontal-relative:text;mso-position-vertical:absolute;mso-position-vertical-relative:text;mso-width-percent:0;mso-height-percent:0;mso-width-relative:margin;mso-height-relative:margin;v-text-anchor:middle" o:gfxdata="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" fillcolor="#4472c4 [3204]" strokecolor="#09101d [484]" strokeweight="1pt">
                 <v:textbox>
                   <w:txbxContent>
                     <w:p>
@@ -7126,7 +7753,14 @@
                           <w:rFonts w:eastAsia="等线" w:hint="eastAsia"/>
                           <w:lang w:eastAsia="zh-CN"/>
                         </w:rPr>
-                        <w:t>Red LED on</w:t>
+                        <w:t xml:space="preserve">Red LED </w:t>
+                      </w:r>
+                      <w:r>
+                        <w:rPr>
+                          <w:rFonts w:eastAsia="等线" w:hint="eastAsia"/>
+                          <w:lang w:eastAsia="zh-CN"/>
+                        </w:rPr>
+                        <w:t>ON</w:t>
                       </w:r>
                     </w:p>
                   </w:txbxContent>
@@ -7198,7 +7832,7 @@
           </mc:Choice>
           <mc:Fallback>
             <w:pict>
-              <v:shape w14:anchorId="3BB2B472" id="直接箭头连接符 15" o:spid="_x0000_s1026" type="#_x0000_t32" style="position:absolute;margin-left:139.8pt;margin-top:19.4pt;width:63.1pt;height:.45pt;flip:y;z-index:251803648;visibility:visible;mso-wrap-style:square;mso-wrap-distance-left:9pt;mso-wrap-distance-top:0;mso-wrap-distance-right:9pt;mso-wrap-distance-bottom:0;mso-position-horizontal:absolute;mso-position-horizontal-relative:text;mso-position-vertical:absolute;mso-position-vertical-relative:text" o:gfxdata="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" strokecolor="#4472c4 [3204]" strokeweight=".5pt">
+              <v:shape w14:anchorId="124B5C3D" id="直接箭头连接符 15" o:spid="_x0000_s1026" type="#_x0000_t32" style="position:absolute;margin-left:139.8pt;margin-top:19.4pt;width:63.1pt;height:.45pt;flip:y;z-index:251803648;visibility:visible;mso-wrap-style:square;mso-wrap-distance-left:9pt;mso-wrap-distance-top:0;mso-wrap-distance-right:9pt;mso-wrap-distance-bottom:0;mso-position-horizontal:absolute;mso-position-horizontal-relative:text;mso-position-vertical:absolute;mso-position-vertical-relative:text" o:gfxdata="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" strokecolor="#4472c4 [3204]" strokeweight=".5pt">
                 <v:stroke endarrow="block" joinstyle="miter"/>
               </v:shape>
             </w:pict>
@@ -7335,18 +7969,18 @@
     <w:p>
       <w:pPr>
         <w:spacing w:line="259" w:lineRule="auto"/>
-        <w:jc w:val="both"/>
-        <w:rPr>
-          <w:rFonts w:eastAsia="宋体"/>
-          <w:color w:val="000000" w:themeColor="text1"/>
-          <w:lang w:val="en-US" w:eastAsia="zh-CN"/>
-        </w:rPr>
-      </w:pPr>
-    </w:p>
-    <w:p>
-      <w:pPr>
-        <w:spacing w:line="259" w:lineRule="auto"/>
-        <w:jc w:val="both"/>
+        <w:jc w:val="center"/>
+        <w:rPr>
+          <w:rFonts w:eastAsia="宋体"/>
+          <w:color w:val="000000" w:themeColor="text1"/>
+          <w:lang w:val="en-US" w:eastAsia="zh-CN"/>
+        </w:rPr>
+      </w:pPr>
+    </w:p>
+    <w:p>
+      <w:pPr>
+        <w:spacing w:line="259" w:lineRule="auto"/>
+        <w:jc w:val="center"/>
         <w:rPr>
           <w:rFonts w:eastAsia="宋体"/>
           <w:color w:val="000000" w:themeColor="text1"/>
@@ -7415,7 +8049,7 @@
           </mc:Choice>
           <mc:Fallback>
             <w:pict>
-              <v:shape w14:anchorId="6DA04562" id="直接箭头连接符 18" o:spid="_x0000_s1026" type="#_x0000_t32" style="position:absolute;margin-left:69.8pt;margin-top:4.8pt;width:.45pt;height:46.75pt;z-index:251812864;visibility:visible;mso-wrap-style:square;mso-wrap-distance-left:9pt;mso-wrap-distance-top:0;mso-wrap-distance-right:9pt;mso-wrap-distance-bottom:0;mso-position-horizontal:absolute;mso-position-horizontal-relative:text;mso-position-vertical:absolute;mso-position-vertical-relative:text" o:gfxdata="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" strokecolor="#4472c4 [3204]" strokeweight=".5pt">
+              <v:shape w14:anchorId="6DC345EC" id="直接箭头连接符 18" o:spid="_x0000_s1026" type="#_x0000_t32" style="position:absolute;margin-left:69.8pt;margin-top:4.8pt;width:.45pt;height:46.75pt;z-index:251812864;visibility:visible;mso-wrap-style:square;mso-wrap-distance-left:9pt;mso-wrap-distance-top:0;mso-wrap-distance-right:9pt;mso-wrap-distance-bottom:0;mso-position-horizontal:absolute;mso-position-horizontal-relative:text;mso-position-vertical:absolute;mso-position-vertical-relative:text" o:gfxdata="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" strokecolor="#4472c4 [3204]" strokeweight=".5pt">
                 <v:stroke endarrow="block" joinstyle="miter"/>
               </v:shape>
             </w:pict>
@@ -7574,24 +8208,171 @@
     <w:p>
       <w:pPr>
         <w:spacing w:line="259" w:lineRule="auto"/>
-        <w:jc w:val="both"/>
-        <w:rPr>
-          <w:rFonts w:eastAsia="宋体"/>
-          <w:color w:val="000000" w:themeColor="text1"/>
-          <w:lang w:val="en-US" w:eastAsia="zh-CN"/>
-        </w:rPr>
-      </w:pPr>
-    </w:p>
-    <w:p>
-      <w:pPr>
-        <w:spacing w:line="259" w:lineRule="auto"/>
-        <w:jc w:val="both"/>
-        <w:rPr>
-          <w:rFonts w:eastAsia="宋体"/>
-          <w:color w:val="000000" w:themeColor="text1"/>
-          <w:lang w:val="en-US" w:eastAsia="zh-CN"/>
-        </w:rPr>
-      </w:pPr>
+        <w:jc w:val="center"/>
+        <w:rPr>
+          <w:rFonts w:eastAsia="宋体"/>
+          <w:color w:val="000000" w:themeColor="text1"/>
+          <w:lang w:val="en-US" w:eastAsia="zh-CN"/>
+        </w:rPr>
+      </w:pPr>
+    </w:p>
+    <w:p>
+      <w:pPr>
+        <w:spacing w:line="259" w:lineRule="auto"/>
+        <w:jc w:val="center"/>
+        <w:rPr>
+          <w:rFonts w:eastAsia="宋体"/>
+          <w:color w:val="000000" w:themeColor="text1"/>
+          <w:lang w:val="en-US" w:eastAsia="zh-CN"/>
+        </w:rPr>
+      </w:pPr>
+      <w:r>
+        <w:rPr>
+          <w:rFonts w:eastAsia="宋体"/>
+          <w:noProof/>
+          <w:color w:val="000000" w:themeColor="text1"/>
+          <w:lang w:val="en-US" w:eastAsia="zh-CN"/>
+        </w:rPr>
+        <mc:AlternateContent>
+          <mc:Choice Requires="wps">
+            <w:drawing>
+              <wp:anchor distT="0" distB="0" distL="114300" distR="114300" simplePos="0" relativeHeight="251801600" behindDoc="0" locked="0" layoutInCell="1" allowOverlap="1" wp14:anchorId="6CD36DE9" wp14:editId="5928D799">
+                <wp:simplePos x="0" y="0"/>
+                <wp:positionH relativeFrom="margin">
+                  <wp:posOffset>1237</wp:posOffset>
+                </wp:positionH>
+                <wp:positionV relativeFrom="paragraph">
+                  <wp:posOffset>126810</wp:posOffset>
+                </wp:positionV>
+                <wp:extent cx="1797875" cy="693420"/>
+                <wp:effectExtent l="19050" t="19050" r="12065" b="30480"/>
+                <wp:wrapNone/>
+                <wp:docPr id="594733938" name="流程图: 决策 9"/>
+                <wp:cNvGraphicFramePr/>
+                <a:graphic xmlns:a="http://schemas.openxmlformats.org/drawingml/2006/main">
+                  <a:graphicData uri="http://schemas.microsoft.com/office/word/2010/wordprocessingShape">
+                    <wps:wsp>
+                      <wps:cNvSpPr/>
+                      <wps:spPr>
+                        <a:xfrm>
+                          <a:off x="0" y="0"/>
+                          <a:ext cx="1797875" cy="693420"/>
+                        </a:xfrm>
+                        <a:prstGeom prst="flowChartDecision">
+                          <a:avLst/>
+                        </a:prstGeom>
+                      </wps:spPr>
+                      <wps:style>
+                        <a:lnRef idx="2">
+                          <a:schemeClr val="accent1">
+                            <a:shade val="15000"/>
+                          </a:schemeClr>
+                        </a:lnRef>
+                        <a:fillRef idx="1">
+                          <a:schemeClr val="accent1"/>
+                        </a:fillRef>
+                        <a:effectRef idx="0">
+                          <a:schemeClr val="accent1"/>
+                        </a:effectRef>
+                        <a:fontRef idx="minor">
+                          <a:schemeClr val="lt1"/>
+                        </a:fontRef>
+                      </wps:style>
+                      <wps:txbx>
+                        <w:txbxContent>
+                          <w:p>
+                            <w:pPr>
+                              <w:jc w:val="center"/>
+                              <w:rPr>
+                                <w:rFonts w:eastAsia="等线" w:hint="eastAsia"/>
+                                <w:lang w:eastAsia="zh-CN"/>
+                              </w:rPr>
+                            </w:pPr>
+                            <w:r>
+                              <w:rPr>
+                                <w:rFonts w:eastAsia="等线" w:hint="eastAsia"/>
+                                <w:lang w:eastAsia="zh-CN"/>
+                              </w:rPr>
+                              <w:t>Is rate&lt;</w:t>
+                            </w:r>
+                            <w:r>
+                              <w:rPr>
+                                <w:rFonts w:eastAsia="等线" w:hint="eastAsia"/>
+                                <w:lang w:eastAsia="zh-CN"/>
+                              </w:rPr>
+                              <w:t>-</w:t>
+                            </w:r>
+                            <w:r>
+                              <w:rPr>
+                                <w:rFonts w:eastAsia="等线" w:hint="eastAsia"/>
+                                <w:lang w:eastAsia="zh-CN"/>
+                              </w:rPr>
+                              <w:t>4?</w:t>
+                            </w:r>
+                          </w:p>
+                        </w:txbxContent>
+                      </wps:txbx>
+                      <wps:bodyPr rot="0" spcFirstLastPara="0" vertOverflow="overflow" horzOverflow="overflow" vert="horz" wrap="square" lIns="91440" tIns="45720" rIns="91440" bIns="45720" numCol="1" spcCol="0" rtlCol="0" fromWordArt="0" anchor="ctr" anchorCtr="0" forceAA="0" compatLnSpc="1">
+                        <a:prstTxWarp prst="textNoShape">
+                          <a:avLst/>
+                        </a:prstTxWarp>
+                        <a:noAutofit/>
+                      </wps:bodyPr>
+                    </wps:wsp>
+                  </a:graphicData>
+                </a:graphic>
+                <wp14:sizeRelH relativeFrom="margin">
+                  <wp14:pctWidth>0</wp14:pctWidth>
+                </wp14:sizeRelH>
+                <wp14:sizeRelV relativeFrom="margin">
+                  <wp14:pctHeight>0</wp14:pctHeight>
+                </wp14:sizeRelV>
+              </wp:anchor>
+            </w:drawing>
+          </mc:Choice>
+          <mc:Fallback>
+            <w:pict>
+              <v:shape w14:anchorId="6CD36DE9" id="_x0000_s1059" type="#_x0000_t110" style="position:absolute;left:0;text-align:left;margin-left:.1pt;margin-top:10pt;width:141.55pt;height:54.6pt;z-index:251801600;visibility:visible;mso-wrap-style:square;mso-width-percent:0;mso-height-percent:0;mso-wrap-distance-left:9pt;mso-wrap-distance-top:0;mso-wrap-distance-right:9pt;mso-wrap-distance-bottom:0;mso-position-horizontal:absolute;mso-position-horizontal-relative:margin;mso-position-vertical:absolute;mso-position-vertical-relative:text;mso-width-percent:0;mso-height-percent:0;mso-width-relative:margin;mso-height-relative:margin;v-text-anchor:middle" o:gfxdata="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" fillcolor="#4472c4 [3204]" strokecolor="#09101d [484]" strokeweight="1pt">
+                <v:textbox>
+                  <w:txbxContent>
+                    <w:p>
+                      <w:pPr>
+                        <w:jc w:val="center"/>
+                        <w:rPr>
+                          <w:rFonts w:eastAsia="等线" w:hint="eastAsia"/>
+                          <w:lang w:eastAsia="zh-CN"/>
+                        </w:rPr>
+                      </w:pPr>
+                      <w:r>
+                        <w:rPr>
+                          <w:rFonts w:eastAsia="等线" w:hint="eastAsia"/>
+                          <w:lang w:eastAsia="zh-CN"/>
+                        </w:rPr>
+                        <w:t>Is rate&lt;</w:t>
+                      </w:r>
+                      <w:r>
+                        <w:rPr>
+                          <w:rFonts w:eastAsia="等线" w:hint="eastAsia"/>
+                          <w:lang w:eastAsia="zh-CN"/>
+                        </w:rPr>
+                        <w:t>-</w:t>
+                      </w:r>
+                      <w:r>
+                        <w:rPr>
+                          <w:rFonts w:eastAsia="等线" w:hint="eastAsia"/>
+                          <w:lang w:eastAsia="zh-CN"/>
+                        </w:rPr>
+                        <w:t>4?</w:t>
+                      </w:r>
+                    </w:p>
+                  </w:txbxContent>
+                </v:textbox>
+                <w10:wrap anchorx="margin"/>
+              </v:shape>
+            </w:pict>
+          </mc:Fallback>
+        </mc:AlternateContent>
+      </w:r>
       <w:r>
         <w:rPr>
           <w:rFonts w:eastAsia="宋体"/>
@@ -7659,7 +8440,14 @@
                                 <w:rFonts w:eastAsia="等线" w:hint="eastAsia"/>
                                 <w:lang w:eastAsia="zh-CN"/>
                               </w:rPr>
-                              <w:t>Yellow LED on</w:t>
+                              <w:t xml:space="preserve">Yellow LED </w:t>
+                            </w:r>
+                            <w:r>
+                              <w:rPr>
+                                <w:rFonts w:eastAsia="等线" w:hint="eastAsia"/>
+                                <w:lang w:eastAsia="zh-CN"/>
+                              </w:rPr>
+                              <w:t>ON</w:t>
                             </w:r>
                             <w:r>
                               <w:rPr>
@@ -7736,7 +8524,7 @@
           </mc:Choice>
           <mc:Fallback>
             <w:pict>
-              <v:rect w14:anchorId="459AB32A" id="_x0000_s1059" style="position:absolute;left:0;text-align:left;margin-left:207.95pt;margin-top:14.15pt;width:77.15pt;height:39.25pt;z-index:251799552;visibility:visible;mso-wrap-style:square;mso-height-percent:0;mso-wrap-distance-left:9pt;mso-wrap-distance-top:0;mso-wrap-distance-right:9pt;mso-wrap-distance-bottom:0;mso-position-horizontal:absolute;mso-position-horizontal-relative:text;mso-position-vertical:absolute;mso-position-vertical-relative:text;mso-height-percent:0;mso-height-relative:margin;v-text-anchor:middle" o:gfxdata="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" fillcolor="#4472c4 [3204]" strokecolor="#09101d [484]" strokeweight="1pt">
+              <v:rect w14:anchorId="459AB32A" id="_x0000_s1060" style="position:absolute;left:0;text-align:left;margin-left:207.95pt;margin-top:14.15pt;width:77.15pt;height:39.25pt;z-index:251799552;visibility:visible;mso-wrap-style:square;mso-height-percent:0;mso-wrap-distance-left:9pt;mso-wrap-distance-top:0;mso-wrap-distance-right:9pt;mso-wrap-distance-bottom:0;mso-position-horizontal:absolute;mso-position-horizontal-relative:text;mso-position-vertical:absolute;mso-position-vertical-relative:text;mso-height-percent:0;mso-height-relative:margin;v-text-anchor:middle" o:gfxdata="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" fillcolor="#4472c4 [3204]" strokecolor="#09101d [484]" strokeweight="1pt">
                 <v:textbox>
                   <w:txbxContent>
                     <w:p>
@@ -7752,7 +8540,14 @@
                           <w:rFonts w:eastAsia="等线" w:hint="eastAsia"/>
                           <w:lang w:eastAsia="zh-CN"/>
                         </w:rPr>
-                        <w:t>Yellow LED on</w:t>
+                        <w:t xml:space="preserve">Yellow LED </w:t>
+                      </w:r>
+                      <w:r>
+                        <w:rPr>
+                          <w:rFonts w:eastAsia="等线" w:hint="eastAsia"/>
+                          <w:lang w:eastAsia="zh-CN"/>
+                        </w:rPr>
+                        <w:t>ON</w:t>
                       </w:r>
                       <w:r>
                         <w:rPr>
@@ -7827,7 +8622,7 @@
         <mc:AlternateContent>
           <mc:Choice Requires="wps">
             <w:drawing>
-              <wp:anchor distT="0" distB="0" distL="114300" distR="114300" simplePos="0" relativeHeight="251797504" behindDoc="0" locked="0" layoutInCell="1" allowOverlap="1" wp14:anchorId="34AA2F87" wp14:editId="7FEE1CCA">
+              <wp:anchor distT="0" distB="0" distL="114300" distR="114300" simplePos="0" relativeHeight="251797504" behindDoc="0" locked="0" layoutInCell="1" allowOverlap="1" wp14:anchorId="34AA2F87" wp14:editId="080C89BD">
                 <wp:simplePos x="0" y="0"/>
                 <wp:positionH relativeFrom="column">
                   <wp:posOffset>1935731</wp:posOffset>
@@ -7913,7 +8708,7 @@
           </mc:Choice>
           <mc:Fallback>
             <w:pict>
-              <v:rect w14:anchorId="34AA2F87" id="_x0000_s1060" style="position:absolute;left:0;text-align:left;margin-left:152.4pt;margin-top:14.8pt;width:32.75pt;height:17.3pt;z-index:251797504;visibility:visible;mso-wrap-style:square;mso-width-percent:0;mso-height-percent:0;mso-wrap-distance-left:9pt;mso-wrap-distance-top:0;mso-wrap-distance-right:9pt;mso-wrap-distance-bottom:0;mso-position-horizontal:absolute;mso-position-horizontal-relative:text;mso-position-vertical:absolute;mso-position-vertical-relative:text;mso-width-percent:0;mso-height-percent:0;mso-width-relative:margin;mso-height-relative:margin;v-text-anchor:middle" o:gfxdata="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" fillcolor="#4472c4 [3204]" strokecolor="#09101d [484]" strokeweight="1pt">
+              <v:rect w14:anchorId="34AA2F87" id="_x0000_s1061" style="position:absolute;left:0;text-align:left;margin-left:152.4pt;margin-top:14.8pt;width:32.75pt;height:17.3pt;z-index:251797504;visibility:visible;mso-wrap-style:square;mso-width-percent:0;mso-height-percent:0;mso-wrap-distance-left:9pt;mso-wrap-distance-top:0;mso-wrap-distance-right:9pt;mso-wrap-distance-bottom:0;mso-position-horizontal:absolute;mso-position-horizontal-relative:text;mso-position-vertical:absolute;mso-position-vertical-relative:text;mso-width-percent:0;mso-height-percent:0;mso-width-relative:margin;mso-height-relative:margin;v-text-anchor:middle" o:gfxdata="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" fillcolor="#4472c4 [3204]" strokecolor="#09101d [484]" strokeweight="1pt">
                 <v:textbox>
                   <w:txbxContent>
                     <w:p>
@@ -7943,129 +8738,11 @@
           </mc:Fallback>
         </mc:AlternateContent>
       </w:r>
-      <w:r>
-        <w:rPr>
-          <w:rFonts w:eastAsia="宋体"/>
-          <w:noProof/>
-          <w:color w:val="000000" w:themeColor="text1"/>
-          <w:lang w:val="en-US" w:eastAsia="zh-CN"/>
-        </w:rPr>
-        <mc:AlternateContent>
-          <mc:Choice Requires="wps">
-            <w:drawing>
-              <wp:anchor distT="0" distB="0" distL="114300" distR="114300" simplePos="0" relativeHeight="251801600" behindDoc="0" locked="0" layoutInCell="1" allowOverlap="1" wp14:anchorId="6CD36DE9" wp14:editId="062C7FA8">
-                <wp:simplePos x="0" y="0"/>
-                <wp:positionH relativeFrom="column">
-                  <wp:posOffset>70581</wp:posOffset>
-                </wp:positionH>
-                <wp:positionV relativeFrom="paragraph">
-                  <wp:posOffset>117212</wp:posOffset>
-                </wp:positionV>
-                <wp:extent cx="1680353" cy="693420"/>
-                <wp:effectExtent l="19050" t="19050" r="15240" b="30480"/>
-                <wp:wrapNone/>
-                <wp:docPr id="594733938" name="流程图: 决策 9"/>
-                <wp:cNvGraphicFramePr/>
-                <a:graphic xmlns:a="http://schemas.openxmlformats.org/drawingml/2006/main">
-                  <a:graphicData uri="http://schemas.microsoft.com/office/word/2010/wordprocessingShape">
-                    <wps:wsp>
-                      <wps:cNvSpPr/>
-                      <wps:spPr>
-                        <a:xfrm>
-                          <a:off x="0" y="0"/>
-                          <a:ext cx="1680353" cy="693420"/>
-                        </a:xfrm>
-                        <a:prstGeom prst="flowChartDecision">
-                          <a:avLst/>
-                        </a:prstGeom>
-                      </wps:spPr>
-                      <wps:style>
-                        <a:lnRef idx="2">
-                          <a:schemeClr val="accent1">
-                            <a:shade val="15000"/>
-                          </a:schemeClr>
-                        </a:lnRef>
-                        <a:fillRef idx="1">
-                          <a:schemeClr val="accent1"/>
-                        </a:fillRef>
-                        <a:effectRef idx="0">
-                          <a:schemeClr val="accent1"/>
-                        </a:effectRef>
-                        <a:fontRef idx="minor">
-                          <a:schemeClr val="lt1"/>
-                        </a:fontRef>
-                      </wps:style>
-                      <wps:txbx>
-                        <w:txbxContent>
-                          <w:p>
-                            <w:pPr>
-                              <w:jc w:val="center"/>
-                              <w:rPr>
-                                <w:rFonts w:eastAsia="等线" w:hint="eastAsia"/>
-                                <w:lang w:eastAsia="zh-CN"/>
-                              </w:rPr>
-                            </w:pPr>
-                            <w:r>
-                              <w:rPr>
-                                <w:rFonts w:eastAsia="等线" w:hint="eastAsia"/>
-                                <w:lang w:eastAsia="zh-CN"/>
-                              </w:rPr>
-                              <w:t>Is rate&lt;4?</w:t>
-                            </w:r>
-                          </w:p>
-                        </w:txbxContent>
-                      </wps:txbx>
-                      <wps:bodyPr rot="0" spcFirstLastPara="0" vertOverflow="overflow" horzOverflow="overflow" vert="horz" wrap="square" lIns="91440" tIns="45720" rIns="91440" bIns="45720" numCol="1" spcCol="0" rtlCol="0" fromWordArt="0" anchor="ctr" anchorCtr="0" forceAA="0" compatLnSpc="1">
-                        <a:prstTxWarp prst="textNoShape">
-                          <a:avLst/>
-                        </a:prstTxWarp>
-                        <a:noAutofit/>
-                      </wps:bodyPr>
-                    </wps:wsp>
-                  </a:graphicData>
-                </a:graphic>
-                <wp14:sizeRelH relativeFrom="margin">
-                  <wp14:pctWidth>0</wp14:pctWidth>
-                </wp14:sizeRelH>
-                <wp14:sizeRelV relativeFrom="margin">
-                  <wp14:pctHeight>0</wp14:pctHeight>
-                </wp14:sizeRelV>
-              </wp:anchor>
-            </w:drawing>
-          </mc:Choice>
-          <mc:Fallback>
-            <w:pict>
-              <v:shape w14:anchorId="6CD36DE9" id="_x0000_s1061" type="#_x0000_t110" style="position:absolute;left:0;text-align:left;margin-left:5.55pt;margin-top:9.25pt;width:132.3pt;height:54.6pt;z-index:251801600;visibility:visible;mso-wrap-style:square;mso-width-percent:0;mso-height-percent:0;mso-wrap-distance-left:9pt;mso-wrap-distance-top:0;mso-wrap-distance-right:9pt;mso-wrap-distance-bottom:0;mso-position-horizontal:absolute;mso-position-horizontal-relative:text;mso-position-vertical:absolute;mso-position-vertical-relative:text;mso-width-percent:0;mso-height-percent:0;mso-width-relative:margin;mso-height-relative:margin;v-text-anchor:middle" o:gfxdata="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" fillcolor="#4472c4 [3204]" strokecolor="#09101d [484]" strokeweight="1pt">
-                <v:textbox>
-                  <w:txbxContent>
-                    <w:p>
-                      <w:pPr>
-                        <w:jc w:val="center"/>
-                        <w:rPr>
-                          <w:rFonts w:eastAsia="等线" w:hint="eastAsia"/>
-                          <w:lang w:eastAsia="zh-CN"/>
-                        </w:rPr>
-                      </w:pPr>
-                      <w:r>
-                        <w:rPr>
-                          <w:rFonts w:eastAsia="等线" w:hint="eastAsia"/>
-                          <w:lang w:eastAsia="zh-CN"/>
-                        </w:rPr>
-                        <w:t>Is rate&lt;4?</w:t>
-                      </w:r>
-                    </w:p>
-                  </w:txbxContent>
-                </v:textbox>
-              </v:shape>
-            </w:pict>
-          </mc:Fallback>
-        </mc:AlternateContent>
-      </w:r>
-    </w:p>
-    <w:p>
-      <w:pPr>
-        <w:spacing w:line="259" w:lineRule="auto"/>
-        <w:jc w:val="both"/>
+    </w:p>
+    <w:p>
+      <w:pPr>
+        <w:spacing w:line="259" w:lineRule="auto"/>
+        <w:jc w:val="center"/>
         <w:rPr>
           <w:rFonts w:eastAsia="宋体"/>
           <w:color w:val="000000" w:themeColor="text1"/>
@@ -8134,7 +8811,7 @@
           </mc:Choice>
           <mc:Fallback>
             <w:pict>
-              <v:shape w14:anchorId="05E5750A" id="直接箭头连接符 15" o:spid="_x0000_s1026" type="#_x0000_t32" style="position:absolute;margin-left:140.15pt;margin-top:14.7pt;width:63.1pt;height:.45pt;flip:y;z-index:251798528;visibility:visible;mso-wrap-style:square;mso-wrap-distance-left:9pt;mso-wrap-distance-top:0;mso-wrap-distance-right:9pt;mso-wrap-distance-bottom:0;mso-position-horizontal:absolute;mso-position-horizontal-relative:text;mso-position-vertical:absolute;mso-position-vertical-relative:text" o:gfxdata="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" strokecolor="#4472c4 [3204]" strokeweight=".5pt">
+              <v:shape w14:anchorId="5F42760E" id="直接箭头连接符 15" o:spid="_x0000_s1026" type="#_x0000_t32" style="position:absolute;margin-left:140.15pt;margin-top:14.7pt;width:63.1pt;height:.45pt;flip:y;z-index:251798528;visibility:visible;mso-wrap-style:square;mso-wrap-distance-left:9pt;mso-wrap-distance-top:0;mso-wrap-distance-right:9pt;mso-wrap-distance-bottom:0;mso-position-horizontal:absolute;mso-position-horizontal-relative:text;mso-position-vertical:absolute;mso-position-vertical-relative:text" o:gfxdata="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" strokecolor="#4472c4 [3204]" strokeweight=".5pt">
                 <v:stroke endarrow="block" joinstyle="miter"/>
               </v:shape>
             </w:pict>
@@ -8145,18 +8822,18 @@
     <w:p>
       <w:pPr>
         <w:spacing w:line="259" w:lineRule="auto"/>
-        <w:jc w:val="both"/>
-        <w:rPr>
-          <w:rFonts w:eastAsia="宋体"/>
-          <w:color w:val="000000" w:themeColor="text1"/>
-          <w:lang w:val="en-US" w:eastAsia="zh-CN"/>
-        </w:rPr>
-      </w:pPr>
-    </w:p>
-    <w:p>
-      <w:pPr>
-        <w:spacing w:line="259" w:lineRule="auto"/>
-        <w:jc w:val="both"/>
+        <w:jc w:val="center"/>
+        <w:rPr>
+          <w:rFonts w:eastAsia="宋体"/>
+          <w:color w:val="000000" w:themeColor="text1"/>
+          <w:lang w:val="en-US" w:eastAsia="zh-CN"/>
+        </w:rPr>
+      </w:pPr>
+    </w:p>
+    <w:p>
+      <w:pPr>
+        <w:spacing w:line="259" w:lineRule="auto"/>
+        <w:jc w:val="center"/>
         <w:rPr>
           <w:rFonts w:eastAsia="宋体"/>
           <w:color w:val="000000" w:themeColor="text1"/>
@@ -8373,7 +9050,7 @@
           </mc:Choice>
           <mc:Fallback>
             <w:pict>
-              <v:shape w14:anchorId="7A115F4F" id="直接箭头连接符 18" o:spid="_x0000_s1026" type="#_x0000_t32" style="position:absolute;margin-left:70.05pt;margin-top:.5pt;width:.45pt;height:46.75pt;z-index:251806720;visibility:visible;mso-wrap-style:square;mso-wrap-distance-left:9pt;mso-wrap-distance-top:0;mso-wrap-distance-right:9pt;mso-wrap-distance-bottom:0;mso-position-horizontal:absolute;mso-position-horizontal-relative:text;mso-position-vertical:absolute;mso-position-vertical-relative:text" o:gfxdata="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" strokecolor="#4472c4 [3204]" strokeweight=".5pt">
+              <v:shape w14:anchorId="7CDF9FBB" id="直接箭头连接符 18" o:spid="_x0000_s1026" type="#_x0000_t32" style="position:absolute;margin-left:70.05pt;margin-top:.5pt;width:.45pt;height:46.75pt;z-index:251806720;visibility:visible;mso-wrap-style:square;mso-wrap-distance-left:9pt;mso-wrap-distance-top:0;mso-wrap-distance-right:9pt;mso-wrap-distance-bottom:0;mso-position-horizontal:absolute;mso-position-horizontal-relative:text;mso-position-vertical:absolute;mso-position-vertical-relative:text" o:gfxdata="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" strokecolor="#4472c4 [3204]" strokeweight=".5pt">
                 <v:stroke endarrow="block" joinstyle="miter"/>
               </v:shape>
             </w:pict>
@@ -8384,7 +9061,7 @@
     <w:p>
       <w:pPr>
         <w:spacing w:line="259" w:lineRule="auto"/>
-        <w:jc w:val="both"/>
+        <w:jc w:val="center"/>
         <w:rPr>
           <w:rFonts w:eastAsia="等线"/>
           <w:lang w:eastAsia="zh-CN"/>
@@ -8394,7 +9071,7 @@
     <w:p>
       <w:pPr>
         <w:spacing w:line="259" w:lineRule="auto"/>
-        <w:jc w:val="both"/>
+        <w:jc w:val="center"/>
         <w:rPr>
           <w:rFonts w:eastAsia="等线"/>
           <w:lang w:eastAsia="zh-CN"/>
@@ -8467,7 +9144,14 @@
                                 <w:rFonts w:eastAsia="等线" w:hint="eastAsia"/>
                                 <w:lang w:eastAsia="zh-CN"/>
                               </w:rPr>
-                              <w:t>Green LED on</w:t>
+                              <w:t xml:space="preserve">Green LED </w:t>
+                            </w:r>
+                            <w:r>
+                              <w:rPr>
+                                <w:rFonts w:eastAsia="等线" w:hint="eastAsia"/>
+                                <w:lang w:eastAsia="zh-CN"/>
+                              </w:rPr>
+                              <w:t>ON</w:t>
                             </w:r>
                             <w:r>
                               <w:rPr>
@@ -8560,7 +9244,14 @@
                           <w:rFonts w:eastAsia="等线" w:hint="eastAsia"/>
                           <w:lang w:eastAsia="zh-CN"/>
                         </w:rPr>
-                        <w:t>Green LED on</w:t>
+                        <w:t xml:space="preserve">Green LED </w:t>
+                      </w:r>
+                      <w:r>
+                        <w:rPr>
+                          <w:rFonts w:eastAsia="等线" w:hint="eastAsia"/>
+                          <w:lang w:eastAsia="zh-CN"/>
+                        </w:rPr>
+                        <w:t>ON</w:t>
                       </w:r>
                       <w:r>
                         <w:rPr>
@@ -8881,7 +9572,7 @@
     <w:p>
       <w:pPr>
         <w:spacing w:line="259" w:lineRule="auto"/>
-        <w:jc w:val="both"/>
+        <w:jc w:val="center"/>
         <w:rPr>
           <w:rFonts w:eastAsia="等线"/>
           <w:lang w:eastAsia="zh-CN"/>
@@ -8949,7 +9640,7 @@
           </mc:Choice>
           <mc:Fallback>
             <w:pict>
-              <v:shape w14:anchorId="797B2956" id="直接箭头连接符 15" o:spid="_x0000_s1026" type="#_x0000_t32" style="position:absolute;margin-left:156.65pt;margin-top:19.45pt;width:63.1pt;height:.45pt;flip:y;z-index:251815936;visibility:visible;mso-wrap-style:square;mso-wrap-distance-left:9pt;mso-wrap-distance-top:0;mso-wrap-distance-right:9pt;mso-wrap-distance-bottom:0;mso-position-horizontal:absolute;mso-position-horizontal-relative:text;mso-position-vertical:absolute;mso-position-vertical-relative:text" o:gfxdata="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" strokecolor="#4472c4 [3204]" strokeweight=".5pt">
+              <v:shape w14:anchorId="6525E45E" id="直接箭头连接符 15" o:spid="_x0000_s1026" type="#_x0000_t32" style="position:absolute;margin-left:156.65pt;margin-top:19.45pt;width:63.1pt;height:.45pt;flip:y;z-index:251815936;visibility:visible;mso-wrap-style:square;mso-wrap-distance-left:9pt;mso-wrap-distance-top:0;mso-wrap-distance-right:9pt;mso-wrap-distance-bottom:0;mso-position-horizontal:absolute;mso-position-horizontal-relative:text;mso-position-vertical:absolute;mso-position-vertical-relative:text" o:gfxdata="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" strokecolor="#4472c4 [3204]" strokeweight=".5pt">
                 <v:stroke endarrow="block" joinstyle="miter"/>
               </v:shape>
             </w:pict>
@@ -8960,7 +9651,7 @@
     <w:p>
       <w:pPr>
         <w:spacing w:line="259" w:lineRule="auto"/>
-        <w:jc w:val="both"/>
+        <w:jc w:val="center"/>
         <w:rPr>
           <w:rFonts w:eastAsia="等线"/>
           <w:lang w:eastAsia="zh-CN"/>
@@ -8970,7 +9661,7 @@
     <w:p>
       <w:pPr>
         <w:spacing w:line="259" w:lineRule="auto"/>
-        <w:jc w:val="both"/>
+        <w:jc w:val="center"/>
         <w:rPr>
           <w:rFonts w:eastAsia="等线"/>
           <w:lang w:eastAsia="zh-CN"/>
@@ -9038,7 +9729,7 @@
           </mc:Choice>
           <mc:Fallback>
             <w:pict>
-              <v:shape w14:anchorId="3638A0B2" id="直接箭头连接符 18" o:spid="_x0000_s1026" type="#_x0000_t32" style="position:absolute;margin-left:72.5pt;margin-top:13.45pt;width:.45pt;height:46.75pt;z-index:251817984;visibility:visible;mso-wrap-style:square;mso-wrap-distance-left:9pt;mso-wrap-distance-top:0;mso-wrap-distance-right:9pt;mso-wrap-distance-bottom:0;mso-position-horizontal:absolute;mso-position-horizontal-relative:text;mso-position-vertical:absolute;mso-position-vertical-relative:text" o:gfxdata="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" strokecolor="#4472c4 [3204]" strokeweight=".5pt">
+              <v:shape w14:anchorId="4FD6AD5D" id="直接箭头连接符 18" o:spid="_x0000_s1026" type="#_x0000_t32" style="position:absolute;margin-left:72.5pt;margin-top:13.45pt;width:.45pt;height:46.75pt;z-index:251817984;visibility:visible;mso-wrap-style:square;mso-wrap-distance-left:9pt;mso-wrap-distance-top:0;mso-wrap-distance-right:9pt;mso-wrap-distance-bottom:0;mso-position-horizontal:absolute;mso-position-horizontal-relative:text;mso-position-vertical:absolute;mso-position-vertical-relative:text" o:gfxdata="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" strokecolor="#4472c4 [3204]" strokeweight=".5pt">
                 <v:stroke endarrow="block" joinstyle="miter"/>
               </v:shape>
             </w:pict>
@@ -9049,7 +9740,7 @@
     <w:p>
       <w:pPr>
         <w:spacing w:line="259" w:lineRule="auto"/>
-        <w:jc w:val="both"/>
+        <w:jc w:val="center"/>
         <w:rPr>
           <w:rFonts w:eastAsia="等线"/>
           <w:lang w:eastAsia="zh-CN"/>
@@ -9207,7 +9898,7 @@
     <w:p>
       <w:pPr>
         <w:spacing w:line="259" w:lineRule="auto"/>
-        <w:jc w:val="both"/>
+        <w:jc w:val="center"/>
         <w:rPr>
           <w:rFonts w:eastAsia="等线" w:hint="eastAsia"/>
           <w:lang w:eastAsia="zh-CN"/>
@@ -9280,7 +9971,14 @@
                                 <w:rFonts w:eastAsia="等线" w:hint="eastAsia"/>
                                 <w:lang w:eastAsia="zh-CN"/>
                               </w:rPr>
-                              <w:t>LEDs off</w:t>
+                              <w:t xml:space="preserve">LEDs </w:t>
+                            </w:r>
+                            <w:r>
+                              <w:rPr>
+                                <w:rFonts w:eastAsia="等线" w:hint="eastAsia"/>
+                                <w:lang w:eastAsia="zh-CN"/>
+                              </w:rPr>
+                              <w:t>OFF</w:t>
                             </w:r>
                             <w:r>
                               <w:rPr>
@@ -9373,7 +10071,14 @@
                           <w:rFonts w:eastAsia="等线" w:hint="eastAsia"/>
                           <w:lang w:eastAsia="zh-CN"/>
                         </w:rPr>
-                        <w:t>LEDs off</w:t>
+                        <w:t xml:space="preserve">LEDs </w:t>
+                      </w:r>
+                      <w:r>
+                        <w:rPr>
+                          <w:rFonts w:eastAsia="等线" w:hint="eastAsia"/>
+                          <w:lang w:eastAsia="zh-CN"/>
+                        </w:rPr>
+                        <w:t>OFF</w:t>
                       </w:r>
                       <w:r>
                         <w:rPr>
@@ -9442,6 +10147,7 @@
     <w:p>
       <w:pPr>
         <w:spacing w:after="0" w:line="240" w:lineRule="auto"/>
+        <w:jc w:val="center"/>
         <w:rPr>
           <w:rFonts w:eastAsia="等线"/>
           <w:lang w:eastAsia="zh-CN"/>
@@ -9454,11 +10160,39 @@
         </w:rPr>
         <w:br w:type="page"/>
       </w:r>
-    </w:p>
-    <w:p>
-      <w:pPr>
-        <w:spacing w:line="259" w:lineRule="auto"/>
-        <w:jc w:val="both"/>
+      <w:r>
+        <w:rPr>
+          <w:rFonts w:eastAsia="等线"/>
+          <w:lang w:eastAsia="zh-CN"/>
+        </w:rPr>
+        <w:lastRenderedPageBreak/>
+        <w:t>Figure 10. Flowchart of the temperature prediction algorithm (Task 3a).</w:t>
+      </w:r>
+    </w:p>
+    <w:p>
+      <w:pPr>
+        <w:spacing w:after="0" w:line="240" w:lineRule="auto"/>
+        <w:jc w:val="center"/>
+        <w:rPr>
+          <w:rFonts w:eastAsia="等线"/>
+          <w:lang w:eastAsia="zh-CN"/>
+        </w:rPr>
+      </w:pPr>
+    </w:p>
+    <w:p>
+      <w:pPr>
+        <w:spacing w:after="0" w:line="240" w:lineRule="auto"/>
+        <w:jc w:val="center"/>
+        <w:rPr>
+          <w:rFonts w:eastAsia="等线" w:hint="eastAsia"/>
+          <w:lang w:eastAsia="zh-CN"/>
+        </w:rPr>
+      </w:pPr>
+    </w:p>
+    <w:p>
+      <w:pPr>
+        <w:spacing w:line="259" w:lineRule="auto"/>
+        <w:jc w:val="center"/>
         <w:rPr>
           <w:rFonts w:eastAsia="等线"/>
           <w:lang w:eastAsia="zh-CN"/>
@@ -9470,7 +10204,6 @@
           <w:noProof/>
           <w:lang w:eastAsia="zh-CN"/>
         </w:rPr>
-        <w:lastRenderedPageBreak/>
         <w:drawing>
           <wp:inline distT="0" distB="0" distL="0" distR="0" wp14:anchorId="4D39C4AE" wp14:editId="4CEE90E7">
             <wp:extent cx="1888534" cy="2520000"/>
@@ -9634,9 +10367,193 @@
     <w:p>
       <w:pPr>
         <w:spacing w:line="259" w:lineRule="auto"/>
+        <w:jc w:val="center"/>
+        <w:rPr>
+          <w:rFonts w:eastAsia="等线"/>
+          <w:lang w:eastAsia="zh-CN"/>
+        </w:rPr>
+      </w:pPr>
+      <w:r>
+        <w:rPr>
+          <w:rFonts w:eastAsia="等线"/>
+          <w:lang w:eastAsia="zh-CN"/>
+        </w:rPr>
+        <w:t xml:space="preserve">Figure </w:t>
+      </w:r>
+      <w:r>
+        <w:rPr>
+          <w:rFonts w:eastAsia="等线" w:hint="eastAsia"/>
+          <w:lang w:eastAsia="zh-CN"/>
+        </w:rPr>
+        <w:t>11</w:t>
+      </w:r>
+      <w:r>
+        <w:rPr>
+          <w:rFonts w:eastAsia="等线"/>
+          <w:lang w:eastAsia="zh-CN"/>
+        </w:rPr>
+        <w:t>. Green LED indicating temperature within the comfort range (18–24°C).</w:t>
+      </w:r>
+    </w:p>
+    <w:p>
+      <w:pPr>
+        <w:spacing w:line="259" w:lineRule="auto"/>
+        <w:jc w:val="center"/>
+        <w:rPr>
+          <w:rFonts w:eastAsia="等线"/>
+          <w:lang w:eastAsia="zh-CN"/>
+        </w:rPr>
+      </w:pPr>
+      <w:r>
+        <w:rPr>
+          <w:rFonts w:eastAsia="等线"/>
+          <w:lang w:eastAsia="zh-CN"/>
+        </w:rPr>
+        <w:t xml:space="preserve">Figure </w:t>
+      </w:r>
+      <w:r>
+        <w:rPr>
+          <w:rFonts w:eastAsia="等线" w:hint="eastAsia"/>
+          <w:lang w:eastAsia="zh-CN"/>
+        </w:rPr>
+        <w:t>12</w:t>
+      </w:r>
+      <w:r>
+        <w:rPr>
+          <w:rFonts w:eastAsia="等线"/>
+          <w:lang w:eastAsia="zh-CN"/>
+        </w:rPr>
+        <w:t>.</w:t>
+      </w:r>
+      <w:r>
+        <w:rPr>
+          <w:rFonts w:eastAsia="等线" w:hint="eastAsia"/>
+          <w:lang w:eastAsia="zh-CN"/>
+        </w:rPr>
+        <w:t xml:space="preserve"> </w:t>
+      </w:r>
+      <w:r>
+        <w:rPr>
+          <w:rFonts w:eastAsia="等线"/>
+          <w:lang w:eastAsia="zh-CN"/>
+        </w:rPr>
+        <w:t xml:space="preserve">Yellow LED indicating temperature </w:t>
+      </w:r>
+      <w:r>
+        <w:rPr>
+          <w:rFonts w:eastAsia="等线"/>
+          <w:lang w:eastAsia="zh-CN"/>
+        </w:rPr>
+        <w:t>changing</w:t>
+      </w:r>
+      <w:r>
+        <w:rPr>
+          <w:rFonts w:eastAsia="等线" w:hint="eastAsia"/>
+          <w:lang w:eastAsia="zh-CN"/>
+        </w:rPr>
+        <w:t xml:space="preserve"> rate &lt; -4 </w:t>
+      </w:r>
+      <w:proofErr w:type="spellStart"/>
+      <w:r>
+        <w:rPr>
+          <w:rFonts w:eastAsia="等线" w:hint="eastAsia"/>
+          <w:lang w:eastAsia="zh-CN"/>
+        </w:rPr>
+        <w:t>degC</w:t>
+      </w:r>
+      <w:proofErr w:type="spellEnd"/>
+      <w:r>
+        <w:rPr>
+          <w:rFonts w:eastAsia="等线" w:hint="eastAsia"/>
+          <w:lang w:eastAsia="zh-CN"/>
+        </w:rPr>
+        <w:t xml:space="preserve"> (with ice)</w:t>
+      </w:r>
+      <w:r>
+        <w:rPr>
+          <w:rFonts w:eastAsia="等线"/>
+          <w:lang w:eastAsia="zh-CN"/>
+        </w:rPr>
+        <w:t>.</w:t>
+      </w:r>
+    </w:p>
+    <w:p>
+      <w:pPr>
+        <w:spacing w:line="259" w:lineRule="auto"/>
+        <w:jc w:val="center"/>
+        <w:rPr>
+          <w:rFonts w:eastAsia="等线" w:hint="eastAsia"/>
+          <w:lang w:eastAsia="zh-CN"/>
+        </w:rPr>
+      </w:pPr>
+      <w:r>
+        <w:rPr>
+          <w:rFonts w:eastAsia="等线"/>
+          <w:lang w:eastAsia="zh-CN"/>
+        </w:rPr>
+        <w:t xml:space="preserve">Figure </w:t>
+      </w:r>
+      <w:r>
+        <w:rPr>
+          <w:rFonts w:eastAsia="等线" w:hint="eastAsia"/>
+          <w:lang w:eastAsia="zh-CN"/>
+        </w:rPr>
+        <w:t>13</w:t>
+      </w:r>
+      <w:r>
+        <w:rPr>
+          <w:rFonts w:eastAsia="等线"/>
+          <w:lang w:eastAsia="zh-CN"/>
+        </w:rPr>
+        <w:t xml:space="preserve">. Red LED indicating temperature </w:t>
+      </w:r>
+      <w:r>
+        <w:rPr>
+          <w:rFonts w:eastAsia="等线" w:hint="eastAsia"/>
+          <w:lang w:eastAsia="zh-CN"/>
+        </w:rPr>
+        <w:t xml:space="preserve">changing rate &gt; 4 </w:t>
+      </w:r>
+      <w:proofErr w:type="spellStart"/>
+      <w:r>
+        <w:rPr>
+          <w:rFonts w:eastAsia="等线" w:hint="eastAsia"/>
+          <w:lang w:eastAsia="zh-CN"/>
+        </w:rPr>
+        <w:t>degC</w:t>
+      </w:r>
+      <w:proofErr w:type="spellEnd"/>
+      <w:r>
+        <w:rPr>
+          <w:rFonts w:eastAsia="等线" w:hint="eastAsia"/>
+          <w:lang w:eastAsia="zh-CN"/>
+        </w:rPr>
+        <w:t xml:space="preserve"> (with hand)</w:t>
+      </w:r>
+      <w:r>
+        <w:rPr>
+          <w:rFonts w:eastAsia="等线"/>
+          <w:lang w:eastAsia="zh-CN"/>
+        </w:rPr>
+        <w:t>.</w:t>
+      </w:r>
+    </w:p>
+    <w:p>
+      <w:pPr>
+        <w:spacing w:line="259" w:lineRule="auto"/>
         <w:jc w:val="both"/>
         <w:rPr>
           <w:rFonts w:eastAsia="等线" w:hint="eastAsia"/>
+          <w:lang w:eastAsia="zh-CN"/>
+        </w:rPr>
+      </w:pPr>
+    </w:p>
+    <w:p>
+      <w:pPr>
+        <w:spacing w:line="259" w:lineRule="auto"/>
+        <w:jc w:val="center"/>
+        <w:rPr>
+          <w:rFonts w:eastAsia="等线"/>
           <w:lang w:eastAsia="zh-CN"/>
         </w:rPr>
       </w:pPr>
@@ -9646,6 +10563,7 @@
           <w:noProof/>
           <w:lang w:eastAsia="zh-CN"/>
         </w:rPr>
+        <w:lastRenderedPageBreak/>
         <w:drawing>
           <wp:inline distT="0" distB="0" distL="0" distR="0" wp14:anchorId="5F0BA3B6" wp14:editId="3C88907C">
             <wp:extent cx="3781970" cy="1800000"/>
@@ -9804,6 +10722,37 @@
             </a:graphic>
           </wp:inline>
         </w:drawing>
+      </w:r>
+    </w:p>
+    <w:p>
+      <w:pPr>
+        <w:spacing w:line="259" w:lineRule="auto"/>
+        <w:jc w:val="center"/>
+        <w:rPr>
+          <w:rFonts w:eastAsia="等线" w:hint="eastAsia"/>
+          <w:lang w:eastAsia="zh-CN"/>
+        </w:rPr>
+      </w:pPr>
+      <w:r>
+        <w:rPr>
+          <w:rFonts w:eastAsia="等线"/>
+          <w:lang w:eastAsia="zh-CN"/>
+        </w:rPr>
+        <w:t xml:space="preserve">Figure </w:t>
+      </w:r>
+      <w:r>
+        <w:rPr>
+          <w:rFonts w:eastAsia="等线" w:hint="eastAsia"/>
+          <w:lang w:eastAsia="zh-CN"/>
+        </w:rPr>
+        <w:t>14</w:t>
+      </w:r>
+      <w:r>
+        <w:rPr>
+          <w:rFonts w:eastAsia="等线"/>
+          <w:lang w:eastAsia="zh-CN"/>
+        </w:rPr>
+        <w:t>. Example output showing temperature, rate of change, and predicted temperature.</w:t>
       </w:r>
     </w:p>
     <w:sectPr>
@@ -9920,7 +10869,7 @@
             </mc:Choice>
             <mc:Fallback>
               <w:pict>
-                <v:line w14:anchorId="227D656F" id="Straight Connector 4" o:spid="_x0000_s1026" style="position:absolute;z-index:251657728;visibility:visible;mso-wrap-style:square;mso-wrap-distance-left:9pt;mso-wrap-distance-top:0;mso-wrap-distance-right:9pt;mso-wrap-distance-bottom:0;mso-position-horizontal:absolute;mso-position-horizontal-relative:text;mso-position-vertical:absolute;mso-position-vertical-relative:text" from="-.75pt,-10.2pt" to="454.5pt,-10.2pt" o:gfxdata="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" strokecolor="#4472c4 [3204]" strokeweight=".5pt">
+                <v:line w14:anchorId="58EE6DCF" id="Straight Connector 4" o:spid="_x0000_s1026" style="position:absolute;z-index:251657728;visibility:visible;mso-wrap-style:square;mso-wrap-distance-left:9pt;mso-wrap-distance-top:0;mso-wrap-distance-right:9pt;mso-wrap-distance-bottom:0;mso-position-horizontal:absolute;mso-position-horizontal-relative:text;mso-position-vertical:absolute;mso-position-vertical-relative:text" from="-.75pt,-10.2pt" to="454.5pt,-10.2pt" o:gfxdata="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" strokecolor="#4472c4 [3204]" strokeweight=".5pt">
                   <v:stroke joinstyle="miter"/>
                 </v:line>
               </w:pict>
@@ -9955,6 +10904,7 @@
         <w:szCs w:val="18"/>
       </w:rPr>
     </w:pPr>
+    <w:proofErr w:type="spellStart"/>
     <w:r>
       <w:rPr>
         <w:i/>
@@ -9963,7 +10913,18 @@
         <w:szCs w:val="18"/>
         <w:highlight w:val="yellow"/>
       </w:rPr>
-      <w:t>Zeming_WU, 20719336</w:t>
+      <w:t>Zeming_WU</w:t>
+    </w:r>
+    <w:proofErr w:type="spellEnd"/>
+    <w:r>
+      <w:rPr>
+        <w:i/>
+        <w:iCs/>
+        <w:sz w:val="18"/>
+        <w:szCs w:val="18"/>
+        <w:highlight w:val="yellow"/>
+      </w:rPr>
+      <w:t>, 20719336</w:t>
     </w:r>
     <w:r>
       <w:rPr>

</xml_diff>